<commit_message>
Partie 3 - Utilisateurs et permissions
</commit_message>
<xml_diff>
--- a/Atelier_Linux_Compte_Rendu.docx
+++ b/Atelier_Linux_Compte_Rendu.docx
@@ -1153,13 +1153,7 @@
         <w:rPr>
           <w:color w:val="000000"/>
         </w:rPr>
-        <w:t>Dans le cadre de l'intégration d'une entreprise, la première mission consiste à préparer un environnement Linux complet pour un projet d'Intelligence Artificielle. Ce document présente, étape par étape et à l'aide de captures d'écran, la réalisation de l'a</w:t>
-      </w:r>
-      <w:r>
-        <w:rPr>
-          <w:color w:val="000000"/>
-        </w:rPr>
-        <w:t>telier.</w:t>
+        <w:t>Dans le cadre de l'intégration d'une entreprise, la première mission consiste à préparer un environnement Linux complet pour un projet d'Intelligence Artificielle. Ce document présente, étape par étape et à l'aide de captures d'écran, la réalisation de l'atelier.</w:t>
       </w:r>
     </w:p>
     <w:p>
@@ -1295,13 +1289,7 @@
         <w:rPr>
           <w:color w:val="000000"/>
         </w:rPr>
-        <w:t>Le poste de travail étant sous Wind</w:t>
-      </w:r>
-      <w:r>
-        <w:rPr>
-          <w:color w:val="000000"/>
-        </w:rPr>
-        <w:t>ows, un environnement Linux (Ubuntu) a été installé via WSL 2 (Windows Subsystem for Linux). Un dépôt Git a également été configuré pour suivre l'avancement.</w:t>
+        <w:t>Le poste de travail étant sous Windows, un environnement Linux (Ubuntu) a été installé via WSL 2 (Windows Subsystem for Linux). Un dépôt Git a également été configuré pour suivre l'avancement.</w:t>
       </w:r>
     </w:p>
     <w:p>
@@ -1846,16 +1834,7 @@
           <w:sz w:val="20"/>
           <w:szCs w:val="20"/>
         </w:rPr>
-        <w:t>mkdir -p IA_Project/config IA_Project/logs IA_Project/scripts IA_</w:t>
-      </w:r>
-      <w:r>
-        <w:rPr>
-          <w:rFonts w:ascii="Consolas" w:eastAsia="Consolas" w:hAnsi="Consolas" w:cs="Consolas"/>
-          <w:color w:val="2C3E50"/>
-          <w:sz w:val="20"/>
-          <w:szCs w:val="20"/>
-        </w:rPr>
-        <w:t>Project/models</w:t>
+        <w:t>mkdir -p IA_Project/config IA_Project/logs IA_Project/scripts IA_Project/models</w:t>
       </w:r>
     </w:p>
     <w:p>
@@ -1945,16 +1924,7 @@
           <w:sz w:val="20"/>
           <w:szCs w:val="20"/>
         </w:rPr>
-        <w:t>touch IA_Pro</w:t>
-      </w:r>
-      <w:r>
-        <w:rPr>
-          <w:rFonts w:ascii="Consolas" w:eastAsia="Consolas" w:hAnsi="Consolas" w:cs="Consolas"/>
-          <w:color w:val="2C3E50"/>
-          <w:sz w:val="20"/>
-          <w:szCs w:val="20"/>
-        </w:rPr>
-        <w:t>ject/models/model_info.txt</w:t>
+        <w:t>touch IA_Project/models/model_info.txt</w:t>
       </w:r>
     </w:p>
     <w:p>
@@ -2142,13 +2112,7 @@
         <w:rPr>
           <w:color w:val="000000"/>
         </w:rPr>
-        <w:t>Objectif : lire, rechercher, copier, renommer, archiver et restaurer des fichiers. Les fichier</w:t>
-      </w:r>
-      <w:r>
-        <w:rPr>
-          <w:color w:val="000000"/>
-        </w:rPr>
-        <w:t>s sont d'abord remplis avec le contenu fourni, puis manipulés à l'aide des commandes ci-dessous.</w:t>
+        <w:t>Objectif : lire, rechercher, copier, renommer, archiver et restaurer des fichiers. Les fichiers sont d'abord remplis avec le contenu fourni, puis manipulés à l'aide des commandes ci-dessous.</w:t>
       </w:r>
     </w:p>
     <w:p>
@@ -2160,13 +2124,7 @@
         <w:rPr>
           <w:color w:val="000000"/>
         </w:rPr>
-        <w:t>Commandes utilisées</w:t>
-      </w:r>
-      <w:r>
-        <w:rPr>
-          <w:color w:val="000000"/>
-        </w:rPr>
-        <w:t>:</w:t>
+        <w:t>Commandes utilisées:</w:t>
       </w:r>
     </w:p>
     <w:p>
@@ -2203,16 +2161,7 @@
           <w:sz w:val="20"/>
           <w:szCs w:val="20"/>
         </w:rPr>
-        <w:t xml:space="preserve">head -n 5 train.csv </w:t>
-      </w:r>
-      <w:r>
-        <w:rPr>
-          <w:rFonts w:ascii="Consolas" w:eastAsia="Consolas" w:hAnsi="Consolas" w:cs="Consolas"/>
-          <w:color w:val="2C3E50"/>
-          <w:sz w:val="20"/>
-          <w:szCs w:val="20"/>
-        </w:rPr>
-        <w:t xml:space="preserve">           # 5 premières lignes</w:t>
+        <w:t>head -n 5 train.csv            # 5 premières lignes</w:t>
       </w:r>
     </w:p>
     <w:p>
@@ -2303,16 +2252,7 @@
           <w:sz w:val="20"/>
           <w:szCs w:val="20"/>
         </w:rPr>
-        <w:t xml:space="preserve">mv model_info.txt modele.txt   # </w:t>
-      </w:r>
-      <w:r>
-        <w:rPr>
-          <w:rFonts w:ascii="Consolas" w:eastAsia="Consolas" w:hAnsi="Consolas" w:cs="Consolas"/>
-          <w:color w:val="2C3E50"/>
-          <w:sz w:val="20"/>
-          <w:szCs w:val="20"/>
-        </w:rPr>
-        <w:t>renommer</w:t>
+        <w:t>mv model_info.txt modele.txt   # renommer</w:t>
       </w:r>
     </w:p>
     <w:p>
@@ -2788,13 +2728,7 @@
         <w:rPr>
           <w:color w:val="000000"/>
         </w:rPr>
-        <w:t>Objectif : créer des utilisateurs et des groupes, les associer, puis attribuer propriétaires, groupes et droits d'a</w:t>
-      </w:r>
-      <w:r>
-        <w:rPr>
-          <w:color w:val="000000"/>
-        </w:rPr>
-        <w:t>ccès aux dossiers du projet.</w:t>
+        <w:t>Objectif : créer des utilisateurs et des groupes, les associer, puis attribuer propriétaires, groupes et droits d'accès aux dossiers du projet.</w:t>
       </w:r>
     </w:p>
     <w:p>
@@ -2861,16 +2795,7 @@
           <w:sz w:val="20"/>
           <w:szCs w:val="20"/>
         </w:rPr>
-        <w:t>id alice                       #</w:t>
-      </w:r>
-      <w:r>
-        <w:rPr>
-          <w:rFonts w:ascii="Consolas" w:eastAsia="Consolas" w:hAnsi="Consolas" w:cs="Consolas"/>
-          <w:color w:val="2C3E50"/>
-          <w:sz w:val="20"/>
-          <w:szCs w:val="20"/>
-        </w:rPr>
-        <w:t xml:space="preserve"> afficher UID et groupes</w:t>
+        <w:t>id alice                       # afficher UID et groupes</w:t>
       </w:r>
     </w:p>
     <w:p>
@@ -2979,19 +2904,303 @@
       </w:pPr>
       <w:r>
         <w:rPr>
+          <w:i/>
+          <w:iCs/>
+          <w:noProof/>
+          <w:color w:val="7F8C8D"/>
+          <w:sz w:val="20"/>
+          <w:szCs w:val="20"/>
+        </w:rPr>
+        <w:drawing>
+          <wp:inline distT="0" distB="0" distL="0" distR="0" wp14:anchorId="2A637FEE" wp14:editId="396791F5">
+            <wp:extent cx="6036310" cy="3218180"/>
+            <wp:effectExtent l="0" t="0" r="2540" b="1270"/>
+            <wp:docPr id="12" name="Image 12"/>
+            <wp:cNvGraphicFramePr>
+              <a:graphicFrameLocks xmlns:a="http://schemas.openxmlformats.org/drawingml/2006/main" noChangeAspect="1"/>
+            </wp:cNvGraphicFramePr>
+            <a:graphic xmlns:a="http://schemas.openxmlformats.org/drawingml/2006/main">
+              <a:graphicData uri="http://schemas.openxmlformats.org/drawingml/2006/picture">
+                <pic:pic xmlns:pic="http://schemas.openxmlformats.org/drawingml/2006/picture">
+                  <pic:nvPicPr>
+                    <pic:cNvPr id="12" name="Image 12"/>
+                    <pic:cNvPicPr/>
+                  </pic:nvPicPr>
+                  <pic:blipFill>
+                    <a:blip r:embed="rId16" cstate="print">
+                      <a:extLst>
+                        <a:ext uri="{28A0092B-C50C-407E-A947-70E740481C1C}">
+                          <a14:useLocalDpi xmlns:a14="http://schemas.microsoft.com/office/drawing/2010/main" val="0"/>
+                        </a:ext>
+                      </a:extLst>
+                    </a:blip>
+                    <a:stretch>
+                      <a:fillRect/>
+                    </a:stretch>
+                  </pic:blipFill>
+                  <pic:spPr>
+                    <a:xfrm>
+                      <a:off x="0" y="0"/>
+                      <a:ext cx="6036310" cy="3218180"/>
+                    </a:xfrm>
+                    <a:prstGeom prst="rect">
+                      <a:avLst/>
+                    </a:prstGeom>
+                  </pic:spPr>
+                </pic:pic>
+              </a:graphicData>
+            </a:graphic>
+          </wp:inline>
+        </w:drawing>
+      </w:r>
+      <w:r>
+        <w:rPr>
+          <w:i/>
+          <w:iCs/>
+          <w:noProof/>
+          <w:color w:val="7F8C8D"/>
+          <w:sz w:val="20"/>
+          <w:szCs w:val="20"/>
+        </w:rPr>
+        <w:drawing>
+          <wp:inline distT="0" distB="0" distL="0" distR="0" wp14:anchorId="11135E78" wp14:editId="0FCC8F0E">
+            <wp:extent cx="6036310" cy="1367790"/>
+            <wp:effectExtent l="0" t="0" r="2540" b="3810"/>
+            <wp:docPr id="13" name="Image 13"/>
+            <wp:cNvGraphicFramePr>
+              <a:graphicFrameLocks xmlns:a="http://schemas.openxmlformats.org/drawingml/2006/main" noChangeAspect="1"/>
+            </wp:cNvGraphicFramePr>
+            <a:graphic xmlns:a="http://schemas.openxmlformats.org/drawingml/2006/main">
+              <a:graphicData uri="http://schemas.openxmlformats.org/drawingml/2006/picture">
+                <pic:pic xmlns:pic="http://schemas.openxmlformats.org/drawingml/2006/picture">
+                  <pic:nvPicPr>
+                    <pic:cNvPr id="13" name="Image 13"/>
+                    <pic:cNvPicPr/>
+                  </pic:nvPicPr>
+                  <pic:blipFill>
+                    <a:blip r:embed="rId17" cstate="print">
+                      <a:extLst>
+                        <a:ext uri="{28A0092B-C50C-407E-A947-70E740481C1C}">
+                          <a14:useLocalDpi xmlns:a14="http://schemas.microsoft.com/office/drawing/2010/main" val="0"/>
+                        </a:ext>
+                      </a:extLst>
+                    </a:blip>
+                    <a:stretch>
+                      <a:fillRect/>
+                    </a:stretch>
+                  </pic:blipFill>
+                  <pic:spPr>
+                    <a:xfrm>
+                      <a:off x="0" y="0"/>
+                      <a:ext cx="6036310" cy="1367790"/>
+                    </a:xfrm>
+                    <a:prstGeom prst="rect">
+                      <a:avLst/>
+                    </a:prstGeom>
+                  </pic:spPr>
+                </pic:pic>
+              </a:graphicData>
+            </a:graphic>
+          </wp:inline>
+        </w:drawing>
+      </w:r>
+      <w:r>
+        <w:rPr>
+          <w:i/>
+          <w:iCs/>
+          <w:noProof/>
+          <w:color w:val="7F8C8D"/>
+          <w:sz w:val="20"/>
+          <w:szCs w:val="20"/>
+        </w:rPr>
+        <w:drawing>
+          <wp:inline distT="0" distB="0" distL="0" distR="0" wp14:anchorId="1BC4A6AA" wp14:editId="437AA0A3">
+            <wp:extent cx="6036310" cy="3225800"/>
+            <wp:effectExtent l="0" t="0" r="2540" b="0"/>
+            <wp:docPr id="14" name="Image 14"/>
+            <wp:cNvGraphicFramePr>
+              <a:graphicFrameLocks xmlns:a="http://schemas.openxmlformats.org/drawingml/2006/main" noChangeAspect="1"/>
+            </wp:cNvGraphicFramePr>
+            <a:graphic xmlns:a="http://schemas.openxmlformats.org/drawingml/2006/main">
+              <a:graphicData uri="http://schemas.openxmlformats.org/drawingml/2006/picture">
+                <pic:pic xmlns:pic="http://schemas.openxmlformats.org/drawingml/2006/picture">
+                  <pic:nvPicPr>
+                    <pic:cNvPr id="14" name="Image 14"/>
+                    <pic:cNvPicPr/>
+                  </pic:nvPicPr>
+                  <pic:blipFill>
+                    <a:blip r:embed="rId18" cstate="print">
+                      <a:extLst>
+                        <a:ext uri="{28A0092B-C50C-407E-A947-70E740481C1C}">
+                          <a14:useLocalDpi xmlns:a14="http://schemas.microsoft.com/office/drawing/2010/main" val="0"/>
+                        </a:ext>
+                      </a:extLst>
+                    </a:blip>
+                    <a:stretch>
+                      <a:fillRect/>
+                    </a:stretch>
+                  </pic:blipFill>
+                  <pic:spPr>
+                    <a:xfrm>
+                      <a:off x="0" y="0"/>
+                      <a:ext cx="6036310" cy="3225800"/>
+                    </a:xfrm>
+                    <a:prstGeom prst="rect">
+                      <a:avLst/>
+                    </a:prstGeom>
+                  </pic:spPr>
+                </pic:pic>
+              </a:graphicData>
+            </a:graphic>
+          </wp:inline>
+        </w:drawing>
+      </w:r>
+    </w:p>
+    <w:p>
+      <w:pPr>
+        <w:pStyle w:val="Titre1"/>
+        <w:pBdr>
+          <w:bottom w:val="single" w:sz="12" w:space="6" w:color="2980B9"/>
+        </w:pBdr>
+        <w:spacing w:before="320" w:after="160"/>
+      </w:pPr>
+      <w:bookmarkStart w:id="9" w:name="_Toc236173585"/>
+      <w:r>
+        <w:rPr>
+          <w:b/>
+          <w:bCs/>
+          <w:color w:val="2C3E50"/>
+          <w:sz w:val="30"/>
+          <w:szCs w:val="30"/>
+        </w:rPr>
+        <w:lastRenderedPageBreak/>
+        <w:t>Partie 4 : Installation des logiciels</w:t>
+      </w:r>
+      <w:bookmarkEnd w:id="9"/>
+    </w:p>
+    <w:p>
+      <w:pPr>
+        <w:spacing w:after="120" w:line="300" w:lineRule="auto"/>
+        <w:jc w:val="both"/>
+      </w:pPr>
+      <w:r>
+        <w:rPr>
+          <w:color w:val="000000"/>
+        </w:rPr>
+        <w:t>Objectif : installer les outils nécessaires puis télécharger un dataset depuis Internet.</w:t>
+      </w:r>
+    </w:p>
+    <w:p>
+      <w:pPr>
+        <w:pBdr>
+          <w:left w:val="single" w:sz="18" w:space="4" w:color="2980B9"/>
+        </w:pBdr>
+        <w:shd w:val="clear" w:color="auto" w:fill="ECF0F1"/>
+        <w:spacing w:before="40"/>
+        <w:ind w:left="200" w:right="200"/>
+      </w:pPr>
+      <w:r>
+        <w:rPr>
+          <w:rFonts w:ascii="Consolas" w:eastAsia="Consolas" w:hAnsi="Consolas" w:cs="Consolas"/>
+          <w:color w:val="2C3E50"/>
+          <w:sz w:val="20"/>
+          <w:szCs w:val="20"/>
+        </w:rPr>
+        <w:t>sudo apt install git curl wget htop tree python3 python3-pip unzip -y</w:t>
+      </w:r>
+    </w:p>
+    <w:p>
+      <w:pPr>
+        <w:pBdr>
+          <w:left w:val="single" w:sz="18" w:space="4" w:color="2980B9"/>
+        </w:pBdr>
+        <w:shd w:val="clear" w:color="auto" w:fill="ECF0F1"/>
+        <w:ind w:left="200" w:right="200"/>
+      </w:pPr>
+      <w:r>
+        <w:rPr>
+          <w:rFonts w:ascii="Consolas" w:eastAsia="Consolas" w:hAnsi="Consolas" w:cs="Consolas"/>
+          <w:color w:val="2C3E50"/>
+          <w:sz w:val="20"/>
+          <w:szCs w:val="20"/>
+        </w:rPr>
+        <w:t>git --version &amp;&amp; python3 --version    # vérifier les installations</w:t>
+      </w:r>
+    </w:p>
+    <w:p>
+      <w:pPr>
+        <w:pBdr>
+          <w:left w:val="single" w:sz="18" w:space="4" w:color="2980B9"/>
+        </w:pBdr>
+        <w:shd w:val="clear" w:color="auto" w:fill="ECF0F1"/>
+        <w:ind w:left="200" w:right="200"/>
+      </w:pPr>
+      <w:r>
+        <w:rPr>
+          <w:rFonts w:ascii="Consolas" w:eastAsia="Consolas" w:hAnsi="Consolas" w:cs="Consolas"/>
+          <w:color w:val="2C3E50"/>
+          <w:sz w:val="20"/>
+          <w:szCs w:val="20"/>
+        </w:rPr>
+        <w:t>wget https://raw.githubusercontent.com/mwaskom/seaborn-data/master/iris.csv</w:t>
+      </w:r>
+    </w:p>
+    <w:p>
+      <w:pPr>
+        <w:pBdr>
+          <w:left w:val="single" w:sz="18" w:space="4" w:color="2980B9"/>
+        </w:pBdr>
+        <w:shd w:val="clear" w:color="auto" w:fill="ECF0F1"/>
+        <w:ind w:left="200" w:right="200"/>
+      </w:pPr>
+      <w:r>
+        <w:rPr>
+          <w:rFonts w:ascii="Consolas" w:eastAsia="Consolas" w:hAnsi="Consolas" w:cs="Consolas"/>
+          <w:color w:val="2C3E50"/>
+          <w:sz w:val="20"/>
+          <w:szCs w:val="20"/>
+        </w:rPr>
+        <w:t>ls -l iris.csv       # vérifier la présence</w:t>
+      </w:r>
+    </w:p>
+    <w:p>
+      <w:pPr>
+        <w:pBdr>
+          <w:left w:val="single" w:sz="18" w:space="4" w:color="2980B9"/>
+        </w:pBdr>
+        <w:shd w:val="clear" w:color="auto" w:fill="ECF0F1"/>
+        <w:spacing w:after="120"/>
+        <w:ind w:left="200" w:right="200"/>
+      </w:pPr>
+      <w:r>
+        <w:rPr>
+          <w:rFonts w:ascii="Consolas" w:eastAsia="Consolas" w:hAnsi="Consolas" w:cs="Consolas"/>
+          <w:color w:val="2C3E50"/>
+          <w:sz w:val="20"/>
+          <w:szCs w:val="20"/>
+        </w:rPr>
+        <w:t>head iris.csv        # consulter le contenu</w:t>
+      </w:r>
+    </w:p>
+    <w:p>
+      <w:pPr>
+        <w:pBdr>
+          <w:top w:val="dashed" w:sz="8" w:space="14" w:color="7F8C8D"/>
+          <w:left w:val="dashed" w:sz="8" w:space="14" w:color="7F8C8D"/>
+          <w:bottom w:val="dashed" w:sz="8" w:space="14" w:color="7F8C8D"/>
+          <w:right w:val="dashed" w:sz="8" w:space="14" w:color="7F8C8D"/>
+        </w:pBdr>
+        <w:shd w:val="clear" w:color="auto" w:fill="F8F9FA"/>
+        <w:spacing w:before="160" w:after="200" w:line="360" w:lineRule="auto"/>
+        <w:jc w:val="center"/>
+      </w:pPr>
+      <w:r>
+        <w:rPr>
           <w:b/>
           <w:bCs/>
           <w:color w:val="7F8C8D"/>
         </w:rPr>
-        <w:t>📷</w:t>
-      </w:r>
-      <w:r>
-        <w:rPr>
-          <w:b/>
-          <w:bCs/>
-          <w:color w:val="7F8C8D"/>
-        </w:rPr>
-        <w:t xml:space="preserve">  Insérer ici la capture d'écran</w:t>
+        <w:t>📷  Insérer ici la capture d'écran</w:t>
       </w:r>
       <w:r>
         <w:br/>
@@ -3004,7 +3213,7 @@
           <w:sz w:val="20"/>
           <w:szCs w:val="20"/>
         </w:rPr>
-        <w:t>Création des utilisateurs, des groupes et attribution des permissions.</w:t>
+        <w:t>Installation des logiciels et téléchargement du dataset iris.csv.</w:t>
       </w:r>
       <w:r>
         <w:br/>
@@ -3022,6 +3231,149 @@
     </w:p>
     <w:p>
       <w:pPr>
+        <w:pStyle w:val="Titre1"/>
+        <w:pBdr>
+          <w:bottom w:val="single" w:sz="12" w:space="6" w:color="2980B9"/>
+        </w:pBdr>
+        <w:spacing w:before="320" w:after="160"/>
+      </w:pPr>
+      <w:bookmarkStart w:id="10" w:name="_Toc236173586"/>
+      <w:r>
+        <w:rPr>
+          <w:b/>
+          <w:bCs/>
+          <w:color w:val="2C3E50"/>
+          <w:sz w:val="30"/>
+          <w:szCs w:val="30"/>
+        </w:rPr>
+        <w:t>Partie 5 : Gestion des processus</w:t>
+      </w:r>
+      <w:bookmarkEnd w:id="10"/>
+    </w:p>
+    <w:p>
+      <w:pPr>
+        <w:spacing w:after="120" w:line="300" w:lineRule="auto"/>
+        <w:jc w:val="both"/>
+      </w:pPr>
+      <w:r>
+        <w:rPr>
+          <w:color w:val="000000"/>
+        </w:rPr>
+        <w:t>Objectif : lancer un script, observer son PID, consulter son utilisation CPU, l'arrêter puis le gérer en arrière-plan et au premier plan.</w:t>
+      </w:r>
+    </w:p>
+    <w:p>
+      <w:pPr>
+        <w:pBdr>
+          <w:left w:val="single" w:sz="18" w:space="4" w:color="2980B9"/>
+        </w:pBdr>
+        <w:shd w:val="clear" w:color="auto" w:fill="ECF0F1"/>
+        <w:spacing w:before="40"/>
+        <w:ind w:left="200" w:right="200"/>
+      </w:pPr>
+      <w:r>
+        <w:rPr>
+          <w:rFonts w:ascii="Consolas" w:eastAsia="Consolas" w:hAnsi="Consolas" w:cs="Consolas"/>
+          <w:color w:val="2C3E50"/>
+          <w:sz w:val="20"/>
+          <w:szCs w:val="20"/>
+        </w:rPr>
+        <w:t>python3 scripts/print-pause.py       # lancer le script</w:t>
+      </w:r>
+    </w:p>
+    <w:p>
+      <w:pPr>
+        <w:pBdr>
+          <w:left w:val="single" w:sz="18" w:space="4" w:color="2980B9"/>
+        </w:pBdr>
+        <w:shd w:val="clear" w:color="auto" w:fill="ECF0F1"/>
+        <w:ind w:left="200" w:right="200"/>
+      </w:pPr>
+      <w:r>
+        <w:rPr>
+          <w:rFonts w:ascii="Consolas" w:eastAsia="Consolas" w:hAnsi="Consolas" w:cs="Consolas"/>
+          <w:color w:val="2C3E50"/>
+          <w:sz w:val="20"/>
+          <w:szCs w:val="20"/>
+        </w:rPr>
+        <w:t>ps aux | grep print-pause            # observer le PID</w:t>
+      </w:r>
+    </w:p>
+    <w:p>
+      <w:pPr>
+        <w:pBdr>
+          <w:left w:val="single" w:sz="18" w:space="4" w:color="2980B9"/>
+        </w:pBdr>
+        <w:shd w:val="clear" w:color="auto" w:fill="ECF0F1"/>
+        <w:ind w:left="200" w:right="200"/>
+      </w:pPr>
+      <w:r>
+        <w:rPr>
+          <w:rFonts w:ascii="Consolas" w:eastAsia="Consolas" w:hAnsi="Consolas" w:cs="Consolas"/>
+          <w:color w:val="2C3E50"/>
+          <w:sz w:val="20"/>
+          <w:szCs w:val="20"/>
+        </w:rPr>
+        <w:t>top     (ou htop)                    # utilisation CPU</w:t>
+      </w:r>
+    </w:p>
+    <w:p>
+      <w:pPr>
+        <w:pBdr>
+          <w:left w:val="single" w:sz="18" w:space="4" w:color="2980B9"/>
+        </w:pBdr>
+        <w:shd w:val="clear" w:color="auto" w:fill="ECF0F1"/>
+        <w:ind w:left="200" w:right="200"/>
+      </w:pPr>
+      <w:r>
+        <w:rPr>
+          <w:rFonts w:ascii="Consolas" w:eastAsia="Consolas" w:hAnsi="Consolas" w:cs="Consolas"/>
+          <w:color w:val="2C3E50"/>
+          <w:sz w:val="20"/>
+          <w:szCs w:val="20"/>
+        </w:rPr>
+        <w:t>kill &lt;PID&gt;                           # arrêter le processus</w:t>
+      </w:r>
+    </w:p>
+    <w:p>
+      <w:pPr>
+        <w:pBdr>
+          <w:left w:val="single" w:sz="18" w:space="4" w:color="2980B9"/>
+        </w:pBdr>
+        <w:shd w:val="clear" w:color="auto" w:fill="ECF0F1"/>
+        <w:ind w:left="200" w:right="200"/>
+      </w:pPr>
+      <w:r>
+        <w:rPr>
+          <w:rFonts w:ascii="Consolas" w:eastAsia="Consolas" w:hAnsi="Consolas" w:cs="Consolas"/>
+          <w:color w:val="2C3E50"/>
+          <w:sz w:val="20"/>
+          <w:szCs w:val="20"/>
+        </w:rPr>
+        <w:t>python3 scripts/print-pause.py &amp;     # relancer en arrière-plan</w:t>
+      </w:r>
+    </w:p>
+    <w:p>
+      <w:pPr>
+        <w:pBdr>
+          <w:left w:val="single" w:sz="18" w:space="4" w:color="2980B9"/>
+        </w:pBdr>
+        <w:shd w:val="clear" w:color="auto" w:fill="ECF0F1"/>
+        <w:spacing w:after="120"/>
+        <w:ind w:left="200" w:right="200"/>
+      </w:pPr>
+      <w:r>
+        <w:rPr>
+          <w:rFonts w:ascii="Consolas" w:eastAsia="Consolas" w:hAnsi="Consolas" w:cs="Consolas"/>
+          <w:color w:val="2C3E50"/>
+          <w:sz w:val="20"/>
+          <w:szCs w:val="20"/>
+        </w:rPr>
+        <w:t>fg                                   # remettre au premier plan</w:t>
+      </w:r>
+    </w:p>
+    <w:p>
+      <w:pPr>
         <w:pBdr>
           <w:top w:val="dashed" w:sz="8" w:space="14" w:color="7F8C8D"/>
           <w:left w:val="dashed" w:sz="8" w:space="14" w:color="7F8C8D"/>
@@ -3038,15 +3390,7 @@
           <w:bCs/>
           <w:color w:val="7F8C8D"/>
         </w:rPr>
-        <w:t>📷</w:t>
-      </w:r>
-      <w:r>
-        <w:rPr>
-          <w:b/>
-          <w:bCs/>
-          <w:color w:val="7F8C8D"/>
-        </w:rPr>
-        <w:t xml:space="preserve">  Insérer ici la capture d'écran</w:t>
+        <w:t>📷  Insérer ici la capture d'écran</w:t>
       </w:r>
       <w:r>
         <w:br/>
@@ -3059,7 +3403,7 @@
           <w:sz w:val="20"/>
           <w:szCs w:val="20"/>
         </w:rPr>
-        <w:t>Vérification des droits depuis le compte de chaque utilisateur.</w:t>
+        <w:t>Lancement du processus, PID, utilisation CPU et gestion arrière-plan / premier plan.</w:t>
       </w:r>
       <w:r>
         <w:br/>
@@ -3083,7 +3427,7 @@
         </w:pBdr>
         <w:spacing w:before="320" w:after="160"/>
       </w:pPr>
-      <w:bookmarkStart w:id="9" w:name="_Toc236173585"/>
+      <w:bookmarkStart w:id="11" w:name="_Toc236173587"/>
       <w:r>
         <w:rPr>
           <w:b/>
@@ -3092,9 +3436,9 @@
           <w:sz w:val="30"/>
           <w:szCs w:val="30"/>
         </w:rPr>
-        <w:t>Partie 4 : Installation des logiciels</w:t>
-      </w:r>
-      <w:bookmarkEnd w:id="9"/>
+        <w:t>Partie 6 : Script Bash setup_project.sh</w:t>
+      </w:r>
+      <w:bookmarkEnd w:id="11"/>
     </w:p>
     <w:p>
       <w:pPr>
@@ -3105,105 +3449,19 @@
         <w:rPr>
           <w:color w:val="000000"/>
         </w:rPr>
-        <w:t>Obj</w:t>
-      </w:r>
+        <w:t>Objectif : automatiser toute la préparation de l'environnement dans un seul script commenté : demander le nom du projet, créer l'arborescence, générer un fichier de configuration, installer les outils, télécharger le dataset, compresser le projet et afficher un résumé.</w:t>
+      </w:r>
+    </w:p>
+    <w:p>
+      <w:pPr>
+        <w:spacing w:after="120" w:line="300" w:lineRule="auto"/>
+        <w:jc w:val="both"/>
+      </w:pPr>
       <w:r>
         <w:rPr>
           <w:color w:val="000000"/>
         </w:rPr>
-        <w:t>ectif : installer les outils nécessaires puis télécharger un dataset depuis Internet.</w:t>
-      </w:r>
-    </w:p>
-    <w:p>
-      <w:pPr>
-        <w:pBdr>
-          <w:left w:val="single" w:sz="18" w:space="4" w:color="2980B9"/>
-        </w:pBdr>
-        <w:shd w:val="clear" w:color="auto" w:fill="ECF0F1"/>
-        <w:spacing w:before="40"/>
-        <w:ind w:left="200" w:right="200"/>
-      </w:pPr>
-      <w:r>
-        <w:rPr>
-          <w:rFonts w:ascii="Consolas" w:eastAsia="Consolas" w:hAnsi="Consolas" w:cs="Consolas"/>
-          <w:color w:val="2C3E50"/>
-          <w:sz w:val="20"/>
-          <w:szCs w:val="20"/>
-        </w:rPr>
-        <w:t>sudo apt install git curl wget htop tree python3 python3-pip unzip -y</w:t>
-      </w:r>
-    </w:p>
-    <w:p>
-      <w:pPr>
-        <w:pBdr>
-          <w:left w:val="single" w:sz="18" w:space="4" w:color="2980B9"/>
-        </w:pBdr>
-        <w:shd w:val="clear" w:color="auto" w:fill="ECF0F1"/>
-        <w:ind w:left="200" w:right="200"/>
-      </w:pPr>
-      <w:r>
-        <w:rPr>
-          <w:rFonts w:ascii="Consolas" w:eastAsia="Consolas" w:hAnsi="Consolas" w:cs="Consolas"/>
-          <w:color w:val="2C3E50"/>
-          <w:sz w:val="20"/>
-          <w:szCs w:val="20"/>
-        </w:rPr>
-        <w:t>git --version &amp;&amp; python3 --version    # vérifier les installations</w:t>
-      </w:r>
-    </w:p>
-    <w:p>
-      <w:pPr>
-        <w:pBdr>
-          <w:left w:val="single" w:sz="18" w:space="4" w:color="2980B9"/>
-        </w:pBdr>
-        <w:shd w:val="clear" w:color="auto" w:fill="ECF0F1"/>
-        <w:ind w:left="200" w:right="200"/>
-      </w:pPr>
-      <w:r>
-        <w:rPr>
-          <w:rFonts w:ascii="Consolas" w:eastAsia="Consolas" w:hAnsi="Consolas" w:cs="Consolas"/>
-          <w:color w:val="2C3E50"/>
-          <w:sz w:val="20"/>
-          <w:szCs w:val="20"/>
-        </w:rPr>
-        <w:t>wget https://raw.githubusercontent.com/mwaskom/seaborn-data/master/iris.csv</w:t>
-      </w:r>
-    </w:p>
-    <w:p>
-      <w:pPr>
-        <w:pBdr>
-          <w:left w:val="single" w:sz="18" w:space="4" w:color="2980B9"/>
-        </w:pBdr>
-        <w:shd w:val="clear" w:color="auto" w:fill="ECF0F1"/>
-        <w:ind w:left="200" w:right="200"/>
-      </w:pPr>
-      <w:r>
-        <w:rPr>
-          <w:rFonts w:ascii="Consolas" w:eastAsia="Consolas" w:hAnsi="Consolas" w:cs="Consolas"/>
-          <w:color w:val="2C3E50"/>
-          <w:sz w:val="20"/>
-          <w:szCs w:val="20"/>
-        </w:rPr>
-        <w:t>ls -l iris.csv       # vérifier la présence</w:t>
-      </w:r>
-    </w:p>
-    <w:p>
-      <w:pPr>
-        <w:pBdr>
-          <w:left w:val="single" w:sz="18" w:space="4" w:color="2980B9"/>
-        </w:pBdr>
-        <w:shd w:val="clear" w:color="auto" w:fill="ECF0F1"/>
-        <w:spacing w:after="120"/>
-        <w:ind w:left="200" w:right="200"/>
-      </w:pPr>
-      <w:r>
-        <w:rPr>
-          <w:rFonts w:ascii="Consolas" w:eastAsia="Consolas" w:hAnsi="Consolas" w:cs="Consolas"/>
-          <w:color w:val="2C3E50"/>
-          <w:sz w:val="20"/>
-          <w:szCs w:val="20"/>
-        </w:rPr>
-        <w:t>head iris.csv        # consulter le contenu</w:t>
+        <w:t>Le script complet et commenté est livré séparément dans le dépôt GitHub (setup_project.sh).</w:t>
       </w:r>
     </w:p>
     <w:p>
@@ -3224,23 +3482,7 @@
           <w:bCs/>
           <w:color w:val="7F8C8D"/>
         </w:rPr>
-        <w:t>📷</w:t>
-      </w:r>
-      <w:r>
-        <w:rPr>
-          <w:b/>
-          <w:bCs/>
-          <w:color w:val="7F8C8D"/>
-        </w:rPr>
-        <w:t xml:space="preserve">  Insérer ici la captur</w:t>
-      </w:r>
-      <w:r>
-        <w:rPr>
-          <w:b/>
-          <w:bCs/>
-          <w:color w:val="7F8C8D"/>
-        </w:rPr>
-        <w:t>e d'écran</w:t>
+        <w:t>📷  Insérer ici la capture d'écran</w:t>
       </w:r>
       <w:r>
         <w:br/>
@@ -3253,7 +3495,7 @@
           <w:sz w:val="20"/>
           <w:szCs w:val="20"/>
         </w:rPr>
-        <w:t>Installation des logiciels et téléchargement du dataset iris.csv.</w:t>
+        <w:t>Exécution du script setup_project.sh et résumé final affiché.</w:t>
       </w:r>
       <w:r>
         <w:br/>
@@ -3277,7 +3519,7 @@
         </w:pBdr>
         <w:spacing w:before="320" w:after="160"/>
       </w:pPr>
-      <w:bookmarkStart w:id="10" w:name="_Toc236173586"/>
+      <w:bookmarkStart w:id="12" w:name="_Toc236173588"/>
       <w:r>
         <w:rPr>
           <w:b/>
@@ -3286,9 +3528,9 @@
           <w:sz w:val="30"/>
           <w:szCs w:val="30"/>
         </w:rPr>
-        <w:t>Partie 5 : Gestion des processus</w:t>
-      </w:r>
-      <w:bookmarkEnd w:id="10"/>
+        <w:t>Partie 7 : Bonus</w:t>
+      </w:r>
+      <w:bookmarkEnd w:id="12"/>
     </w:p>
     <w:p>
       <w:pPr>
@@ -3299,123 +3541,8 @@
         <w:rPr>
           <w:color w:val="000000"/>
         </w:rPr>
-        <w:t>Objectif : lancer un script, observer son PID, consulter son utilisation CPU, l'arrêter p</w:t>
-      </w:r>
-      <w:r>
-        <w:rPr>
-          <w:color w:val="000000"/>
-        </w:rPr>
-        <w:t>uis le gérer en arrière-plan et au premier plan.</w:t>
-      </w:r>
-    </w:p>
-    <w:p>
-      <w:pPr>
-        <w:pBdr>
-          <w:left w:val="single" w:sz="18" w:space="4" w:color="2980B9"/>
-        </w:pBdr>
-        <w:shd w:val="clear" w:color="auto" w:fill="ECF0F1"/>
-        <w:spacing w:before="40"/>
-        <w:ind w:left="200" w:right="200"/>
-      </w:pPr>
-      <w:r>
-        <w:rPr>
-          <w:rFonts w:ascii="Consolas" w:eastAsia="Consolas" w:hAnsi="Consolas" w:cs="Consolas"/>
-          <w:color w:val="2C3E50"/>
-          <w:sz w:val="20"/>
-          <w:szCs w:val="20"/>
-        </w:rPr>
-        <w:t>python3 scripts/print-pause.py       # lancer le script</w:t>
-      </w:r>
-    </w:p>
-    <w:p>
-      <w:pPr>
-        <w:pBdr>
-          <w:left w:val="single" w:sz="18" w:space="4" w:color="2980B9"/>
-        </w:pBdr>
-        <w:shd w:val="clear" w:color="auto" w:fill="ECF0F1"/>
-        <w:ind w:left="200" w:right="200"/>
-      </w:pPr>
-      <w:r>
-        <w:rPr>
-          <w:rFonts w:ascii="Consolas" w:eastAsia="Consolas" w:hAnsi="Consolas" w:cs="Consolas"/>
-          <w:color w:val="2C3E50"/>
-          <w:sz w:val="20"/>
-          <w:szCs w:val="20"/>
-        </w:rPr>
-        <w:t>ps aux | grep print-pause            # observer le PID</w:t>
-      </w:r>
-    </w:p>
-    <w:p>
-      <w:pPr>
-        <w:pBdr>
-          <w:left w:val="single" w:sz="18" w:space="4" w:color="2980B9"/>
-        </w:pBdr>
-        <w:shd w:val="clear" w:color="auto" w:fill="ECF0F1"/>
-        <w:ind w:left="200" w:right="200"/>
-      </w:pPr>
-      <w:r>
-        <w:rPr>
-          <w:rFonts w:ascii="Consolas" w:eastAsia="Consolas" w:hAnsi="Consolas" w:cs="Consolas"/>
-          <w:color w:val="2C3E50"/>
-          <w:sz w:val="20"/>
-          <w:szCs w:val="20"/>
-        </w:rPr>
-        <w:t>top     (ou htop)                    # utilisation CPU</w:t>
-      </w:r>
-    </w:p>
-    <w:p>
-      <w:pPr>
-        <w:pBdr>
-          <w:left w:val="single" w:sz="18" w:space="4" w:color="2980B9"/>
-        </w:pBdr>
-        <w:shd w:val="clear" w:color="auto" w:fill="ECF0F1"/>
-        <w:ind w:left="200" w:right="200"/>
-      </w:pPr>
-      <w:r>
-        <w:rPr>
-          <w:rFonts w:ascii="Consolas" w:eastAsia="Consolas" w:hAnsi="Consolas" w:cs="Consolas"/>
-          <w:color w:val="2C3E50"/>
-          <w:sz w:val="20"/>
-          <w:szCs w:val="20"/>
-        </w:rPr>
-        <w:t>kill &lt;PID&gt;                           # arrêter le processus</w:t>
-      </w:r>
-    </w:p>
-    <w:p>
-      <w:pPr>
-        <w:pBdr>
-          <w:left w:val="single" w:sz="18" w:space="4" w:color="2980B9"/>
-        </w:pBdr>
-        <w:shd w:val="clear" w:color="auto" w:fill="ECF0F1"/>
-        <w:ind w:left="200" w:right="200"/>
-      </w:pPr>
-      <w:r>
-        <w:rPr>
-          <w:rFonts w:ascii="Consolas" w:eastAsia="Consolas" w:hAnsi="Consolas" w:cs="Consolas"/>
-          <w:color w:val="2C3E50"/>
-          <w:sz w:val="20"/>
-          <w:szCs w:val="20"/>
-        </w:rPr>
-        <w:t>python3 scripts/print-pause.py &amp;     # relancer en arrière-plan</w:t>
-      </w:r>
-    </w:p>
-    <w:p>
-      <w:pPr>
-        <w:pBdr>
-          <w:left w:val="single" w:sz="18" w:space="4" w:color="2980B9"/>
-        </w:pBdr>
-        <w:shd w:val="clear" w:color="auto" w:fill="ECF0F1"/>
-        <w:spacing w:after="120"/>
-        <w:ind w:left="200" w:right="200"/>
-      </w:pPr>
-      <w:r>
-        <w:rPr>
-          <w:rFonts w:ascii="Consolas" w:eastAsia="Consolas" w:hAnsi="Consolas" w:cs="Consolas"/>
-          <w:color w:val="2C3E50"/>
-          <w:sz w:val="20"/>
-          <w:szCs w:val="20"/>
-        </w:rPr>
-        <w:t>fg                                   # remettre au premier plan</w:t>
+        <w:lastRenderedPageBreak/>
+        <w:t>Activité complémentaire proposée et réalisée : [ décrivez ici l'amélioration que vous avez ajoutée, par exemple un script de nettoyage automatique, une journalisation, une vérification d'intégrité de l'archive, etc. ]</w:t>
       </w:r>
     </w:p>
     <w:p>
@@ -3436,15 +3563,7 @@
           <w:bCs/>
           <w:color w:val="7F8C8D"/>
         </w:rPr>
-        <w:t>📷</w:t>
-      </w:r>
-      <w:r>
-        <w:rPr>
-          <w:b/>
-          <w:bCs/>
-          <w:color w:val="7F8C8D"/>
-        </w:rPr>
-        <w:t xml:space="preserve">  Insérer ici la capture d'écran</w:t>
+        <w:t>📷  Insérer ici la capture d'écran</w:t>
       </w:r>
       <w:r>
         <w:br/>
@@ -3457,17 +3576,7 @@
           <w:sz w:val="20"/>
           <w:szCs w:val="20"/>
         </w:rPr>
-        <w:t>Lancement du processus, PID, util</w:t>
-      </w:r>
-      <w:r>
-        <w:rPr>
-          <w:i/>
-          <w:iCs/>
-          <w:color w:val="7F8C8D"/>
-          <w:sz w:val="20"/>
-          <w:szCs w:val="20"/>
-        </w:rPr>
-        <w:t>isation CPU et gestion arrière-plan / premier plan.</w:t>
+        <w:t>Capture d'écran de l'activité bonus réalisée.</w:t>
       </w:r>
       <w:r>
         <w:br/>
@@ -3491,7 +3600,7 @@
         </w:pBdr>
         <w:spacing w:before="320" w:after="160"/>
       </w:pPr>
-      <w:bookmarkStart w:id="11" w:name="_Toc236173587"/>
+      <w:bookmarkStart w:id="13" w:name="_Toc236173589"/>
       <w:r>
         <w:rPr>
           <w:b/>
@@ -3500,9 +3609,9 @@
           <w:sz w:val="30"/>
           <w:szCs w:val="30"/>
         </w:rPr>
-        <w:t>Partie 6 : Script Bash setup_project.sh</w:t>
-      </w:r>
-      <w:bookmarkEnd w:id="11"/>
+        <w:t>Conclusion</w:t>
+      </w:r>
+      <w:bookmarkEnd w:id="13"/>
     </w:p>
     <w:p>
       <w:pPr>
@@ -3513,214 +3622,7 @@
         <w:rPr>
           <w:color w:val="000000"/>
         </w:rPr>
-        <w:lastRenderedPageBreak/>
-        <w:t xml:space="preserve">Objectif : automatiser toute la préparation de l'environnement dans un seul script commenté : demander le </w:t>
-      </w:r>
-      <w:r>
-        <w:rPr>
-          <w:color w:val="000000"/>
-        </w:rPr>
-        <w:t>nom du projet, créer l'arborescence, générer un fichier de configuration, installer les outils, télécharger le dataset, compresser le projet et afficher un résumé.</w:t>
-      </w:r>
-    </w:p>
-    <w:p>
-      <w:pPr>
-        <w:spacing w:after="120" w:line="300" w:lineRule="auto"/>
-        <w:jc w:val="both"/>
-      </w:pPr>
-      <w:r>
-        <w:rPr>
-          <w:color w:val="000000"/>
-        </w:rPr>
-        <w:t>Le script complet et commenté est livré séparément dans le dépôt GitHub (setup_project.sh).</w:t>
-      </w:r>
-    </w:p>
-    <w:p>
-      <w:pPr>
-        <w:pBdr>
-          <w:top w:val="dashed" w:sz="8" w:space="14" w:color="7F8C8D"/>
-          <w:left w:val="dashed" w:sz="8" w:space="14" w:color="7F8C8D"/>
-          <w:bottom w:val="dashed" w:sz="8" w:space="14" w:color="7F8C8D"/>
-          <w:right w:val="dashed" w:sz="8" w:space="14" w:color="7F8C8D"/>
-        </w:pBdr>
-        <w:shd w:val="clear" w:color="auto" w:fill="F8F9FA"/>
-        <w:spacing w:before="160" w:after="200" w:line="360" w:lineRule="auto"/>
-        <w:jc w:val="center"/>
-      </w:pPr>
-      <w:r>
-        <w:rPr>
-          <w:b/>
-          <w:bCs/>
-          <w:color w:val="7F8C8D"/>
-        </w:rPr>
-        <w:t>📷</w:t>
-      </w:r>
-      <w:r>
-        <w:rPr>
-          <w:b/>
-          <w:bCs/>
-          <w:color w:val="7F8C8D"/>
-        </w:rPr>
-        <w:t xml:space="preserve">  Insérer ici la capture d'écran</w:t>
-      </w:r>
-      <w:r>
-        <w:br/>
-      </w:r>
-      <w:r>
-        <w:rPr>
-          <w:i/>
-          <w:iCs/>
-          <w:color w:val="7F8C8D"/>
-          <w:sz w:val="20"/>
-          <w:szCs w:val="20"/>
-        </w:rPr>
-        <w:t>Exécution du script setup_project.sh et résumé final affiché.</w:t>
-      </w:r>
-      <w:r>
-        <w:br/>
-      </w:r>
-      <w:r>
-        <w:rPr>
-          <w:i/>
-          <w:iCs/>
-          <w:color w:val="7F8C8D"/>
-          <w:sz w:val="16"/>
-          <w:szCs w:val="16"/>
-        </w:rPr>
-        <w:t>(Clic droit → Insérer une image, puis supprimer ce texte)</w:t>
-      </w:r>
-    </w:p>
-    <w:p>
-      <w:pPr>
-        <w:pStyle w:val="Titre1"/>
-        <w:pBdr>
-          <w:bottom w:val="single" w:sz="12" w:space="6" w:color="2980B9"/>
-        </w:pBdr>
-        <w:spacing w:before="320" w:after="160"/>
-      </w:pPr>
-      <w:bookmarkStart w:id="12" w:name="_Toc236173588"/>
-      <w:r>
-        <w:rPr>
-          <w:b/>
-          <w:bCs/>
-          <w:color w:val="2C3E50"/>
-          <w:sz w:val="30"/>
-          <w:szCs w:val="30"/>
-        </w:rPr>
-        <w:t>Partie 7 : Bonus</w:t>
-      </w:r>
-      <w:bookmarkEnd w:id="12"/>
-    </w:p>
-    <w:p>
-      <w:pPr>
-        <w:spacing w:after="120" w:line="300" w:lineRule="auto"/>
-        <w:jc w:val="both"/>
-      </w:pPr>
-      <w:r>
-        <w:rPr>
-          <w:color w:val="000000"/>
-        </w:rPr>
-        <w:t>Activité complémentaire proposée et réalisée : [ décrivez ici l'amélioration que vou</w:t>
-      </w:r>
-      <w:r>
-        <w:rPr>
-          <w:color w:val="000000"/>
-        </w:rPr>
-        <w:t>s avez ajoutée, par exemple un script de nettoyage automatique, une journalisation, une vérification d'intégrité de l'archive, etc. ]</w:t>
-      </w:r>
-    </w:p>
-    <w:p>
-      <w:pPr>
-        <w:pBdr>
-          <w:top w:val="dashed" w:sz="8" w:space="14" w:color="7F8C8D"/>
-          <w:left w:val="dashed" w:sz="8" w:space="14" w:color="7F8C8D"/>
-          <w:bottom w:val="dashed" w:sz="8" w:space="14" w:color="7F8C8D"/>
-          <w:right w:val="dashed" w:sz="8" w:space="14" w:color="7F8C8D"/>
-        </w:pBdr>
-        <w:shd w:val="clear" w:color="auto" w:fill="F8F9FA"/>
-        <w:spacing w:before="160" w:after="200" w:line="360" w:lineRule="auto"/>
-        <w:jc w:val="center"/>
-      </w:pPr>
-      <w:r>
-        <w:rPr>
-          <w:b/>
-          <w:bCs/>
-          <w:color w:val="7F8C8D"/>
-        </w:rPr>
-        <w:t>📷</w:t>
-      </w:r>
-      <w:r>
-        <w:rPr>
-          <w:b/>
-          <w:bCs/>
-          <w:color w:val="7F8C8D"/>
-        </w:rPr>
-        <w:t xml:space="preserve">  Insérer ici la capture d'écran</w:t>
-      </w:r>
-      <w:r>
-        <w:br/>
-      </w:r>
-      <w:r>
-        <w:rPr>
-          <w:i/>
-          <w:iCs/>
-          <w:color w:val="7F8C8D"/>
-          <w:sz w:val="20"/>
-          <w:szCs w:val="20"/>
-        </w:rPr>
-        <w:t>Capture d'écran de l'activité bonus réalisée.</w:t>
-      </w:r>
-      <w:r>
-        <w:br/>
-      </w:r>
-      <w:r>
-        <w:rPr>
-          <w:i/>
-          <w:iCs/>
-          <w:color w:val="7F8C8D"/>
-          <w:sz w:val="16"/>
-          <w:szCs w:val="16"/>
-        </w:rPr>
-        <w:t>(Clic droit → Insérer une image, puis supprimer ce texte)</w:t>
-      </w:r>
-    </w:p>
-    <w:p>
-      <w:pPr>
-        <w:pStyle w:val="Titre1"/>
-        <w:pBdr>
-          <w:bottom w:val="single" w:sz="12" w:space="6" w:color="2980B9"/>
-        </w:pBdr>
-        <w:spacing w:before="320" w:after="160"/>
-      </w:pPr>
-      <w:bookmarkStart w:id="13" w:name="_Toc236173589"/>
-      <w:r>
-        <w:rPr>
-          <w:b/>
-          <w:bCs/>
-          <w:color w:val="2C3E50"/>
-          <w:sz w:val="30"/>
-          <w:szCs w:val="30"/>
-        </w:rPr>
-        <w:t>Conclusion</w:t>
-      </w:r>
-      <w:bookmarkEnd w:id="13"/>
-    </w:p>
-    <w:p>
-      <w:pPr>
-        <w:spacing w:after="120" w:line="300" w:lineRule="auto"/>
-        <w:jc w:val="both"/>
-      </w:pPr>
-      <w:r>
-        <w:rPr>
-          <w:color w:val="000000"/>
-        </w:rPr>
-        <w:t>Cet atelier a permis de mettre en place un environnement Linux fonctionnel pour un projet d'IA : organisation des données, manipulation des f</w:t>
-      </w:r>
-      <w:r>
-        <w:rPr>
-          <w:color w:val="000000"/>
-        </w:rPr>
-        <w:t>ichiers, gestion des utilisateurs et des permissions, installation des outils, supervision des processus et automatisation via un script Bash.</w:t>
+        <w:t>Cet atelier a permis de mettre en place un environnement Linux fonctionnel pour un projet d'IA : organisation des données, manipulation des fichiers, gestion des utilisateurs et des permissions, installation des outils, supervision des processus et automatisation via un script Bash.</w:t>
       </w:r>
     </w:p>
     <w:p>
@@ -3790,10 +3692,7 @@
         <w:spacing w:after="60" w:line="288" w:lineRule="auto"/>
       </w:pPr>
       <w:r>
-        <w:t>useradd, passwd, groupadd, user</w:t>
-      </w:r>
-      <w:r>
-        <w:t>mod, id : gérer utilisateurs et groupes.</w:t>
+        <w:t>useradd, passwd, groupadd, usermod, id : gérer utilisateurs et groupes.</w:t>
       </w:r>
     </w:p>
     <w:p>
@@ -3832,10 +3731,7 @@
         <w:spacing w:after="60" w:line="288" w:lineRule="auto"/>
       </w:pPr>
       <w:r>
-        <w:t>ps, top/htop, kill, jobs, fg, bg : superviser et contrôler les processus</w:t>
-      </w:r>
-      <w:r>
-        <w:t>.</w:t>
+        <w:t>ps, top/htop, kill, jobs, fg, bg : superviser et contrôler les processus.</w:t>
       </w:r>
     </w:p>
     <w:p>

</xml_diff>

<commit_message>
Partie 3 - captures + ignorer IA_Project
</commit_message>
<xml_diff>
--- a/Atelier_Linux_Compte_Rendu.docx
+++ b/Atelier_Linux_Compte_Rendu.docx
@@ -76,8 +76,18 @@
           <w:sz w:val="24"/>
           <w:szCs w:val="24"/>
         </w:rPr>
-        <w:t>Khadija Ngom</w:t>
-      </w:r>
+        <w:t xml:space="preserve">Khadija </w:t>
+      </w:r>
+      <w:proofErr w:type="spellStart"/>
+      <w:r>
+        <w:rPr>
+          <w:color w:val="7F8C8D"/>
+          <w:sz w:val="24"/>
+          <w:szCs w:val="24"/>
+        </w:rPr>
+        <w:t>Ngom</w:t>
+      </w:r>
+      <w:proofErr w:type="spellEnd"/>
     </w:p>
     <w:p>
       <w:pPr>
@@ -1230,7 +1240,15 @@
         <w:spacing w:after="60" w:line="288" w:lineRule="auto"/>
       </w:pPr>
       <w:r>
-        <w:t>Installer les outils nécessaires et récupérer un dataset.</w:t>
+        <w:t xml:space="preserve">Installer les outils nécessaires et récupérer un </w:t>
+      </w:r>
+      <w:proofErr w:type="spellStart"/>
+      <w:r>
+        <w:t>dataset</w:t>
+      </w:r>
+      <w:proofErr w:type="spellEnd"/>
+      <w:r>
+        <w:t>.</w:t>
       </w:r>
     </w:p>
     <w:p>
@@ -1289,7 +1307,21 @@
         <w:rPr>
           <w:color w:val="000000"/>
         </w:rPr>
-        <w:t>Le poste de travail étant sous Windows, un environnement Linux (Ubuntu) a été installé via WSL 2 (Windows Subsystem for Linux). Un dépôt Git a également été configuré pour suivre l'avancement.</w:t>
+        <w:t xml:space="preserve">Le poste de travail étant sous Windows, un environnement Linux (Ubuntu) a été installé via WSL 2 (Windows </w:t>
+      </w:r>
+      <w:proofErr w:type="spellStart"/>
+      <w:r>
+        <w:rPr>
+          <w:color w:val="000000"/>
+        </w:rPr>
+        <w:t>Subsystem</w:t>
+      </w:r>
+      <w:proofErr w:type="spellEnd"/>
+      <w:r>
+        <w:rPr>
+          <w:color w:val="000000"/>
+        </w:rPr>
+        <w:t xml:space="preserve"> for Linux). Un dépôt Git a également été configuré pour suivre l'avancement.</w:t>
       </w:r>
     </w:p>
     <w:p>
@@ -1319,6 +1351,7 @@
         <w:spacing w:before="40"/>
         <w:ind w:left="200" w:right="200"/>
       </w:pPr>
+      <w:proofErr w:type="spellStart"/>
       <w:proofErr w:type="gramStart"/>
       <w:r>
         <w:rPr>
@@ -1329,6 +1362,7 @@
         </w:rPr>
         <w:t>wsl</w:t>
       </w:r>
+      <w:proofErr w:type="spellEnd"/>
       <w:proofErr w:type="gramEnd"/>
       <w:r>
         <w:rPr>
@@ -1337,8 +1371,19 @@
           <w:sz w:val="20"/>
           <w:szCs w:val="20"/>
         </w:rPr>
-        <w:t xml:space="preserve"> --install</w:t>
-      </w:r>
+        <w:t xml:space="preserve"> --</w:t>
+      </w:r>
+      <w:proofErr w:type="spellStart"/>
+      <w:r>
+        <w:rPr>
+          <w:rFonts w:ascii="Consolas" w:eastAsia="Consolas" w:hAnsi="Consolas" w:cs="Consolas"/>
+          <w:color w:val="2C3E50"/>
+          <w:sz w:val="20"/>
+          <w:szCs w:val="20"/>
+        </w:rPr>
+        <w:t>install</w:t>
+      </w:r>
+      <w:proofErr w:type="spellEnd"/>
     </w:p>
     <w:p>
       <w:pPr>
@@ -1349,6 +1394,7 @@
         <w:spacing w:after="120"/>
         <w:ind w:left="200" w:right="200"/>
       </w:pPr>
+      <w:proofErr w:type="spellStart"/>
       <w:proofErr w:type="gramStart"/>
       <w:r>
         <w:rPr>
@@ -1359,6 +1405,7 @@
         </w:rPr>
         <w:t>sudo</w:t>
       </w:r>
+      <w:proofErr w:type="spellEnd"/>
       <w:proofErr w:type="gramEnd"/>
       <w:r>
         <w:rPr>
@@ -1367,7 +1414,67 @@
           <w:sz w:val="20"/>
           <w:szCs w:val="20"/>
         </w:rPr>
-        <w:t xml:space="preserve"> apt update &amp;&amp; sudo apt upgrade -y</w:t>
+        <w:t xml:space="preserve"> </w:t>
+      </w:r>
+      <w:proofErr w:type="spellStart"/>
+      <w:r>
+        <w:rPr>
+          <w:rFonts w:ascii="Consolas" w:eastAsia="Consolas" w:hAnsi="Consolas" w:cs="Consolas"/>
+          <w:color w:val="2C3E50"/>
+          <w:sz w:val="20"/>
+          <w:szCs w:val="20"/>
+        </w:rPr>
+        <w:t>apt</w:t>
+      </w:r>
+      <w:proofErr w:type="spellEnd"/>
+      <w:r>
+        <w:rPr>
+          <w:rFonts w:ascii="Consolas" w:eastAsia="Consolas" w:hAnsi="Consolas" w:cs="Consolas"/>
+          <w:color w:val="2C3E50"/>
+          <w:sz w:val="20"/>
+          <w:szCs w:val="20"/>
+        </w:rPr>
+        <w:t xml:space="preserve"> update &amp;&amp; </w:t>
+      </w:r>
+      <w:proofErr w:type="spellStart"/>
+      <w:r>
+        <w:rPr>
+          <w:rFonts w:ascii="Consolas" w:eastAsia="Consolas" w:hAnsi="Consolas" w:cs="Consolas"/>
+          <w:color w:val="2C3E50"/>
+          <w:sz w:val="20"/>
+          <w:szCs w:val="20"/>
+        </w:rPr>
+        <w:t>sudo</w:t>
+      </w:r>
+      <w:proofErr w:type="spellEnd"/>
+      <w:r>
+        <w:rPr>
+          <w:rFonts w:ascii="Consolas" w:eastAsia="Consolas" w:hAnsi="Consolas" w:cs="Consolas"/>
+          <w:color w:val="2C3E50"/>
+          <w:sz w:val="20"/>
+          <w:szCs w:val="20"/>
+        </w:rPr>
+        <w:t xml:space="preserve"> </w:t>
+      </w:r>
+      <w:proofErr w:type="spellStart"/>
+      <w:r>
+        <w:rPr>
+          <w:rFonts w:ascii="Consolas" w:eastAsia="Consolas" w:hAnsi="Consolas" w:cs="Consolas"/>
+          <w:color w:val="2C3E50"/>
+          <w:sz w:val="20"/>
+          <w:szCs w:val="20"/>
+        </w:rPr>
+        <w:t>apt</w:t>
+      </w:r>
+      <w:proofErr w:type="spellEnd"/>
+      <w:r>
+        <w:rPr>
+          <w:rFonts w:ascii="Consolas" w:eastAsia="Consolas" w:hAnsi="Consolas" w:cs="Consolas"/>
+          <w:color w:val="2C3E50"/>
+          <w:sz w:val="20"/>
+          <w:szCs w:val="20"/>
+        </w:rPr>
+        <w:t xml:space="preserve"> upgrade -y</w:t>
       </w:r>
     </w:p>
     <w:p>
@@ -1391,6 +1498,7 @@
         <w:spacing w:before="40"/>
         <w:ind w:left="200" w:right="200"/>
       </w:pPr>
+      <w:proofErr w:type="spellStart"/>
       <w:proofErr w:type="gramStart"/>
       <w:r>
         <w:rPr>
@@ -1401,6 +1509,7 @@
         </w:rPr>
         <w:t>whoami</w:t>
       </w:r>
+      <w:proofErr w:type="spellEnd"/>
       <w:proofErr w:type="gramEnd"/>
     </w:p>
     <w:p>
@@ -1412,6 +1521,7 @@
         <w:spacing w:after="120"/>
         <w:ind w:left="200" w:right="200"/>
       </w:pPr>
+      <w:proofErr w:type="spellStart"/>
       <w:proofErr w:type="gramStart"/>
       <w:r>
         <w:rPr>
@@ -1430,7 +1540,17 @@
           <w:sz w:val="20"/>
           <w:szCs w:val="20"/>
         </w:rPr>
-        <w:t>_release -a</w:t>
+        <w:t>_release</w:t>
+      </w:r>
+      <w:proofErr w:type="spellEnd"/>
+      <w:r>
+        <w:rPr>
+          <w:rFonts w:ascii="Consolas" w:eastAsia="Consolas" w:hAnsi="Consolas" w:cs="Consolas"/>
+          <w:color w:val="2C3E50"/>
+          <w:sz w:val="20"/>
+          <w:szCs w:val="20"/>
+        </w:rPr>
+        <w:t xml:space="preserve"> -a</w:t>
       </w:r>
     </w:p>
     <w:p>
@@ -1574,7 +1694,27 @@
           <w:sz w:val="20"/>
           <w:szCs w:val="20"/>
         </w:rPr>
-        <w:t xml:space="preserve"> config --global user.email "votre-email@gmail.com"</w:t>
+        <w:t xml:space="preserve"> config --global </w:t>
+      </w:r>
+      <w:proofErr w:type="spellStart"/>
+      <w:r>
+        <w:rPr>
+          <w:rFonts w:ascii="Consolas" w:eastAsia="Consolas" w:hAnsi="Consolas" w:cs="Consolas"/>
+          <w:color w:val="2C3E50"/>
+          <w:sz w:val="20"/>
+          <w:szCs w:val="20"/>
+        </w:rPr>
+        <w:t>user.email</w:t>
+      </w:r>
+      <w:proofErr w:type="spellEnd"/>
+      <w:r>
+        <w:rPr>
+          <w:rFonts w:ascii="Consolas" w:eastAsia="Consolas" w:hAnsi="Consolas" w:cs="Consolas"/>
+          <w:color w:val="2C3E50"/>
+          <w:sz w:val="20"/>
+          <w:szCs w:val="20"/>
+        </w:rPr>
+        <w:t xml:space="preserve"> "votre-email@gmail.com"</w:t>
       </w:r>
     </w:p>
     <w:p>
@@ -1586,6 +1726,7 @@
         <w:spacing w:after="120"/>
         <w:ind w:left="200" w:right="200"/>
       </w:pPr>
+      <w:proofErr w:type="spellStart"/>
       <w:proofErr w:type="gramStart"/>
       <w:r>
         <w:rPr>
@@ -1596,6 +1737,7 @@
         </w:rPr>
         <w:t>gh</w:t>
       </w:r>
+      <w:proofErr w:type="spellEnd"/>
       <w:proofErr w:type="gramEnd"/>
       <w:r>
         <w:rPr>
@@ -1604,7 +1746,27 @@
           <w:sz w:val="20"/>
           <w:szCs w:val="20"/>
         </w:rPr>
-        <w:t xml:space="preserve"> auth login</w:t>
+        <w:t xml:space="preserve"> </w:t>
+      </w:r>
+      <w:proofErr w:type="spellStart"/>
+      <w:r>
+        <w:rPr>
+          <w:rFonts w:ascii="Consolas" w:eastAsia="Consolas" w:hAnsi="Consolas" w:cs="Consolas"/>
+          <w:color w:val="2C3E50"/>
+          <w:sz w:val="20"/>
+          <w:szCs w:val="20"/>
+        </w:rPr>
+        <w:t>auth</w:t>
+      </w:r>
+      <w:proofErr w:type="spellEnd"/>
+      <w:r>
+        <w:rPr>
+          <w:rFonts w:ascii="Consolas" w:eastAsia="Consolas" w:hAnsi="Consolas" w:cs="Consolas"/>
+          <w:color w:val="2C3E50"/>
+          <w:sz w:val="20"/>
+          <w:szCs w:val="20"/>
+        </w:rPr>
+        <w:t xml:space="preserve"> login</w:t>
       </w:r>
     </w:p>
     <w:p>
@@ -1675,7 +1837,27 @@
           <w:sz w:val="20"/>
           <w:szCs w:val="20"/>
         </w:rPr>
-        <w:t xml:space="preserve"> add README.md</w:t>
+        <w:t xml:space="preserve"> </w:t>
+      </w:r>
+      <w:proofErr w:type="spellStart"/>
+      <w:r>
+        <w:rPr>
+          <w:rFonts w:ascii="Consolas" w:eastAsia="Consolas" w:hAnsi="Consolas" w:cs="Consolas"/>
+          <w:color w:val="2C3E50"/>
+          <w:sz w:val="20"/>
+          <w:szCs w:val="20"/>
+        </w:rPr>
+        <w:t>add</w:t>
+      </w:r>
+      <w:proofErr w:type="spellEnd"/>
+      <w:r>
+        <w:rPr>
+          <w:rFonts w:ascii="Consolas" w:eastAsia="Consolas" w:hAnsi="Consolas" w:cs="Consolas"/>
+          <w:color w:val="2C3E50"/>
+          <w:sz w:val="20"/>
+          <w:szCs w:val="20"/>
+        </w:rPr>
+        <w:t xml:space="preserve"> README.md</w:t>
       </w:r>
     </w:p>
     <w:p>
@@ -1704,7 +1886,27 @@
           <w:sz w:val="20"/>
           <w:szCs w:val="20"/>
         </w:rPr>
-        <w:t xml:space="preserve"> commit -m "Initialisation du depot"</w:t>
+        <w:t xml:space="preserve"> commit -m "Initialisation du </w:t>
+      </w:r>
+      <w:proofErr w:type="spellStart"/>
+      <w:r>
+        <w:rPr>
+          <w:rFonts w:ascii="Consolas" w:eastAsia="Consolas" w:hAnsi="Consolas" w:cs="Consolas"/>
+          <w:color w:val="2C3E50"/>
+          <w:sz w:val="20"/>
+          <w:szCs w:val="20"/>
+        </w:rPr>
+        <w:t>depot</w:t>
+      </w:r>
+      <w:proofErr w:type="spellEnd"/>
+      <w:r>
+        <w:rPr>
+          <w:rFonts w:ascii="Consolas" w:eastAsia="Consolas" w:hAnsi="Consolas" w:cs="Consolas"/>
+          <w:color w:val="2C3E50"/>
+          <w:sz w:val="20"/>
+          <w:szCs w:val="20"/>
+        </w:rPr>
+        <w:t>"</w:t>
       </w:r>
     </w:p>
     <w:p>
@@ -1716,6 +1918,7 @@
         <w:spacing w:after="120"/>
         <w:ind w:left="200" w:right="200"/>
       </w:pPr>
+      <w:proofErr w:type="spellStart"/>
       <w:proofErr w:type="gramStart"/>
       <w:r>
         <w:rPr>
@@ -1726,6 +1929,7 @@
         </w:rPr>
         <w:t>gh</w:t>
       </w:r>
+      <w:proofErr w:type="spellEnd"/>
       <w:proofErr w:type="gramEnd"/>
       <w:r>
         <w:rPr>
@@ -1734,7 +1938,67 @@
           <w:sz w:val="20"/>
           <w:szCs w:val="20"/>
         </w:rPr>
-        <w:t xml:space="preserve"> repo create atelier-linux --public --source=. --remote=origin --push</w:t>
+        <w:t xml:space="preserve"> repo </w:t>
+      </w:r>
+      <w:proofErr w:type="spellStart"/>
+      <w:r>
+        <w:rPr>
+          <w:rFonts w:ascii="Consolas" w:eastAsia="Consolas" w:hAnsi="Consolas" w:cs="Consolas"/>
+          <w:color w:val="2C3E50"/>
+          <w:sz w:val="20"/>
+          <w:szCs w:val="20"/>
+        </w:rPr>
+        <w:t>create</w:t>
+      </w:r>
+      <w:proofErr w:type="spellEnd"/>
+      <w:r>
+        <w:rPr>
+          <w:rFonts w:ascii="Consolas" w:eastAsia="Consolas" w:hAnsi="Consolas" w:cs="Consolas"/>
+          <w:color w:val="2C3E50"/>
+          <w:sz w:val="20"/>
+          <w:szCs w:val="20"/>
+        </w:rPr>
+        <w:t xml:space="preserve"> atelier-linux --public --source=. --</w:t>
+      </w:r>
+      <w:proofErr w:type="spellStart"/>
+      <w:r>
+        <w:rPr>
+          <w:rFonts w:ascii="Consolas" w:eastAsia="Consolas" w:hAnsi="Consolas" w:cs="Consolas"/>
+          <w:color w:val="2C3E50"/>
+          <w:sz w:val="20"/>
+          <w:szCs w:val="20"/>
+        </w:rPr>
+        <w:t>remote</w:t>
+      </w:r>
+      <w:proofErr w:type="spellEnd"/>
+      <w:r>
+        <w:rPr>
+          <w:rFonts w:ascii="Consolas" w:eastAsia="Consolas" w:hAnsi="Consolas" w:cs="Consolas"/>
+          <w:color w:val="2C3E50"/>
+          <w:sz w:val="20"/>
+          <w:szCs w:val="20"/>
+        </w:rPr>
+        <w:t>=</w:t>
+      </w:r>
+      <w:proofErr w:type="spellStart"/>
+      <w:r>
+        <w:rPr>
+          <w:rFonts w:ascii="Consolas" w:eastAsia="Consolas" w:hAnsi="Consolas" w:cs="Consolas"/>
+          <w:color w:val="2C3E50"/>
+          <w:sz w:val="20"/>
+          <w:szCs w:val="20"/>
+        </w:rPr>
+        <w:t>origin</w:t>
+      </w:r>
+      <w:proofErr w:type="spellEnd"/>
+      <w:r>
+        <w:rPr>
+          <w:rFonts w:ascii="Consolas" w:eastAsia="Consolas" w:hAnsi="Consolas" w:cs="Consolas"/>
+          <w:color w:val="2C3E50"/>
+          <w:sz w:val="20"/>
+          <w:szCs w:val="20"/>
+        </w:rPr>
+        <w:t xml:space="preserve"> --push</w:t>
       </w:r>
     </w:p>
     <w:p>
@@ -1913,7 +2177,49 @@
         <w:rPr>
           <w:color w:val="000000"/>
         </w:rPr>
-        <w:t>Objectif : créer l'arborescence complète du projet IA_Project (dossiers datasets/brut, config, logs, scripts, models et leurs fichiers).</w:t>
+        <w:t xml:space="preserve">Objectif : créer l'arborescence complète du projet </w:t>
+      </w:r>
+      <w:proofErr w:type="spellStart"/>
+      <w:r>
+        <w:rPr>
+          <w:color w:val="000000"/>
+        </w:rPr>
+        <w:t>IA_Project</w:t>
+      </w:r>
+      <w:proofErr w:type="spellEnd"/>
+      <w:r>
+        <w:rPr>
+          <w:color w:val="000000"/>
+        </w:rPr>
+        <w:t xml:space="preserve"> (dossiers </w:t>
+      </w:r>
+      <w:proofErr w:type="spellStart"/>
+      <w:r>
+        <w:rPr>
+          <w:color w:val="000000"/>
+        </w:rPr>
+        <w:t>datasets</w:t>
+      </w:r>
+      <w:proofErr w:type="spellEnd"/>
+      <w:r>
+        <w:rPr>
+          <w:color w:val="000000"/>
+        </w:rPr>
+        <w:t xml:space="preserve">/brut, config, logs, scripts, </w:t>
+      </w:r>
+      <w:proofErr w:type="spellStart"/>
+      <w:r>
+        <w:rPr>
+          <w:color w:val="000000"/>
+        </w:rPr>
+        <w:t>models</w:t>
+      </w:r>
+      <w:proofErr w:type="spellEnd"/>
+      <w:r>
+        <w:rPr>
+          <w:color w:val="000000"/>
+        </w:rPr>
+        <w:t xml:space="preserve"> et leurs fichiers).</w:t>
       </w:r>
     </w:p>
     <w:p>
@@ -1943,6 +2249,7 @@
         <w:spacing w:before="40"/>
         <w:ind w:left="200" w:right="200"/>
       </w:pPr>
+      <w:proofErr w:type="spellStart"/>
       <w:proofErr w:type="gramStart"/>
       <w:r>
         <w:rPr>
@@ -1953,6 +2260,7 @@
         </w:rPr>
         <w:t>mkdir</w:t>
       </w:r>
+      <w:proofErr w:type="spellEnd"/>
       <w:proofErr w:type="gramEnd"/>
       <w:r>
         <w:rPr>
@@ -1961,7 +2269,47 @@
           <w:sz w:val="20"/>
           <w:szCs w:val="20"/>
         </w:rPr>
-        <w:t xml:space="preserve"> -p IA_Project/datasets/brut</w:t>
+        <w:t xml:space="preserve"> -p </w:t>
+      </w:r>
+      <w:proofErr w:type="spellStart"/>
+      <w:r>
+        <w:rPr>
+          <w:rFonts w:ascii="Consolas" w:eastAsia="Consolas" w:hAnsi="Consolas" w:cs="Consolas"/>
+          <w:color w:val="2C3E50"/>
+          <w:sz w:val="20"/>
+          <w:szCs w:val="20"/>
+        </w:rPr>
+        <w:t>IA_Project</w:t>
+      </w:r>
+      <w:proofErr w:type="spellEnd"/>
+      <w:r>
+        <w:rPr>
+          <w:rFonts w:ascii="Consolas" w:eastAsia="Consolas" w:hAnsi="Consolas" w:cs="Consolas"/>
+          <w:color w:val="2C3E50"/>
+          <w:sz w:val="20"/>
+          <w:szCs w:val="20"/>
+        </w:rPr>
+        <w:t>/</w:t>
+      </w:r>
+      <w:proofErr w:type="spellStart"/>
+      <w:r>
+        <w:rPr>
+          <w:rFonts w:ascii="Consolas" w:eastAsia="Consolas" w:hAnsi="Consolas" w:cs="Consolas"/>
+          <w:color w:val="2C3E50"/>
+          <w:sz w:val="20"/>
+          <w:szCs w:val="20"/>
+        </w:rPr>
+        <w:t>datasets</w:t>
+      </w:r>
+      <w:proofErr w:type="spellEnd"/>
+      <w:r>
+        <w:rPr>
+          <w:rFonts w:ascii="Consolas" w:eastAsia="Consolas" w:hAnsi="Consolas" w:cs="Consolas"/>
+          <w:color w:val="2C3E50"/>
+          <w:sz w:val="20"/>
+          <w:szCs w:val="20"/>
+        </w:rPr>
+        <w:t>/brut</w:t>
       </w:r>
     </w:p>
     <w:p>
@@ -1972,6 +2320,7 @@
         <w:shd w:val="clear" w:color="auto" w:fill="ECF0F1"/>
         <w:ind w:left="200" w:right="200"/>
       </w:pPr>
+      <w:proofErr w:type="spellStart"/>
       <w:proofErr w:type="gramStart"/>
       <w:r>
         <w:rPr>
@@ -1982,6 +2331,7 @@
         </w:rPr>
         <w:t>mkdir</w:t>
       </w:r>
+      <w:proofErr w:type="spellEnd"/>
       <w:proofErr w:type="gramEnd"/>
       <w:r>
         <w:rPr>
@@ -1990,8 +2340,99 @@
           <w:sz w:val="20"/>
           <w:szCs w:val="20"/>
         </w:rPr>
-        <w:t xml:space="preserve"> -p IA_Project/config IA_Project/logs IA_Project/scripts IA_Project/models</w:t>
-      </w:r>
+        <w:t xml:space="preserve"> -p </w:t>
+      </w:r>
+      <w:proofErr w:type="spellStart"/>
+      <w:r>
+        <w:rPr>
+          <w:rFonts w:ascii="Consolas" w:eastAsia="Consolas" w:hAnsi="Consolas" w:cs="Consolas"/>
+          <w:color w:val="2C3E50"/>
+          <w:sz w:val="20"/>
+          <w:szCs w:val="20"/>
+        </w:rPr>
+        <w:t>IA_Project</w:t>
+      </w:r>
+      <w:proofErr w:type="spellEnd"/>
+      <w:r>
+        <w:rPr>
+          <w:rFonts w:ascii="Consolas" w:eastAsia="Consolas" w:hAnsi="Consolas" w:cs="Consolas"/>
+          <w:color w:val="2C3E50"/>
+          <w:sz w:val="20"/>
+          <w:szCs w:val="20"/>
+        </w:rPr>
+        <w:t xml:space="preserve">/config </w:t>
+      </w:r>
+      <w:proofErr w:type="spellStart"/>
+      <w:r>
+        <w:rPr>
+          <w:rFonts w:ascii="Consolas" w:eastAsia="Consolas" w:hAnsi="Consolas" w:cs="Consolas"/>
+          <w:color w:val="2C3E50"/>
+          <w:sz w:val="20"/>
+          <w:szCs w:val="20"/>
+        </w:rPr>
+        <w:t>IA_Project</w:t>
+      </w:r>
+      <w:proofErr w:type="spellEnd"/>
+      <w:r>
+        <w:rPr>
+          <w:rFonts w:ascii="Consolas" w:eastAsia="Consolas" w:hAnsi="Consolas" w:cs="Consolas"/>
+          <w:color w:val="2C3E50"/>
+          <w:sz w:val="20"/>
+          <w:szCs w:val="20"/>
+        </w:rPr>
+        <w:t xml:space="preserve">/logs </w:t>
+      </w:r>
+      <w:proofErr w:type="spellStart"/>
+      <w:r>
+        <w:rPr>
+          <w:rFonts w:ascii="Consolas" w:eastAsia="Consolas" w:hAnsi="Consolas" w:cs="Consolas"/>
+          <w:color w:val="2C3E50"/>
+          <w:sz w:val="20"/>
+          <w:szCs w:val="20"/>
+        </w:rPr>
+        <w:t>IA_Project</w:t>
+      </w:r>
+      <w:proofErr w:type="spellEnd"/>
+      <w:r>
+        <w:rPr>
+          <w:rFonts w:ascii="Consolas" w:eastAsia="Consolas" w:hAnsi="Consolas" w:cs="Consolas"/>
+          <w:color w:val="2C3E50"/>
+          <w:sz w:val="20"/>
+          <w:szCs w:val="20"/>
+        </w:rPr>
+        <w:t xml:space="preserve">/scripts </w:t>
+      </w:r>
+      <w:proofErr w:type="spellStart"/>
+      <w:r>
+        <w:rPr>
+          <w:rFonts w:ascii="Consolas" w:eastAsia="Consolas" w:hAnsi="Consolas" w:cs="Consolas"/>
+          <w:color w:val="2C3E50"/>
+          <w:sz w:val="20"/>
+          <w:szCs w:val="20"/>
+        </w:rPr>
+        <w:t>IA_Project</w:t>
+      </w:r>
+      <w:proofErr w:type="spellEnd"/>
+      <w:r>
+        <w:rPr>
+          <w:rFonts w:ascii="Consolas" w:eastAsia="Consolas" w:hAnsi="Consolas" w:cs="Consolas"/>
+          <w:color w:val="2C3E50"/>
+          <w:sz w:val="20"/>
+          <w:szCs w:val="20"/>
+        </w:rPr>
+        <w:t>/</w:t>
+      </w:r>
+      <w:proofErr w:type="spellStart"/>
+      <w:r>
+        <w:rPr>
+          <w:rFonts w:ascii="Consolas" w:eastAsia="Consolas" w:hAnsi="Consolas" w:cs="Consolas"/>
+          <w:color w:val="2C3E50"/>
+          <w:sz w:val="20"/>
+          <w:szCs w:val="20"/>
+        </w:rPr>
+        <w:t>models</w:t>
+      </w:r>
+      <w:proofErr w:type="spellEnd"/>
     </w:p>
     <w:p>
       <w:pPr>
@@ -2001,6 +2442,7 @@
         <w:shd w:val="clear" w:color="auto" w:fill="ECF0F1"/>
         <w:ind w:left="200" w:right="200"/>
       </w:pPr>
+      <w:proofErr w:type="spellStart"/>
       <w:proofErr w:type="gramStart"/>
       <w:r>
         <w:rPr>
@@ -2011,6 +2453,7 @@
         </w:rPr>
         <w:t>touch</w:t>
       </w:r>
+      <w:proofErr w:type="spellEnd"/>
       <w:proofErr w:type="gramEnd"/>
       <w:r>
         <w:rPr>
@@ -2030,6 +2473,7 @@
         <w:shd w:val="clear" w:color="auto" w:fill="ECF0F1"/>
         <w:ind w:left="200" w:right="200"/>
       </w:pPr>
+      <w:proofErr w:type="spellStart"/>
       <w:proofErr w:type="gramStart"/>
       <w:r>
         <w:rPr>
@@ -2040,6 +2484,7 @@
         </w:rPr>
         <w:t>touch</w:t>
       </w:r>
+      <w:proofErr w:type="spellEnd"/>
       <w:proofErr w:type="gramEnd"/>
       <w:r>
         <w:rPr>
@@ -2048,7 +2493,47 @@
           <w:sz w:val="20"/>
           <w:szCs w:val="20"/>
         </w:rPr>
-        <w:t xml:space="preserve"> IA_Project/config/{settings.conf,model.conf}</w:t>
+        <w:t xml:space="preserve"> </w:t>
+      </w:r>
+      <w:proofErr w:type="spellStart"/>
+      <w:r>
+        <w:rPr>
+          <w:rFonts w:ascii="Consolas" w:eastAsia="Consolas" w:hAnsi="Consolas" w:cs="Consolas"/>
+          <w:color w:val="2C3E50"/>
+          <w:sz w:val="20"/>
+          <w:szCs w:val="20"/>
+        </w:rPr>
+        <w:t>IA_Project</w:t>
+      </w:r>
+      <w:proofErr w:type="spellEnd"/>
+      <w:r>
+        <w:rPr>
+          <w:rFonts w:ascii="Consolas" w:eastAsia="Consolas" w:hAnsi="Consolas" w:cs="Consolas"/>
+          <w:color w:val="2C3E50"/>
+          <w:sz w:val="20"/>
+          <w:szCs w:val="20"/>
+        </w:rPr>
+        <w:t>/config/{</w:t>
+      </w:r>
+      <w:proofErr w:type="spellStart"/>
+      <w:r>
+        <w:rPr>
+          <w:rFonts w:ascii="Consolas" w:eastAsia="Consolas" w:hAnsi="Consolas" w:cs="Consolas"/>
+          <w:color w:val="2C3E50"/>
+          <w:sz w:val="20"/>
+          <w:szCs w:val="20"/>
+        </w:rPr>
+        <w:t>settings.conf,model.conf</w:t>
+      </w:r>
+      <w:proofErr w:type="spellEnd"/>
+      <w:r>
+        <w:rPr>
+          <w:rFonts w:ascii="Consolas" w:eastAsia="Consolas" w:hAnsi="Consolas" w:cs="Consolas"/>
+          <w:color w:val="2C3E50"/>
+          <w:sz w:val="20"/>
+          <w:szCs w:val="20"/>
+        </w:rPr>
+        <w:t>}</w:t>
       </w:r>
     </w:p>
     <w:p>
@@ -2059,6 +2544,7 @@
         <w:shd w:val="clear" w:color="auto" w:fill="ECF0F1"/>
         <w:ind w:left="200" w:right="200"/>
       </w:pPr>
+      <w:proofErr w:type="spellStart"/>
       <w:proofErr w:type="gramStart"/>
       <w:r>
         <w:rPr>
@@ -2069,6 +2555,7 @@
         </w:rPr>
         <w:t>touch</w:t>
       </w:r>
+      <w:proofErr w:type="spellEnd"/>
       <w:proofErr w:type="gramEnd"/>
       <w:r>
         <w:rPr>
@@ -2077,7 +2564,27 @@
           <w:sz w:val="20"/>
           <w:szCs w:val="20"/>
         </w:rPr>
-        <w:t xml:space="preserve"> IA_Project/logs/{application.log,training.log}</w:t>
+        <w:t xml:space="preserve"> </w:t>
+      </w:r>
+      <w:proofErr w:type="spellStart"/>
+      <w:r>
+        <w:rPr>
+          <w:rFonts w:ascii="Consolas" w:eastAsia="Consolas" w:hAnsi="Consolas" w:cs="Consolas"/>
+          <w:color w:val="2C3E50"/>
+          <w:sz w:val="20"/>
+          <w:szCs w:val="20"/>
+        </w:rPr>
+        <w:t>IA_Project</w:t>
+      </w:r>
+      <w:proofErr w:type="spellEnd"/>
+      <w:r>
+        <w:rPr>
+          <w:rFonts w:ascii="Consolas" w:eastAsia="Consolas" w:hAnsi="Consolas" w:cs="Consolas"/>
+          <w:color w:val="2C3E50"/>
+          <w:sz w:val="20"/>
+          <w:szCs w:val="20"/>
+        </w:rPr>
+        <w:t>/logs/{application.log,training.log}</w:t>
       </w:r>
     </w:p>
     <w:p>
@@ -2088,6 +2595,7 @@
         <w:shd w:val="clear" w:color="auto" w:fill="ECF0F1"/>
         <w:ind w:left="200" w:right="200"/>
       </w:pPr>
+      <w:proofErr w:type="spellStart"/>
       <w:proofErr w:type="gramStart"/>
       <w:r>
         <w:rPr>
@@ -2098,6 +2606,7 @@
         </w:rPr>
         <w:t>touch</w:t>
       </w:r>
+      <w:proofErr w:type="spellEnd"/>
       <w:proofErr w:type="gramEnd"/>
       <w:r>
         <w:rPr>
@@ -2106,7 +2615,47 @@
           <w:sz w:val="20"/>
           <w:szCs w:val="20"/>
         </w:rPr>
-        <w:t xml:space="preserve"> IA_Project/scripts/{train.py,preprocess.py}</w:t>
+        <w:t xml:space="preserve"> </w:t>
+      </w:r>
+      <w:proofErr w:type="spellStart"/>
+      <w:r>
+        <w:rPr>
+          <w:rFonts w:ascii="Consolas" w:eastAsia="Consolas" w:hAnsi="Consolas" w:cs="Consolas"/>
+          <w:color w:val="2C3E50"/>
+          <w:sz w:val="20"/>
+          <w:szCs w:val="20"/>
+        </w:rPr>
+        <w:t>IA_Project</w:t>
+      </w:r>
+      <w:proofErr w:type="spellEnd"/>
+      <w:r>
+        <w:rPr>
+          <w:rFonts w:ascii="Consolas" w:eastAsia="Consolas" w:hAnsi="Consolas" w:cs="Consolas"/>
+          <w:color w:val="2C3E50"/>
+          <w:sz w:val="20"/>
+          <w:szCs w:val="20"/>
+        </w:rPr>
+        <w:t>/scripts/{</w:t>
+      </w:r>
+      <w:proofErr w:type="spellStart"/>
+      <w:r>
+        <w:rPr>
+          <w:rFonts w:ascii="Consolas" w:eastAsia="Consolas" w:hAnsi="Consolas" w:cs="Consolas"/>
+          <w:color w:val="2C3E50"/>
+          <w:sz w:val="20"/>
+          <w:szCs w:val="20"/>
+        </w:rPr>
+        <w:t>train.py,preprocess.py</w:t>
+      </w:r>
+      <w:proofErr w:type="spellEnd"/>
+      <w:r>
+        <w:rPr>
+          <w:rFonts w:ascii="Consolas" w:eastAsia="Consolas" w:hAnsi="Consolas" w:cs="Consolas"/>
+          <w:color w:val="2C3E50"/>
+          <w:sz w:val="20"/>
+          <w:szCs w:val="20"/>
+        </w:rPr>
+        <w:t>}</w:t>
       </w:r>
     </w:p>
     <w:p>
@@ -2117,6 +2666,7 @@
         <w:shd w:val="clear" w:color="auto" w:fill="ECF0F1"/>
         <w:ind w:left="200" w:right="200"/>
       </w:pPr>
+      <w:proofErr w:type="spellStart"/>
       <w:proofErr w:type="gramStart"/>
       <w:r>
         <w:rPr>
@@ -2127,6 +2677,7 @@
         </w:rPr>
         <w:t>touch</w:t>
       </w:r>
+      <w:proofErr w:type="spellEnd"/>
       <w:proofErr w:type="gramEnd"/>
       <w:r>
         <w:rPr>
@@ -2135,7 +2686,47 @@
           <w:sz w:val="20"/>
           <w:szCs w:val="20"/>
         </w:rPr>
-        <w:t xml:space="preserve"> IA_Project/models/model_info.txt</w:t>
+        <w:t xml:space="preserve"> </w:t>
+      </w:r>
+      <w:proofErr w:type="spellStart"/>
+      <w:r>
+        <w:rPr>
+          <w:rFonts w:ascii="Consolas" w:eastAsia="Consolas" w:hAnsi="Consolas" w:cs="Consolas"/>
+          <w:color w:val="2C3E50"/>
+          <w:sz w:val="20"/>
+          <w:szCs w:val="20"/>
+        </w:rPr>
+        <w:t>IA_Project</w:t>
+      </w:r>
+      <w:proofErr w:type="spellEnd"/>
+      <w:r>
+        <w:rPr>
+          <w:rFonts w:ascii="Consolas" w:eastAsia="Consolas" w:hAnsi="Consolas" w:cs="Consolas"/>
+          <w:color w:val="2C3E50"/>
+          <w:sz w:val="20"/>
+          <w:szCs w:val="20"/>
+        </w:rPr>
+        <w:t>/</w:t>
+      </w:r>
+      <w:proofErr w:type="spellStart"/>
+      <w:r>
+        <w:rPr>
+          <w:rFonts w:ascii="Consolas" w:eastAsia="Consolas" w:hAnsi="Consolas" w:cs="Consolas"/>
+          <w:color w:val="2C3E50"/>
+          <w:sz w:val="20"/>
+          <w:szCs w:val="20"/>
+        </w:rPr>
+        <w:t>models</w:t>
+      </w:r>
+      <w:proofErr w:type="spellEnd"/>
+      <w:r>
+        <w:rPr>
+          <w:rFonts w:ascii="Consolas" w:eastAsia="Consolas" w:hAnsi="Consolas" w:cs="Consolas"/>
+          <w:color w:val="2C3E50"/>
+          <w:sz w:val="20"/>
+          <w:szCs w:val="20"/>
+        </w:rPr>
+        <w:t>/model_info.txt</w:t>
       </w:r>
     </w:p>
     <w:p>
@@ -2147,6 +2738,7 @@
         <w:spacing w:after="120"/>
         <w:ind w:left="200" w:right="200"/>
       </w:pPr>
+      <w:proofErr w:type="spellStart"/>
       <w:proofErr w:type="gramStart"/>
       <w:r>
         <w:rPr>
@@ -2157,6 +2749,7 @@
         </w:rPr>
         <w:t>tree</w:t>
       </w:r>
+      <w:proofErr w:type="spellEnd"/>
       <w:proofErr w:type="gramEnd"/>
       <w:r>
         <w:rPr>
@@ -2165,8 +2758,19 @@
           <w:sz w:val="20"/>
           <w:szCs w:val="20"/>
         </w:rPr>
-        <w:t xml:space="preserve"> IA_Project</w:t>
-      </w:r>
+        <w:t xml:space="preserve"> </w:t>
+      </w:r>
+      <w:proofErr w:type="spellStart"/>
+      <w:r>
+        <w:rPr>
+          <w:rFonts w:ascii="Consolas" w:eastAsia="Consolas" w:hAnsi="Consolas" w:cs="Consolas"/>
+          <w:color w:val="2C3E50"/>
+          <w:sz w:val="20"/>
+          <w:szCs w:val="20"/>
+        </w:rPr>
+        <w:t>IA_Project</w:t>
+      </w:r>
+      <w:proofErr w:type="spellEnd"/>
     </w:p>
     <w:p>
       <w:pPr>
@@ -2178,7 +2782,49 @@
           <w:color w:val="000000"/>
         </w:rPr>
         <w:lastRenderedPageBreak/>
-        <w:t>Rappel : mkdir -p crée un dossier et ses parents ; touch crée un fichier vide ; tree affiche l'arborescence.</w:t>
+        <w:t xml:space="preserve">Rappel : </w:t>
+      </w:r>
+      <w:proofErr w:type="spellStart"/>
+      <w:r>
+        <w:rPr>
+          <w:color w:val="000000"/>
+        </w:rPr>
+        <w:t>mkdir</w:t>
+      </w:r>
+      <w:proofErr w:type="spellEnd"/>
+      <w:r>
+        <w:rPr>
+          <w:color w:val="000000"/>
+        </w:rPr>
+        <w:t xml:space="preserve"> -p crée un dossier et ses parents ; </w:t>
+      </w:r>
+      <w:proofErr w:type="spellStart"/>
+      <w:r>
+        <w:rPr>
+          <w:color w:val="000000"/>
+        </w:rPr>
+        <w:t>touch</w:t>
+      </w:r>
+      <w:proofErr w:type="spellEnd"/>
+      <w:r>
+        <w:rPr>
+          <w:color w:val="000000"/>
+        </w:rPr>
+        <w:t xml:space="preserve"> crée un fichier vide ; </w:t>
+      </w:r>
+      <w:proofErr w:type="spellStart"/>
+      <w:r>
+        <w:rPr>
+          <w:color w:val="000000"/>
+        </w:rPr>
+        <w:t>tree</w:t>
+      </w:r>
+      <w:proofErr w:type="spellEnd"/>
+      <w:r>
+        <w:rPr>
+          <w:color w:val="000000"/>
+        </w:rPr>
+        <w:t xml:space="preserve"> affiche l'arborescence.</w:t>
       </w:r>
     </w:p>
     <w:p>
@@ -2301,7 +2947,29 @@
           <w:sz w:val="20"/>
           <w:szCs w:val="20"/>
         </w:rPr>
-        <w:t xml:space="preserve"> IA_Project (7 dossiers, 11 fichiers)</w:t>
+        <w:t xml:space="preserve"> </w:t>
+      </w:r>
+      <w:proofErr w:type="spellStart"/>
+      <w:r>
+        <w:rPr>
+          <w:i/>
+          <w:iCs/>
+          <w:color w:val="7F8C8D"/>
+          <w:sz w:val="20"/>
+          <w:szCs w:val="20"/>
+        </w:rPr>
+        <w:t>IA_Project</w:t>
+      </w:r>
+      <w:proofErr w:type="spellEnd"/>
+      <w:r>
+        <w:rPr>
+          <w:i/>
+          <w:iCs/>
+          <w:color w:val="7F8C8D"/>
+          <w:sz w:val="20"/>
+          <w:szCs w:val="20"/>
+        </w:rPr>
+        <w:t xml:space="preserve"> (7 dossiers, 11 fichiers)</w:t>
       </w:r>
     </w:p>
     <w:p>
@@ -2395,6 +3063,7 @@
         <w:shd w:val="clear" w:color="auto" w:fill="ECF0F1"/>
         <w:ind w:left="200" w:right="200"/>
       </w:pPr>
+      <w:proofErr w:type="spellStart"/>
       <w:proofErr w:type="gramStart"/>
       <w:r>
         <w:rPr>
@@ -2405,6 +3074,7 @@
         </w:rPr>
         <w:t>head</w:t>
       </w:r>
+      <w:proofErr w:type="spellEnd"/>
       <w:proofErr w:type="gramEnd"/>
       <w:r>
         <w:rPr>
@@ -2424,6 +3094,7 @@
         <w:shd w:val="clear" w:color="auto" w:fill="ECF0F1"/>
         <w:ind w:left="200" w:right="200"/>
       </w:pPr>
+      <w:proofErr w:type="spellStart"/>
       <w:proofErr w:type="gramStart"/>
       <w:r>
         <w:rPr>
@@ -2434,6 +3105,7 @@
         </w:rPr>
         <w:t>tail</w:t>
       </w:r>
+      <w:proofErr w:type="spellEnd"/>
       <w:proofErr w:type="gramEnd"/>
       <w:r>
         <w:rPr>
@@ -2453,6 +3125,7 @@
         <w:shd w:val="clear" w:color="auto" w:fill="ECF0F1"/>
         <w:ind w:left="200" w:right="200"/>
       </w:pPr>
+      <w:proofErr w:type="spellStart"/>
       <w:proofErr w:type="gramStart"/>
       <w:r>
         <w:rPr>
@@ -2464,6 +3137,7 @@
         <w:lastRenderedPageBreak/>
         <w:t>wc</w:t>
       </w:r>
+      <w:proofErr w:type="spellEnd"/>
       <w:proofErr w:type="gramEnd"/>
       <w:r>
         <w:rPr>
@@ -2483,6 +3157,7 @@
         <w:shd w:val="clear" w:color="auto" w:fill="ECF0F1"/>
         <w:ind w:left="200" w:right="200"/>
       </w:pPr>
+      <w:proofErr w:type="spellStart"/>
       <w:proofErr w:type="gramStart"/>
       <w:r>
         <w:rPr>
@@ -2493,6 +3168,7 @@
         </w:rPr>
         <w:t>grep</w:t>
       </w:r>
+      <w:proofErr w:type="spellEnd"/>
       <w:proofErr w:type="gramEnd"/>
       <w:r>
         <w:rPr>
@@ -2512,6 +3188,7 @@
         <w:shd w:val="clear" w:color="auto" w:fill="ECF0F1"/>
         <w:ind w:left="200" w:right="200"/>
       </w:pPr>
+      <w:proofErr w:type="spellStart"/>
       <w:proofErr w:type="gramStart"/>
       <w:r>
         <w:rPr>
@@ -2522,6 +3199,7 @@
         </w:rPr>
         <w:t>cp</w:t>
       </w:r>
+      <w:proofErr w:type="spellEnd"/>
       <w:proofErr w:type="gramEnd"/>
       <w:r>
         <w:rPr>
@@ -2530,7 +3208,27 @@
           <w:sz w:val="20"/>
           <w:szCs w:val="20"/>
         </w:rPr>
-        <w:t xml:space="preserve"> train.csv datasets/clean/  # copier</w:t>
+        <w:t xml:space="preserve"> train.csv </w:t>
+      </w:r>
+      <w:proofErr w:type="spellStart"/>
+      <w:r>
+        <w:rPr>
+          <w:rFonts w:ascii="Consolas" w:eastAsia="Consolas" w:hAnsi="Consolas" w:cs="Consolas"/>
+          <w:color w:val="2C3E50"/>
+          <w:sz w:val="20"/>
+          <w:szCs w:val="20"/>
+        </w:rPr>
+        <w:t>datasets</w:t>
+      </w:r>
+      <w:proofErr w:type="spellEnd"/>
+      <w:r>
+        <w:rPr>
+          <w:rFonts w:ascii="Consolas" w:eastAsia="Consolas" w:hAnsi="Consolas" w:cs="Consolas"/>
+          <w:color w:val="2C3E50"/>
+          <w:sz w:val="20"/>
+          <w:szCs w:val="20"/>
+        </w:rPr>
+        <w:t>/clean/  # copier</w:t>
       </w:r>
     </w:p>
     <w:p>
@@ -2570,6 +3268,7 @@
         <w:shd w:val="clear" w:color="auto" w:fill="ECF0F1"/>
         <w:ind w:left="200" w:right="200"/>
       </w:pPr>
+      <w:proofErr w:type="spellStart"/>
       <w:proofErr w:type="gramStart"/>
       <w:r>
         <w:rPr>
@@ -2580,6 +3279,7 @@
         </w:rPr>
         <w:t>rm</w:t>
       </w:r>
+      <w:proofErr w:type="spellEnd"/>
       <w:proofErr w:type="gramEnd"/>
       <w:r>
         <w:rPr>
@@ -2599,6 +3299,7 @@
         <w:shd w:val="clear" w:color="auto" w:fill="ECF0F1"/>
         <w:ind w:left="200" w:right="200"/>
       </w:pPr>
+      <w:proofErr w:type="spellStart"/>
       <w:proofErr w:type="gramStart"/>
       <w:r>
         <w:rPr>
@@ -2607,7 +3308,17 @@
           <w:sz w:val="20"/>
           <w:szCs w:val="20"/>
         </w:rPr>
-        <w:t>find .</w:t>
+        <w:t>find</w:t>
+      </w:r>
+      <w:proofErr w:type="spellEnd"/>
+      <w:r>
+        <w:rPr>
+          <w:rFonts w:ascii="Consolas" w:eastAsia="Consolas" w:hAnsi="Consolas" w:cs="Consolas"/>
+          <w:color w:val="2C3E50"/>
+          <w:sz w:val="20"/>
+          <w:szCs w:val="20"/>
+        </w:rPr>
+        <w:t xml:space="preserve"> .</w:t>
       </w:r>
       <w:proofErr w:type="gramEnd"/>
       <w:r>
@@ -2617,7 +3328,27 @@
           <w:sz w:val="20"/>
           <w:szCs w:val="20"/>
         </w:rPr>
-        <w:t xml:space="preserve"> -name '*.csv'          # rechercher des fichiers</w:t>
+        <w:t xml:space="preserve"> -</w:t>
+      </w:r>
+      <w:proofErr w:type="spellStart"/>
+      <w:r>
+        <w:rPr>
+          <w:rFonts w:ascii="Consolas" w:eastAsia="Consolas" w:hAnsi="Consolas" w:cs="Consolas"/>
+          <w:color w:val="2C3E50"/>
+          <w:sz w:val="20"/>
+          <w:szCs w:val="20"/>
+        </w:rPr>
+        <w:t>name</w:t>
+      </w:r>
+      <w:proofErr w:type="spellEnd"/>
+      <w:r>
+        <w:rPr>
+          <w:rFonts w:ascii="Consolas" w:eastAsia="Consolas" w:hAnsi="Consolas" w:cs="Consolas"/>
+          <w:color w:val="2C3E50"/>
+          <w:sz w:val="20"/>
+          <w:szCs w:val="20"/>
+        </w:rPr>
+        <w:t xml:space="preserve"> '*.csv'          # rechercher des fichiers</w:t>
       </w:r>
     </w:p>
     <w:p>
@@ -2646,7 +3377,27 @@
           <w:sz w:val="20"/>
           <w:szCs w:val="20"/>
         </w:rPr>
-        <w:t xml:space="preserve"> -lS                         # trier par taille</w:t>
+        <w:t xml:space="preserve"> -</w:t>
+      </w:r>
+      <w:proofErr w:type="spellStart"/>
+      <w:r>
+        <w:rPr>
+          <w:rFonts w:ascii="Consolas" w:eastAsia="Consolas" w:hAnsi="Consolas" w:cs="Consolas"/>
+          <w:color w:val="2C3E50"/>
+          <w:sz w:val="20"/>
+          <w:szCs w:val="20"/>
+        </w:rPr>
+        <w:t>lS</w:t>
+      </w:r>
+      <w:proofErr w:type="spellEnd"/>
+      <w:r>
+        <w:rPr>
+          <w:rFonts w:ascii="Consolas" w:eastAsia="Consolas" w:hAnsi="Consolas" w:cs="Consolas"/>
+          <w:color w:val="2C3E50"/>
+          <w:sz w:val="20"/>
+          <w:szCs w:val="20"/>
+        </w:rPr>
+        <w:t xml:space="preserve">                         # trier par taille</w:t>
       </w:r>
     </w:p>
     <w:p>
@@ -2686,6 +3437,7 @@
         <w:shd w:val="clear" w:color="auto" w:fill="ECF0F1"/>
         <w:ind w:left="200" w:right="200"/>
       </w:pPr>
+      <w:proofErr w:type="spellStart"/>
       <w:proofErr w:type="gramStart"/>
       <w:r>
         <w:rPr>
@@ -2696,6 +3448,7 @@
         </w:rPr>
         <w:t>grep</w:t>
       </w:r>
+      <w:proofErr w:type="spellEnd"/>
       <w:proofErr w:type="gramEnd"/>
       <w:r>
         <w:rPr>
@@ -2704,7 +3457,27 @@
           <w:sz w:val="20"/>
           <w:szCs w:val="20"/>
         </w:rPr>
-        <w:t xml:space="preserve"> Loss training.log &gt; loss.log                 # extraire</w:t>
+        <w:t xml:space="preserve"> </w:t>
+      </w:r>
+      <w:proofErr w:type="spellStart"/>
+      <w:r>
+        <w:rPr>
+          <w:rFonts w:ascii="Consolas" w:eastAsia="Consolas" w:hAnsi="Consolas" w:cs="Consolas"/>
+          <w:color w:val="2C3E50"/>
+          <w:sz w:val="20"/>
+          <w:szCs w:val="20"/>
+        </w:rPr>
+        <w:t>Loss</w:t>
+      </w:r>
+      <w:proofErr w:type="spellEnd"/>
+      <w:r>
+        <w:rPr>
+          <w:rFonts w:ascii="Consolas" w:eastAsia="Consolas" w:hAnsi="Consolas" w:cs="Consolas"/>
+          <w:color w:val="2C3E50"/>
+          <w:sz w:val="20"/>
+          <w:szCs w:val="20"/>
+        </w:rPr>
+        <w:t xml:space="preserve"> training.log &gt; loss.log                 # extraire</w:t>
       </w:r>
     </w:p>
     <w:p>
@@ -2734,7 +3507,47 @@
           <w:sz w:val="20"/>
           <w:szCs w:val="20"/>
         </w:rPr>
-        <w:t xml:space="preserve"> -czf backup/projet_IA.tar.gz IA_Project       # archiver</w:t>
+        <w:t xml:space="preserve"> -</w:t>
+      </w:r>
+      <w:proofErr w:type="spellStart"/>
+      <w:r>
+        <w:rPr>
+          <w:rFonts w:ascii="Consolas" w:eastAsia="Consolas" w:hAnsi="Consolas" w:cs="Consolas"/>
+          <w:color w:val="2C3E50"/>
+          <w:sz w:val="20"/>
+          <w:szCs w:val="20"/>
+        </w:rPr>
+        <w:t>czf</w:t>
+      </w:r>
+      <w:proofErr w:type="spellEnd"/>
+      <w:r>
+        <w:rPr>
+          <w:rFonts w:ascii="Consolas" w:eastAsia="Consolas" w:hAnsi="Consolas" w:cs="Consolas"/>
+          <w:color w:val="2C3E50"/>
+          <w:sz w:val="20"/>
+          <w:szCs w:val="20"/>
+        </w:rPr>
+        <w:t xml:space="preserve"> backup/projet_IA.tar.gz </w:t>
+      </w:r>
+      <w:proofErr w:type="spellStart"/>
+      <w:r>
+        <w:rPr>
+          <w:rFonts w:ascii="Consolas" w:eastAsia="Consolas" w:hAnsi="Consolas" w:cs="Consolas"/>
+          <w:color w:val="2C3E50"/>
+          <w:sz w:val="20"/>
+          <w:szCs w:val="20"/>
+        </w:rPr>
+        <w:t>IA_Project</w:t>
+      </w:r>
+      <w:proofErr w:type="spellEnd"/>
+      <w:r>
+        <w:rPr>
+          <w:rFonts w:ascii="Consolas" w:eastAsia="Consolas" w:hAnsi="Consolas" w:cs="Consolas"/>
+          <w:color w:val="2C3E50"/>
+          <w:sz w:val="20"/>
+          <w:szCs w:val="20"/>
+        </w:rPr>
+        <w:t xml:space="preserve">       # archiver</w:t>
       </w:r>
     </w:p>
     <w:p>
@@ -3026,6 +3839,7 @@
           </wp:inline>
         </w:drawing>
       </w:r>
+      <w:proofErr w:type="spellStart"/>
       <w:r>
         <w:rPr>
           <w:i/>
@@ -3034,7 +3848,18 @@
           <w:sz w:val="16"/>
           <w:szCs w:val="16"/>
         </w:rPr>
-        <w:t>uis supprimer ce texte)</w:t>
+        <w:t>uis</w:t>
+      </w:r>
+      <w:proofErr w:type="spellEnd"/>
+      <w:r>
+        <w:rPr>
+          <w:i/>
+          <w:iCs/>
+          <w:color w:val="7F8C8D"/>
+          <w:sz w:val="16"/>
+          <w:szCs w:val="16"/>
+        </w:rPr>
+        <w:t xml:space="preserve"> supprimer ce texte)</w:t>
       </w:r>
       <w:r>
         <w:rPr>
@@ -3137,6 +3962,7 @@
         <w:spacing w:before="40"/>
         <w:ind w:left="200" w:right="200"/>
       </w:pPr>
+      <w:proofErr w:type="spellStart"/>
       <w:proofErr w:type="gramStart"/>
       <w:r>
         <w:rPr>
@@ -3147,6 +3973,7 @@
         </w:rPr>
         <w:t>sudo</w:t>
       </w:r>
+      <w:proofErr w:type="spellEnd"/>
       <w:proofErr w:type="gramEnd"/>
       <w:r>
         <w:rPr>
@@ -3155,7 +3982,47 @@
           <w:sz w:val="20"/>
           <w:szCs w:val="20"/>
         </w:rPr>
-        <w:t xml:space="preserve"> useradd -m alice          # créer un utilisateur avec son dossier personnel</w:t>
+        <w:t xml:space="preserve"> </w:t>
+      </w:r>
+      <w:proofErr w:type="spellStart"/>
+      <w:r>
+        <w:rPr>
+          <w:rFonts w:ascii="Consolas" w:eastAsia="Consolas" w:hAnsi="Consolas" w:cs="Consolas"/>
+          <w:color w:val="2C3E50"/>
+          <w:sz w:val="20"/>
+          <w:szCs w:val="20"/>
+        </w:rPr>
+        <w:t>useradd</w:t>
+      </w:r>
+      <w:proofErr w:type="spellEnd"/>
+      <w:r>
+        <w:rPr>
+          <w:rFonts w:ascii="Consolas" w:eastAsia="Consolas" w:hAnsi="Consolas" w:cs="Consolas"/>
+          <w:color w:val="2C3E50"/>
+          <w:sz w:val="20"/>
+          <w:szCs w:val="20"/>
+        </w:rPr>
+        <w:t xml:space="preserve"> -m </w:t>
+      </w:r>
+      <w:proofErr w:type="spellStart"/>
+      <w:r>
+        <w:rPr>
+          <w:rFonts w:ascii="Consolas" w:eastAsia="Consolas" w:hAnsi="Consolas" w:cs="Consolas"/>
+          <w:color w:val="2C3E50"/>
+          <w:sz w:val="20"/>
+          <w:szCs w:val="20"/>
+        </w:rPr>
+        <w:t>alice</w:t>
+      </w:r>
+      <w:proofErr w:type="spellEnd"/>
+      <w:r>
+        <w:rPr>
+          <w:rFonts w:ascii="Consolas" w:eastAsia="Consolas" w:hAnsi="Consolas" w:cs="Consolas"/>
+          <w:color w:val="2C3E50"/>
+          <w:sz w:val="20"/>
+          <w:szCs w:val="20"/>
+        </w:rPr>
+        <w:t xml:space="preserve">          # créer un utilisateur avec son dossier personnel</w:t>
       </w:r>
     </w:p>
     <w:p>
@@ -3166,6 +4033,7 @@
         <w:shd w:val="clear" w:color="auto" w:fill="ECF0F1"/>
         <w:ind w:left="200" w:right="200"/>
       </w:pPr>
+      <w:proofErr w:type="spellStart"/>
       <w:proofErr w:type="gramStart"/>
       <w:r>
         <w:rPr>
@@ -3176,6 +4044,7 @@
         </w:rPr>
         <w:t>sudo</w:t>
       </w:r>
+      <w:proofErr w:type="spellEnd"/>
       <w:proofErr w:type="gramEnd"/>
       <w:r>
         <w:rPr>
@@ -3184,7 +4053,47 @@
           <w:sz w:val="20"/>
           <w:szCs w:val="20"/>
         </w:rPr>
-        <w:t xml:space="preserve"> passwd alice              # définir un mot de passe</w:t>
+        <w:t xml:space="preserve"> </w:t>
+      </w:r>
+      <w:proofErr w:type="spellStart"/>
+      <w:r>
+        <w:rPr>
+          <w:rFonts w:ascii="Consolas" w:eastAsia="Consolas" w:hAnsi="Consolas" w:cs="Consolas"/>
+          <w:color w:val="2C3E50"/>
+          <w:sz w:val="20"/>
+          <w:szCs w:val="20"/>
+        </w:rPr>
+        <w:t>passwd</w:t>
+      </w:r>
+      <w:proofErr w:type="spellEnd"/>
+      <w:r>
+        <w:rPr>
+          <w:rFonts w:ascii="Consolas" w:eastAsia="Consolas" w:hAnsi="Consolas" w:cs="Consolas"/>
+          <w:color w:val="2C3E50"/>
+          <w:sz w:val="20"/>
+          <w:szCs w:val="20"/>
+        </w:rPr>
+        <w:t xml:space="preserve"> </w:t>
+      </w:r>
+      <w:proofErr w:type="spellStart"/>
+      <w:r>
+        <w:rPr>
+          <w:rFonts w:ascii="Consolas" w:eastAsia="Consolas" w:hAnsi="Consolas" w:cs="Consolas"/>
+          <w:color w:val="2C3E50"/>
+          <w:sz w:val="20"/>
+          <w:szCs w:val="20"/>
+        </w:rPr>
+        <w:t>alice</w:t>
+      </w:r>
+      <w:proofErr w:type="spellEnd"/>
+      <w:r>
+        <w:rPr>
+          <w:rFonts w:ascii="Consolas" w:eastAsia="Consolas" w:hAnsi="Consolas" w:cs="Consolas"/>
+          <w:color w:val="2C3E50"/>
+          <w:sz w:val="20"/>
+          <w:szCs w:val="20"/>
+        </w:rPr>
+        <w:t xml:space="preserve">              # définir un mot de passe</w:t>
       </w:r>
     </w:p>
     <w:p>
@@ -3213,7 +4122,27 @@
           <w:sz w:val="20"/>
           <w:szCs w:val="20"/>
         </w:rPr>
-        <w:t xml:space="preserve"> alice                       # afficher UID et groupes</w:t>
+        <w:t xml:space="preserve"> </w:t>
+      </w:r>
+      <w:proofErr w:type="spellStart"/>
+      <w:r>
+        <w:rPr>
+          <w:rFonts w:ascii="Consolas" w:eastAsia="Consolas" w:hAnsi="Consolas" w:cs="Consolas"/>
+          <w:color w:val="2C3E50"/>
+          <w:sz w:val="20"/>
+          <w:szCs w:val="20"/>
+        </w:rPr>
+        <w:t>alice</w:t>
+      </w:r>
+      <w:proofErr w:type="spellEnd"/>
+      <w:r>
+        <w:rPr>
+          <w:rFonts w:ascii="Consolas" w:eastAsia="Consolas" w:hAnsi="Consolas" w:cs="Consolas"/>
+          <w:color w:val="2C3E50"/>
+          <w:sz w:val="20"/>
+          <w:szCs w:val="20"/>
+        </w:rPr>
+        <w:t xml:space="preserve">                       # afficher UID et groupes</w:t>
       </w:r>
     </w:p>
     <w:p>
@@ -3224,6 +4153,7 @@
         <w:shd w:val="clear" w:color="auto" w:fill="ECF0F1"/>
         <w:ind w:left="200" w:right="200"/>
       </w:pPr>
+      <w:proofErr w:type="spellStart"/>
       <w:proofErr w:type="gramStart"/>
       <w:r>
         <w:rPr>
@@ -3234,6 +4164,7 @@
         </w:rPr>
         <w:t>sudo</w:t>
       </w:r>
+      <w:proofErr w:type="spellEnd"/>
       <w:proofErr w:type="gramEnd"/>
       <w:r>
         <w:rPr>
@@ -3242,7 +4173,27 @@
           <w:sz w:val="20"/>
           <w:szCs w:val="20"/>
         </w:rPr>
-        <w:t xml:space="preserve"> groupadd data             # créer un groupe</w:t>
+        <w:t xml:space="preserve"> </w:t>
+      </w:r>
+      <w:proofErr w:type="spellStart"/>
+      <w:r>
+        <w:rPr>
+          <w:rFonts w:ascii="Consolas" w:eastAsia="Consolas" w:hAnsi="Consolas" w:cs="Consolas"/>
+          <w:color w:val="2C3E50"/>
+          <w:sz w:val="20"/>
+          <w:szCs w:val="20"/>
+        </w:rPr>
+        <w:t>groupadd</w:t>
+      </w:r>
+      <w:proofErr w:type="spellEnd"/>
+      <w:r>
+        <w:rPr>
+          <w:rFonts w:ascii="Consolas" w:eastAsia="Consolas" w:hAnsi="Consolas" w:cs="Consolas"/>
+          <w:color w:val="2C3E50"/>
+          <w:sz w:val="20"/>
+          <w:szCs w:val="20"/>
+        </w:rPr>
+        <w:t xml:space="preserve"> data             # créer un groupe</w:t>
       </w:r>
     </w:p>
     <w:p>
@@ -3253,6 +4204,7 @@
         <w:shd w:val="clear" w:color="auto" w:fill="ECF0F1"/>
         <w:ind w:left="200" w:right="200"/>
       </w:pPr>
+      <w:proofErr w:type="spellStart"/>
       <w:proofErr w:type="gramStart"/>
       <w:r>
         <w:rPr>
@@ -3263,6 +4215,7 @@
         </w:rPr>
         <w:t>sudo</w:t>
       </w:r>
+      <w:proofErr w:type="spellEnd"/>
       <w:proofErr w:type="gramEnd"/>
       <w:r>
         <w:rPr>
@@ -3271,7 +4224,67 @@
           <w:sz w:val="20"/>
           <w:szCs w:val="20"/>
         </w:rPr>
-        <w:t xml:space="preserve"> usermod -aG data alice    # ajouter l'utilisateur à un groupe</w:t>
+        <w:t xml:space="preserve"> </w:t>
+      </w:r>
+      <w:proofErr w:type="spellStart"/>
+      <w:r>
+        <w:rPr>
+          <w:rFonts w:ascii="Consolas" w:eastAsia="Consolas" w:hAnsi="Consolas" w:cs="Consolas"/>
+          <w:color w:val="2C3E50"/>
+          <w:sz w:val="20"/>
+          <w:szCs w:val="20"/>
+        </w:rPr>
+        <w:t>usermod</w:t>
+      </w:r>
+      <w:proofErr w:type="spellEnd"/>
+      <w:r>
+        <w:rPr>
+          <w:rFonts w:ascii="Consolas" w:eastAsia="Consolas" w:hAnsi="Consolas" w:cs="Consolas"/>
+          <w:color w:val="2C3E50"/>
+          <w:sz w:val="20"/>
+          <w:szCs w:val="20"/>
+        </w:rPr>
+        <w:t xml:space="preserve"> -</w:t>
+      </w:r>
+      <w:proofErr w:type="spellStart"/>
+      <w:r>
+        <w:rPr>
+          <w:rFonts w:ascii="Consolas" w:eastAsia="Consolas" w:hAnsi="Consolas" w:cs="Consolas"/>
+          <w:color w:val="2C3E50"/>
+          <w:sz w:val="20"/>
+          <w:szCs w:val="20"/>
+        </w:rPr>
+        <w:t>aG</w:t>
+      </w:r>
+      <w:proofErr w:type="spellEnd"/>
+      <w:r>
+        <w:rPr>
+          <w:rFonts w:ascii="Consolas" w:eastAsia="Consolas" w:hAnsi="Consolas" w:cs="Consolas"/>
+          <w:color w:val="2C3E50"/>
+          <w:sz w:val="20"/>
+          <w:szCs w:val="20"/>
+        </w:rPr>
+        <w:t xml:space="preserve"> data </w:t>
+      </w:r>
+      <w:proofErr w:type="spellStart"/>
+      <w:r>
+        <w:rPr>
+          <w:rFonts w:ascii="Consolas" w:eastAsia="Consolas" w:hAnsi="Consolas" w:cs="Consolas"/>
+          <w:color w:val="2C3E50"/>
+          <w:sz w:val="20"/>
+          <w:szCs w:val="20"/>
+        </w:rPr>
+        <w:t>alice</w:t>
+      </w:r>
+      <w:proofErr w:type="spellEnd"/>
+      <w:r>
+        <w:rPr>
+          <w:rFonts w:ascii="Consolas" w:eastAsia="Consolas" w:hAnsi="Consolas" w:cs="Consolas"/>
+          <w:color w:val="2C3E50"/>
+          <w:sz w:val="20"/>
+          <w:szCs w:val="20"/>
+        </w:rPr>
+        <w:t xml:space="preserve">    # ajouter l'utilisateur à un groupe</w:t>
       </w:r>
     </w:p>
     <w:p>
@@ -3282,6 +4295,7 @@
         <w:shd w:val="clear" w:color="auto" w:fill="ECF0F1"/>
         <w:ind w:left="200" w:right="200"/>
       </w:pPr>
+      <w:proofErr w:type="spellStart"/>
       <w:proofErr w:type="gramStart"/>
       <w:r>
         <w:rPr>
@@ -3293,6 +4307,7 @@
         <w:lastRenderedPageBreak/>
         <w:t>sudo</w:t>
       </w:r>
+      <w:proofErr w:type="spellEnd"/>
       <w:proofErr w:type="gramEnd"/>
       <w:r>
         <w:rPr>
@@ -3301,7 +4316,67 @@
           <w:sz w:val="20"/>
           <w:szCs w:val="20"/>
         </w:rPr>
-        <w:t xml:space="preserve"> chown alice datasets      # changer le propriétaire</w:t>
+        <w:t xml:space="preserve"> </w:t>
+      </w:r>
+      <w:proofErr w:type="spellStart"/>
+      <w:r>
+        <w:rPr>
+          <w:rFonts w:ascii="Consolas" w:eastAsia="Consolas" w:hAnsi="Consolas" w:cs="Consolas"/>
+          <w:color w:val="2C3E50"/>
+          <w:sz w:val="20"/>
+          <w:szCs w:val="20"/>
+        </w:rPr>
+        <w:t>chown</w:t>
+      </w:r>
+      <w:proofErr w:type="spellEnd"/>
+      <w:r>
+        <w:rPr>
+          <w:rFonts w:ascii="Consolas" w:eastAsia="Consolas" w:hAnsi="Consolas" w:cs="Consolas"/>
+          <w:color w:val="2C3E50"/>
+          <w:sz w:val="20"/>
+          <w:szCs w:val="20"/>
+        </w:rPr>
+        <w:t xml:space="preserve"> </w:t>
+      </w:r>
+      <w:proofErr w:type="spellStart"/>
+      <w:r>
+        <w:rPr>
+          <w:rFonts w:ascii="Consolas" w:eastAsia="Consolas" w:hAnsi="Consolas" w:cs="Consolas"/>
+          <w:color w:val="2C3E50"/>
+          <w:sz w:val="20"/>
+          <w:szCs w:val="20"/>
+        </w:rPr>
+        <w:t>alice</w:t>
+      </w:r>
+      <w:proofErr w:type="spellEnd"/>
+      <w:r>
+        <w:rPr>
+          <w:rFonts w:ascii="Consolas" w:eastAsia="Consolas" w:hAnsi="Consolas" w:cs="Consolas"/>
+          <w:color w:val="2C3E50"/>
+          <w:sz w:val="20"/>
+          <w:szCs w:val="20"/>
+        </w:rPr>
+        <w:t xml:space="preserve"> </w:t>
+      </w:r>
+      <w:proofErr w:type="spellStart"/>
+      <w:r>
+        <w:rPr>
+          <w:rFonts w:ascii="Consolas" w:eastAsia="Consolas" w:hAnsi="Consolas" w:cs="Consolas"/>
+          <w:color w:val="2C3E50"/>
+          <w:sz w:val="20"/>
+          <w:szCs w:val="20"/>
+        </w:rPr>
+        <w:t>datasets</w:t>
+      </w:r>
+      <w:proofErr w:type="spellEnd"/>
+      <w:r>
+        <w:rPr>
+          <w:rFonts w:ascii="Consolas" w:eastAsia="Consolas" w:hAnsi="Consolas" w:cs="Consolas"/>
+          <w:color w:val="2C3E50"/>
+          <w:sz w:val="20"/>
+          <w:szCs w:val="20"/>
+        </w:rPr>
+        <w:t xml:space="preserve">      # changer le propriétaire</w:t>
       </w:r>
     </w:p>
     <w:p>
@@ -3312,6 +4387,7 @@
         <w:shd w:val="clear" w:color="auto" w:fill="ECF0F1"/>
         <w:ind w:left="200" w:right="200"/>
       </w:pPr>
+      <w:proofErr w:type="spellStart"/>
       <w:proofErr w:type="gramStart"/>
       <w:r>
         <w:rPr>
@@ -3322,6 +4398,7 @@
         </w:rPr>
         <w:t>sudo</w:t>
       </w:r>
+      <w:proofErr w:type="spellEnd"/>
       <w:proofErr w:type="gramEnd"/>
       <w:r>
         <w:rPr>
@@ -3330,7 +4407,47 @@
           <w:sz w:val="20"/>
           <w:szCs w:val="20"/>
         </w:rPr>
-        <w:t xml:space="preserve"> chgrp data datasets       # changer le groupe</w:t>
+        <w:t xml:space="preserve"> </w:t>
+      </w:r>
+      <w:proofErr w:type="spellStart"/>
+      <w:r>
+        <w:rPr>
+          <w:rFonts w:ascii="Consolas" w:eastAsia="Consolas" w:hAnsi="Consolas" w:cs="Consolas"/>
+          <w:color w:val="2C3E50"/>
+          <w:sz w:val="20"/>
+          <w:szCs w:val="20"/>
+        </w:rPr>
+        <w:t>chgrp</w:t>
+      </w:r>
+      <w:proofErr w:type="spellEnd"/>
+      <w:r>
+        <w:rPr>
+          <w:rFonts w:ascii="Consolas" w:eastAsia="Consolas" w:hAnsi="Consolas" w:cs="Consolas"/>
+          <w:color w:val="2C3E50"/>
+          <w:sz w:val="20"/>
+          <w:szCs w:val="20"/>
+        </w:rPr>
+        <w:t xml:space="preserve"> data </w:t>
+      </w:r>
+      <w:proofErr w:type="spellStart"/>
+      <w:r>
+        <w:rPr>
+          <w:rFonts w:ascii="Consolas" w:eastAsia="Consolas" w:hAnsi="Consolas" w:cs="Consolas"/>
+          <w:color w:val="2C3E50"/>
+          <w:sz w:val="20"/>
+          <w:szCs w:val="20"/>
+        </w:rPr>
+        <w:t>datasets</w:t>
+      </w:r>
+      <w:proofErr w:type="spellEnd"/>
+      <w:r>
+        <w:rPr>
+          <w:rFonts w:ascii="Consolas" w:eastAsia="Consolas" w:hAnsi="Consolas" w:cs="Consolas"/>
+          <w:color w:val="2C3E50"/>
+          <w:sz w:val="20"/>
+          <w:szCs w:val="20"/>
+        </w:rPr>
+        <w:t xml:space="preserve">       # changer le groupe</w:t>
       </w:r>
     </w:p>
     <w:p>
@@ -3342,6 +4459,7 @@
         <w:spacing w:after="120"/>
         <w:ind w:left="200" w:right="200"/>
       </w:pPr>
+      <w:proofErr w:type="spellStart"/>
       <w:proofErr w:type="gramStart"/>
       <w:r>
         <w:rPr>
@@ -3352,6 +4470,7 @@
         </w:rPr>
         <w:t>sudo</w:t>
       </w:r>
+      <w:proofErr w:type="spellEnd"/>
       <w:proofErr w:type="gramEnd"/>
       <w:r>
         <w:rPr>
@@ -3360,7 +4479,47 @@
           <w:sz w:val="20"/>
           <w:szCs w:val="20"/>
         </w:rPr>
-        <w:t xml:space="preserve"> chmod 770 datasets        # attribuer les droits (rwxrwx---)</w:t>
+        <w:t xml:space="preserve"> chmod 770 </w:t>
+      </w:r>
+      <w:proofErr w:type="spellStart"/>
+      <w:r>
+        <w:rPr>
+          <w:rFonts w:ascii="Consolas" w:eastAsia="Consolas" w:hAnsi="Consolas" w:cs="Consolas"/>
+          <w:color w:val="2C3E50"/>
+          <w:sz w:val="20"/>
+          <w:szCs w:val="20"/>
+        </w:rPr>
+        <w:t>datasets</w:t>
+      </w:r>
+      <w:proofErr w:type="spellEnd"/>
+      <w:r>
+        <w:rPr>
+          <w:rFonts w:ascii="Consolas" w:eastAsia="Consolas" w:hAnsi="Consolas" w:cs="Consolas"/>
+          <w:color w:val="2C3E50"/>
+          <w:sz w:val="20"/>
+          <w:szCs w:val="20"/>
+        </w:rPr>
+        <w:t xml:space="preserve">        # attribuer les droits (</w:t>
+      </w:r>
+      <w:proofErr w:type="spellStart"/>
+      <w:r>
+        <w:rPr>
+          <w:rFonts w:ascii="Consolas" w:eastAsia="Consolas" w:hAnsi="Consolas" w:cs="Consolas"/>
+          <w:color w:val="2C3E50"/>
+          <w:sz w:val="20"/>
+          <w:szCs w:val="20"/>
+        </w:rPr>
+        <w:t>rwxrwx</w:t>
+      </w:r>
+      <w:proofErr w:type="spellEnd"/>
+      <w:r>
+        <w:rPr>
+          <w:rFonts w:ascii="Consolas" w:eastAsia="Consolas" w:hAnsi="Consolas" w:cs="Consolas"/>
+          <w:color w:val="2C3E50"/>
+          <w:sz w:val="20"/>
+          <w:szCs w:val="20"/>
+        </w:rPr>
+        <w:t>---)</w:t>
       </w:r>
     </w:p>
     <w:p>
@@ -3486,7 +4645,6 @@
           <w:sz w:val="20"/>
           <w:szCs w:val="20"/>
         </w:rPr>
-        <w:lastRenderedPageBreak/>
         <w:drawing>
           <wp:inline distT="0" distB="0" distL="0" distR="0" wp14:anchorId="1BC4A6AA" wp14:editId="437AA0A3">
             <wp:extent cx="6036310" cy="3225800"/>
@@ -3533,6 +4691,7 @@
         <w:rPr>
           <w:noProof/>
         </w:rPr>
+        <w:lastRenderedPageBreak/>
         <w:drawing>
           <wp:inline distT="0" distB="0" distL="0" distR="0" wp14:anchorId="6BE504BA" wp14:editId="0FE05FF5">
             <wp:extent cx="6036310" cy="3204210"/>
@@ -3575,185 +4734,237 @@
           </wp:inline>
         </w:drawing>
       </w:r>
-    </w:p>
-    <w:p>
-      <w:pPr>
-        <w:pStyle w:val="Titre1"/>
-        <w:pBdr>
-          <w:bottom w:val="single" w:sz="12" w:space="6" w:color="2980B9"/>
-        </w:pBdr>
-        <w:spacing w:before="320" w:after="160"/>
-      </w:pPr>
-      <w:bookmarkStart w:id="9" w:name="_Toc236173585"/>
-      <w:r>
-        <w:rPr>
-          <w:b/>
-          <w:bCs/>
-          <w:color w:val="2C3E50"/>
-          <w:sz w:val="30"/>
-          <w:szCs w:val="30"/>
-        </w:rPr>
-        <w:t>Partie 4 : Installation des logiciels</w:t>
-      </w:r>
-      <w:bookmarkEnd w:id="9"/>
-    </w:p>
-    <w:p>
-      <w:pPr>
-        <w:spacing w:after="120" w:line="300" w:lineRule="auto"/>
-        <w:jc w:val="both"/>
-      </w:pPr>
-      <w:r>
-        <w:rPr>
-          <w:color w:val="000000"/>
-        </w:rPr>
-        <w:t>Objectif : installer les outils nécessaires puis télécharger un dataset depuis Internet.</w:t>
-      </w:r>
-    </w:p>
-    <w:p>
-      <w:pPr>
-        <w:pBdr>
-          <w:left w:val="single" w:sz="18" w:space="4" w:color="2980B9"/>
-        </w:pBdr>
-        <w:shd w:val="clear" w:color="auto" w:fill="ECF0F1"/>
-        <w:spacing w:before="40"/>
-        <w:ind w:left="200" w:right="200"/>
-      </w:pPr>
-      <w:proofErr w:type="gramStart"/>
-      <w:r>
-        <w:rPr>
-          <w:rFonts w:ascii="Consolas" w:eastAsia="Consolas" w:hAnsi="Consolas" w:cs="Consolas"/>
-          <w:color w:val="2C3E50"/>
-          <w:sz w:val="20"/>
-          <w:szCs w:val="20"/>
-        </w:rPr>
-        <w:t>sudo</w:t>
-      </w:r>
-      <w:proofErr w:type="gramEnd"/>
-      <w:r>
-        <w:rPr>
-          <w:rFonts w:ascii="Consolas" w:eastAsia="Consolas" w:hAnsi="Consolas" w:cs="Consolas"/>
-          <w:color w:val="2C3E50"/>
-          <w:sz w:val="20"/>
-          <w:szCs w:val="20"/>
-        </w:rPr>
-        <w:t xml:space="preserve"> apt install git curl wget htop tree python3 python3-pip unzip -y</w:t>
-      </w:r>
-    </w:p>
-    <w:p>
-      <w:pPr>
-        <w:pBdr>
-          <w:left w:val="single" w:sz="18" w:space="4" w:color="2980B9"/>
-        </w:pBdr>
-        <w:shd w:val="clear" w:color="auto" w:fill="ECF0F1"/>
-        <w:ind w:left="200" w:right="200"/>
-      </w:pPr>
-      <w:proofErr w:type="gramStart"/>
-      <w:r>
-        <w:rPr>
-          <w:rFonts w:ascii="Consolas" w:eastAsia="Consolas" w:hAnsi="Consolas" w:cs="Consolas"/>
-          <w:color w:val="2C3E50"/>
-          <w:sz w:val="20"/>
-          <w:szCs w:val="20"/>
-        </w:rPr>
-        <w:t>git</w:t>
-      </w:r>
-      <w:proofErr w:type="gramEnd"/>
-      <w:r>
-        <w:rPr>
-          <w:rFonts w:ascii="Consolas" w:eastAsia="Consolas" w:hAnsi="Consolas" w:cs="Consolas"/>
-          <w:color w:val="2C3E50"/>
-          <w:sz w:val="20"/>
-          <w:szCs w:val="20"/>
-        </w:rPr>
-        <w:t xml:space="preserve"> --version &amp;&amp; python3 --version    # vérifier les installations</w:t>
-      </w:r>
-    </w:p>
-    <w:p>
-      <w:pPr>
-        <w:pBdr>
-          <w:left w:val="single" w:sz="18" w:space="4" w:color="2980B9"/>
-        </w:pBdr>
-        <w:shd w:val="clear" w:color="auto" w:fill="ECF0F1"/>
-        <w:ind w:left="200" w:right="200"/>
-      </w:pPr>
-      <w:proofErr w:type="gramStart"/>
-      <w:r>
-        <w:rPr>
-          <w:rFonts w:ascii="Consolas" w:eastAsia="Consolas" w:hAnsi="Consolas" w:cs="Consolas"/>
-          <w:color w:val="2C3E50"/>
-          <w:sz w:val="20"/>
-          <w:szCs w:val="20"/>
-        </w:rPr>
-        <w:t>wget</w:t>
-      </w:r>
-      <w:proofErr w:type="gramEnd"/>
-      <w:r>
-        <w:rPr>
-          <w:rFonts w:ascii="Consolas" w:eastAsia="Consolas" w:hAnsi="Consolas" w:cs="Consolas"/>
-          <w:color w:val="2C3E50"/>
-          <w:sz w:val="20"/>
-          <w:szCs w:val="20"/>
-        </w:rPr>
-        <w:t xml:space="preserve"> https://raw.githubusercontent.com/mwaskom/seaborn-data/master/iris.csv</w:t>
-      </w:r>
-    </w:p>
-    <w:p>
-      <w:pPr>
-        <w:pBdr>
-          <w:left w:val="single" w:sz="18" w:space="4" w:color="2980B9"/>
-        </w:pBdr>
-        <w:shd w:val="clear" w:color="auto" w:fill="ECF0F1"/>
-        <w:ind w:left="200" w:right="200"/>
-      </w:pPr>
-      <w:proofErr w:type="gramStart"/>
-      <w:r>
-        <w:rPr>
-          <w:rFonts w:ascii="Consolas" w:eastAsia="Consolas" w:hAnsi="Consolas" w:cs="Consolas"/>
-          <w:color w:val="2C3E50"/>
-          <w:sz w:val="20"/>
-          <w:szCs w:val="20"/>
-        </w:rPr>
-        <w:t>ls</w:t>
-      </w:r>
-      <w:proofErr w:type="gramEnd"/>
-      <w:r>
-        <w:rPr>
-          <w:rFonts w:ascii="Consolas" w:eastAsia="Consolas" w:hAnsi="Consolas" w:cs="Consolas"/>
-          <w:color w:val="2C3E50"/>
-          <w:sz w:val="20"/>
-          <w:szCs w:val="20"/>
-        </w:rPr>
-        <w:t xml:space="preserve"> -l iris.csv       # vérifier la présence</w:t>
-      </w:r>
-    </w:p>
-    <w:p>
-      <w:pPr>
-        <w:pBdr>
-          <w:left w:val="single" w:sz="18" w:space="4" w:color="2980B9"/>
-        </w:pBdr>
-        <w:shd w:val="clear" w:color="auto" w:fill="ECF0F1"/>
-        <w:spacing w:after="120"/>
-        <w:ind w:left="200" w:right="200"/>
-      </w:pPr>
-      <w:proofErr w:type="gramStart"/>
-      <w:r>
-        <w:rPr>
-          <w:rFonts w:ascii="Consolas" w:eastAsia="Consolas" w:hAnsi="Consolas" w:cs="Consolas"/>
-          <w:color w:val="2C3E50"/>
-          <w:sz w:val="20"/>
-          <w:szCs w:val="20"/>
-        </w:rPr>
-        <w:t>head</w:t>
-      </w:r>
-      <w:proofErr w:type="gramEnd"/>
-      <w:r>
-        <w:rPr>
-          <w:rFonts w:ascii="Consolas" w:eastAsia="Consolas" w:hAnsi="Consolas" w:cs="Consolas"/>
-          <w:color w:val="2C3E50"/>
-          <w:sz w:val="20"/>
-          <w:szCs w:val="20"/>
-        </w:rPr>
-        <w:t xml:space="preserve"> iris.csv        # consulter le contenu</w:t>
+      <w:r>
+        <w:rPr>
+          <w:noProof/>
+        </w:rPr>
+        <w:drawing>
+          <wp:inline distT="0" distB="0" distL="0" distR="0" wp14:anchorId="0720670F" wp14:editId="3EF94664">
+            <wp:extent cx="6036310" cy="3204210"/>
+            <wp:effectExtent l="0" t="0" r="2540" b="0"/>
+            <wp:docPr id="16" name="Image 16"/>
+            <wp:cNvGraphicFramePr>
+              <a:graphicFrameLocks xmlns:a="http://schemas.openxmlformats.org/drawingml/2006/main" noChangeAspect="1"/>
+            </wp:cNvGraphicFramePr>
+            <a:graphic xmlns:a="http://schemas.openxmlformats.org/drawingml/2006/main">
+              <a:graphicData uri="http://schemas.openxmlformats.org/drawingml/2006/picture">
+                <pic:pic xmlns:pic="http://schemas.openxmlformats.org/drawingml/2006/picture">
+                  <pic:nvPicPr>
+                    <pic:cNvPr id="16" name="Image 16"/>
+                    <pic:cNvPicPr/>
+                  </pic:nvPicPr>
+                  <pic:blipFill>
+                    <a:blip r:embed="rId20" cstate="print">
+                      <a:extLst>
+                        <a:ext uri="{28A0092B-C50C-407E-A947-70E740481C1C}">
+                          <a14:useLocalDpi xmlns:a14="http://schemas.microsoft.com/office/drawing/2010/main" val="0"/>
+                        </a:ext>
+                      </a:extLst>
+                    </a:blip>
+                    <a:stretch>
+                      <a:fillRect/>
+                    </a:stretch>
+                  </pic:blipFill>
+                  <pic:spPr>
+                    <a:xfrm>
+                      <a:off x="0" y="0"/>
+                      <a:ext cx="6036310" cy="3204210"/>
+                    </a:xfrm>
+                    <a:prstGeom prst="rect">
+                      <a:avLst/>
+                    </a:prstGeom>
+                  </pic:spPr>
+                </pic:pic>
+              </a:graphicData>
+            </a:graphic>
+          </wp:inline>
+        </w:drawing>
+      </w:r>
+      <w:r>
+        <w:rPr>
+          <w:noProof/>
+        </w:rPr>
+        <w:lastRenderedPageBreak/>
+        <w:drawing>
+          <wp:inline distT="0" distB="0" distL="0" distR="0" wp14:anchorId="739C5CFE" wp14:editId="2B2B58CA">
+            <wp:extent cx="6036310" cy="3213735"/>
+            <wp:effectExtent l="0" t="0" r="2540" b="5715"/>
+            <wp:docPr id="18" name="Image 18"/>
+            <wp:cNvGraphicFramePr>
+              <a:graphicFrameLocks xmlns:a="http://schemas.openxmlformats.org/drawingml/2006/main" noChangeAspect="1"/>
+            </wp:cNvGraphicFramePr>
+            <a:graphic xmlns:a="http://schemas.openxmlformats.org/drawingml/2006/main">
+              <a:graphicData uri="http://schemas.openxmlformats.org/drawingml/2006/picture">
+                <pic:pic xmlns:pic="http://schemas.openxmlformats.org/drawingml/2006/picture">
+                  <pic:nvPicPr>
+                    <pic:cNvPr id="18" name="Image 18"/>
+                    <pic:cNvPicPr/>
+                  </pic:nvPicPr>
+                  <pic:blipFill>
+                    <a:blip r:embed="rId21" cstate="print">
+                      <a:extLst>
+                        <a:ext uri="{28A0092B-C50C-407E-A947-70E740481C1C}">
+                          <a14:useLocalDpi xmlns:a14="http://schemas.microsoft.com/office/drawing/2010/main" val="0"/>
+                        </a:ext>
+                      </a:extLst>
+                    </a:blip>
+                    <a:stretch>
+                      <a:fillRect/>
+                    </a:stretch>
+                  </pic:blipFill>
+                  <pic:spPr>
+                    <a:xfrm>
+                      <a:off x="0" y="0"/>
+                      <a:ext cx="6036310" cy="3213735"/>
+                    </a:xfrm>
+                    <a:prstGeom prst="rect">
+                      <a:avLst/>
+                    </a:prstGeom>
+                  </pic:spPr>
+                </pic:pic>
+              </a:graphicData>
+            </a:graphic>
+          </wp:inline>
+        </w:drawing>
+      </w:r>
+      <w:r>
+        <w:rPr>
+          <w:noProof/>
+        </w:rPr>
+        <w:drawing>
+          <wp:inline distT="0" distB="0" distL="0" distR="0" wp14:anchorId="0EB27A2B" wp14:editId="6D8D750C">
+            <wp:extent cx="6036310" cy="3209290"/>
+            <wp:effectExtent l="0" t="0" r="2540" b="0"/>
+            <wp:docPr id="19" name="Image 19"/>
+            <wp:cNvGraphicFramePr>
+              <a:graphicFrameLocks xmlns:a="http://schemas.openxmlformats.org/drawingml/2006/main" noChangeAspect="1"/>
+            </wp:cNvGraphicFramePr>
+            <a:graphic xmlns:a="http://schemas.openxmlformats.org/drawingml/2006/main">
+              <a:graphicData uri="http://schemas.openxmlformats.org/drawingml/2006/picture">
+                <pic:pic xmlns:pic="http://schemas.openxmlformats.org/drawingml/2006/picture">
+                  <pic:nvPicPr>
+                    <pic:cNvPr id="19" name="Image 19"/>
+                    <pic:cNvPicPr/>
+                  </pic:nvPicPr>
+                  <pic:blipFill>
+                    <a:blip r:embed="rId22" cstate="print">
+                      <a:extLst>
+                        <a:ext uri="{28A0092B-C50C-407E-A947-70E740481C1C}">
+                          <a14:useLocalDpi xmlns:a14="http://schemas.microsoft.com/office/drawing/2010/main" val="0"/>
+                        </a:ext>
+                      </a:extLst>
+                    </a:blip>
+                    <a:stretch>
+                      <a:fillRect/>
+                    </a:stretch>
+                  </pic:blipFill>
+                  <pic:spPr>
+                    <a:xfrm>
+                      <a:off x="0" y="0"/>
+                      <a:ext cx="6036310" cy="3209290"/>
+                    </a:xfrm>
+                    <a:prstGeom prst="rect">
+                      <a:avLst/>
+                    </a:prstGeom>
+                  </pic:spPr>
+                </pic:pic>
+              </a:graphicData>
+            </a:graphic>
+          </wp:inline>
+        </w:drawing>
+      </w:r>
+      <w:r>
+        <w:rPr>
+          <w:noProof/>
+        </w:rPr>
+        <w:lastRenderedPageBreak/>
+        <w:drawing>
+          <wp:inline distT="0" distB="0" distL="0" distR="0" wp14:anchorId="3FAAE28A" wp14:editId="2CAC538C">
+            <wp:extent cx="6036310" cy="3213735"/>
+            <wp:effectExtent l="0" t="0" r="2540" b="5715"/>
+            <wp:docPr id="20" name="Image 20"/>
+            <wp:cNvGraphicFramePr>
+              <a:graphicFrameLocks xmlns:a="http://schemas.openxmlformats.org/drawingml/2006/main" noChangeAspect="1"/>
+            </wp:cNvGraphicFramePr>
+            <a:graphic xmlns:a="http://schemas.openxmlformats.org/drawingml/2006/main">
+              <a:graphicData uri="http://schemas.openxmlformats.org/drawingml/2006/picture">
+                <pic:pic xmlns:pic="http://schemas.openxmlformats.org/drawingml/2006/picture">
+                  <pic:nvPicPr>
+                    <pic:cNvPr id="20" name="Image 20"/>
+                    <pic:cNvPicPr/>
+                  </pic:nvPicPr>
+                  <pic:blipFill>
+                    <a:blip r:embed="rId23" cstate="print">
+                      <a:extLst>
+                        <a:ext uri="{28A0092B-C50C-407E-A947-70E740481C1C}">
+                          <a14:useLocalDpi xmlns:a14="http://schemas.microsoft.com/office/drawing/2010/main" val="0"/>
+                        </a:ext>
+                      </a:extLst>
+                    </a:blip>
+                    <a:stretch>
+                      <a:fillRect/>
+                    </a:stretch>
+                  </pic:blipFill>
+                  <pic:spPr>
+                    <a:xfrm>
+                      <a:off x="0" y="0"/>
+                      <a:ext cx="6036310" cy="3213735"/>
+                    </a:xfrm>
+                    <a:prstGeom prst="rect">
+                      <a:avLst/>
+                    </a:prstGeom>
+                  </pic:spPr>
+                </pic:pic>
+              </a:graphicData>
+            </a:graphic>
+          </wp:inline>
+        </w:drawing>
+      </w:r>
+      <w:r>
+        <w:rPr>
+          <w:noProof/>
+        </w:rPr>
+        <w:drawing>
+          <wp:inline distT="0" distB="0" distL="0" distR="0" wp14:anchorId="027AA086" wp14:editId="07973223">
+            <wp:extent cx="6036310" cy="3213735"/>
+            <wp:effectExtent l="0" t="0" r="2540" b="5715"/>
+            <wp:docPr id="21" name="Image 21"/>
+            <wp:cNvGraphicFramePr>
+              <a:graphicFrameLocks xmlns:a="http://schemas.openxmlformats.org/drawingml/2006/main" noChangeAspect="1"/>
+            </wp:cNvGraphicFramePr>
+            <a:graphic xmlns:a="http://schemas.openxmlformats.org/drawingml/2006/main">
+              <a:graphicData uri="http://schemas.openxmlformats.org/drawingml/2006/picture">
+                <pic:pic xmlns:pic="http://schemas.openxmlformats.org/drawingml/2006/picture">
+                  <pic:nvPicPr>
+                    <pic:cNvPr id="21" name="Image 21"/>
+                    <pic:cNvPicPr/>
+                  </pic:nvPicPr>
+                  <pic:blipFill>
+                    <a:blip r:embed="rId24" cstate="print">
+                      <a:extLst>
+                        <a:ext uri="{28A0092B-C50C-407E-A947-70E740481C1C}">
+                          <a14:useLocalDpi xmlns:a14="http://schemas.microsoft.com/office/drawing/2010/main" val="0"/>
+                        </a:ext>
+                      </a:extLst>
+                    </a:blip>
+                    <a:stretch>
+                      <a:fillRect/>
+                    </a:stretch>
+                  </pic:blipFill>
+                  <pic:spPr>
+                    <a:xfrm>
+                      <a:off x="0" y="0"/>
+                      <a:ext cx="6036310" cy="3213735"/>
+                    </a:xfrm>
+                    <a:prstGeom prst="rect">
+                      <a:avLst/>
+                    </a:prstGeom>
+                  </pic:spPr>
+                </pic:pic>
+              </a:graphicData>
+            </a:graphic>
+          </wp:inline>
+        </w:drawing>
       </w:r>
     </w:p>
     <w:p>
@@ -3768,50 +4979,152 @@
         <w:spacing w:before="160" w:after="200" w:line="360" w:lineRule="auto"/>
         <w:jc w:val="center"/>
       </w:pPr>
-      <w:proofErr w:type="gramStart"/>
-      <w:r>
-        <w:rPr>
-          <w:b/>
-          <w:bCs/>
-          <w:color w:val="7F8C8D"/>
+      <w:r>
+        <w:t xml:space="preserve">Deux blocages rencontrés : (1) le chemin personnel non traversable, résolu par </w:t>
+      </w:r>
+      <w:r>
+        <w:rPr>
+          <w:rStyle w:val="CodeHTML"/>
+          <w:rFonts w:eastAsia="Calibri"/>
+        </w:rPr>
+        <w:t xml:space="preserve">chmod </w:t>
+      </w:r>
+      <w:proofErr w:type="spellStart"/>
+      <w:r>
+        <w:rPr>
+          <w:rStyle w:val="CodeHTML"/>
+          <w:rFonts w:eastAsia="Calibri"/>
+        </w:rPr>
+        <w:t>o+x</w:t>
+      </w:r>
+      <w:proofErr w:type="spellEnd"/>
+      <w:r>
+        <w:t xml:space="preserve"> sur le chemin ; (2) bob absent du groupe data, résolu par </w:t>
+      </w:r>
+      <w:proofErr w:type="spellStart"/>
+      <w:r>
+        <w:rPr>
+          <w:rStyle w:val="CodeHTML"/>
+          <w:rFonts w:eastAsia="Calibri"/>
+        </w:rPr>
+        <w:t>usermod</w:t>
+      </w:r>
+      <w:proofErr w:type="spellEnd"/>
+      <w:r>
+        <w:rPr>
+          <w:rStyle w:val="CodeHTML"/>
+          <w:rFonts w:eastAsia="Calibri"/>
+        </w:rPr>
+        <w:t xml:space="preserve"> -</w:t>
+      </w:r>
+      <w:proofErr w:type="spellStart"/>
+      <w:r>
+        <w:rPr>
+          <w:rStyle w:val="CodeHTML"/>
+          <w:rFonts w:eastAsia="Calibri"/>
+        </w:rPr>
+        <w:t>aG</w:t>
+      </w:r>
+      <w:proofErr w:type="spellEnd"/>
+      <w:r>
+        <w:rPr>
+          <w:rStyle w:val="CodeHTML"/>
+          <w:rFonts w:eastAsia="Calibri"/>
+        </w:rPr>
+        <w:t xml:space="preserve"> data bob</w:t>
+      </w:r>
+      <w:r>
+        <w:rPr>
+          <w:noProof/>
         </w:rPr>
         <w:lastRenderedPageBreak/>
-        <w:t>📷  Insérer</w:t>
-      </w:r>
-      <w:proofErr w:type="gramEnd"/>
-      <w:r>
-        <w:rPr>
-          <w:b/>
-          <w:bCs/>
-          <w:color w:val="7F8C8D"/>
-        </w:rPr>
-        <w:t xml:space="preserve"> ici la capture d'écran</w:t>
-      </w:r>
-      <w:r>
-        <w:br/>
-      </w:r>
-      <w:r>
-        <w:rPr>
-          <w:i/>
-          <w:iCs/>
-          <w:color w:val="7F8C8D"/>
-          <w:sz w:val="20"/>
-          <w:szCs w:val="20"/>
-        </w:rPr>
-        <w:t>Installation des logiciels et téléchargement du dataset iris.csv.</w:t>
-      </w:r>
-      <w:r>
-        <w:br/>
-      </w:r>
-      <w:r>
-        <w:rPr>
-          <w:i/>
-          <w:iCs/>
-          <w:color w:val="7F8C8D"/>
-          <w:sz w:val="16"/>
-          <w:szCs w:val="16"/>
-        </w:rPr>
-        <w:t>(Clic droit → Insérer une image, puis supprimer ce texte)</w:t>
+        <w:drawing>
+          <wp:inline distT="0" distB="0" distL="0" distR="0" wp14:anchorId="3F7B4421" wp14:editId="0EC339C9">
+            <wp:extent cx="6036310" cy="1945005"/>
+            <wp:effectExtent l="0" t="0" r="2540" b="0"/>
+            <wp:docPr id="22" name="Image 22"/>
+            <wp:cNvGraphicFramePr>
+              <a:graphicFrameLocks xmlns:a="http://schemas.openxmlformats.org/drawingml/2006/main" noChangeAspect="1"/>
+            </wp:cNvGraphicFramePr>
+            <a:graphic xmlns:a="http://schemas.openxmlformats.org/drawingml/2006/main">
+              <a:graphicData uri="http://schemas.openxmlformats.org/drawingml/2006/picture">
+                <pic:pic xmlns:pic="http://schemas.openxmlformats.org/drawingml/2006/picture">
+                  <pic:nvPicPr>
+                    <pic:cNvPr id="22" name="Image 22"/>
+                    <pic:cNvPicPr/>
+                  </pic:nvPicPr>
+                  <pic:blipFill>
+                    <a:blip r:embed="rId25" cstate="print">
+                      <a:extLst>
+                        <a:ext uri="{28A0092B-C50C-407E-A947-70E740481C1C}">
+                          <a14:useLocalDpi xmlns:a14="http://schemas.microsoft.com/office/drawing/2010/main" val="0"/>
+                        </a:ext>
+                      </a:extLst>
+                    </a:blip>
+                    <a:stretch>
+                      <a:fillRect/>
+                    </a:stretch>
+                  </pic:blipFill>
+                  <pic:spPr>
+                    <a:xfrm>
+                      <a:off x="0" y="0"/>
+                      <a:ext cx="6036310" cy="1945005"/>
+                    </a:xfrm>
+                    <a:prstGeom prst="rect">
+                      <a:avLst/>
+                    </a:prstGeom>
+                  </pic:spPr>
+                </pic:pic>
+              </a:graphicData>
+            </a:graphic>
+          </wp:inline>
+        </w:drawing>
+      </w:r>
+      <w:r>
+        <w:rPr>
+          <w:noProof/>
+        </w:rPr>
+        <w:drawing>
+          <wp:inline distT="0" distB="0" distL="0" distR="0" wp14:anchorId="67C9A3F9" wp14:editId="7293A06C">
+            <wp:extent cx="6036310" cy="3199765"/>
+            <wp:effectExtent l="0" t="0" r="2540" b="635"/>
+            <wp:docPr id="23" name="Image 23"/>
+            <wp:cNvGraphicFramePr>
+              <a:graphicFrameLocks xmlns:a="http://schemas.openxmlformats.org/drawingml/2006/main" noChangeAspect="1"/>
+            </wp:cNvGraphicFramePr>
+            <a:graphic xmlns:a="http://schemas.openxmlformats.org/drawingml/2006/main">
+              <a:graphicData uri="http://schemas.openxmlformats.org/drawingml/2006/picture">
+                <pic:pic xmlns:pic="http://schemas.openxmlformats.org/drawingml/2006/picture">
+                  <pic:nvPicPr>
+                    <pic:cNvPr id="23" name="Image 23"/>
+                    <pic:cNvPicPr/>
+                  </pic:nvPicPr>
+                  <pic:blipFill>
+                    <a:blip r:embed="rId26" cstate="print">
+                      <a:extLst>
+                        <a:ext uri="{28A0092B-C50C-407E-A947-70E740481C1C}">
+                          <a14:useLocalDpi xmlns:a14="http://schemas.microsoft.com/office/drawing/2010/main" val="0"/>
+                        </a:ext>
+                      </a:extLst>
+                    </a:blip>
+                    <a:stretch>
+                      <a:fillRect/>
+                    </a:stretch>
+                  </pic:blipFill>
+                  <pic:spPr>
+                    <a:xfrm>
+                      <a:off x="0" y="0"/>
+                      <a:ext cx="6036310" cy="3199765"/>
+                    </a:xfrm>
+                    <a:prstGeom prst="rect">
+                      <a:avLst/>
+                    </a:prstGeom>
+                  </pic:spPr>
+                </pic:pic>
+              </a:graphicData>
+            </a:graphic>
+          </wp:inline>
+        </w:drawing>
       </w:r>
     </w:p>
     <w:p>
@@ -3822,7 +5135,7 @@
         </w:pBdr>
         <w:spacing w:before="320" w:after="160"/>
       </w:pPr>
-      <w:bookmarkStart w:id="10" w:name="_Toc236173586"/>
+      <w:bookmarkStart w:id="9" w:name="_Toc236173585"/>
       <w:r>
         <w:rPr>
           <w:b/>
@@ -3831,9 +5144,9 @@
           <w:sz w:val="30"/>
           <w:szCs w:val="30"/>
         </w:rPr>
-        <w:t>Partie 5 : Gestion des processus</w:t>
-      </w:r>
-      <w:bookmarkEnd w:id="10"/>
+        <w:t>Partie 4 : Installation des logiciels</w:t>
+      </w:r>
+      <w:bookmarkEnd w:id="9"/>
     </w:p>
     <w:p>
       <w:pPr>
@@ -3844,7 +5157,21 @@
         <w:rPr>
           <w:color w:val="000000"/>
         </w:rPr>
-        <w:t>Objectif : lancer un script, observer son PID, consulter son utilisation CPU, l'arrêter puis le gérer en arrière-plan et au premier plan.</w:t>
+        <w:t xml:space="preserve">Objectif : installer les outils nécessaires puis télécharger un </w:t>
+      </w:r>
+      <w:proofErr w:type="spellStart"/>
+      <w:r>
+        <w:rPr>
+          <w:color w:val="000000"/>
+        </w:rPr>
+        <w:t>dataset</w:t>
+      </w:r>
+      <w:proofErr w:type="spellEnd"/>
+      <w:r>
+        <w:rPr>
+          <w:color w:val="000000"/>
+        </w:rPr>
+        <w:t xml:space="preserve"> depuis Internet.</w:t>
       </w:r>
     </w:p>
     <w:p>
@@ -3856,6 +5183,7 @@
         <w:spacing w:before="40"/>
         <w:ind w:left="200" w:right="200"/>
       </w:pPr>
+      <w:proofErr w:type="spellStart"/>
       <w:proofErr w:type="gramStart"/>
       <w:r>
         <w:rPr>
@@ -3864,8 +5192,9 @@
           <w:sz w:val="20"/>
           <w:szCs w:val="20"/>
         </w:rPr>
-        <w:t>python</w:t>
-      </w:r>
+        <w:t>sudo</w:t>
+      </w:r>
+      <w:proofErr w:type="spellEnd"/>
       <w:proofErr w:type="gramEnd"/>
       <w:r>
         <w:rPr>
@@ -3874,7 +5203,147 @@
           <w:sz w:val="20"/>
           <w:szCs w:val="20"/>
         </w:rPr>
-        <w:t>3 scripts/print-pause.py       # lancer le script</w:t>
+        <w:t xml:space="preserve"> </w:t>
+      </w:r>
+      <w:proofErr w:type="spellStart"/>
+      <w:r>
+        <w:rPr>
+          <w:rFonts w:ascii="Consolas" w:eastAsia="Consolas" w:hAnsi="Consolas" w:cs="Consolas"/>
+          <w:color w:val="2C3E50"/>
+          <w:sz w:val="20"/>
+          <w:szCs w:val="20"/>
+        </w:rPr>
+        <w:t>apt</w:t>
+      </w:r>
+      <w:proofErr w:type="spellEnd"/>
+      <w:r>
+        <w:rPr>
+          <w:rFonts w:ascii="Consolas" w:eastAsia="Consolas" w:hAnsi="Consolas" w:cs="Consolas"/>
+          <w:color w:val="2C3E50"/>
+          <w:sz w:val="20"/>
+          <w:szCs w:val="20"/>
+        </w:rPr>
+        <w:t xml:space="preserve"> </w:t>
+      </w:r>
+      <w:proofErr w:type="spellStart"/>
+      <w:r>
+        <w:rPr>
+          <w:rFonts w:ascii="Consolas" w:eastAsia="Consolas" w:hAnsi="Consolas" w:cs="Consolas"/>
+          <w:color w:val="2C3E50"/>
+          <w:sz w:val="20"/>
+          <w:szCs w:val="20"/>
+        </w:rPr>
+        <w:t>install</w:t>
+      </w:r>
+      <w:proofErr w:type="spellEnd"/>
+      <w:r>
+        <w:rPr>
+          <w:rFonts w:ascii="Consolas" w:eastAsia="Consolas" w:hAnsi="Consolas" w:cs="Consolas"/>
+          <w:color w:val="2C3E50"/>
+          <w:sz w:val="20"/>
+          <w:szCs w:val="20"/>
+        </w:rPr>
+        <w:t xml:space="preserve"> git </w:t>
+      </w:r>
+      <w:proofErr w:type="spellStart"/>
+      <w:r>
+        <w:rPr>
+          <w:rFonts w:ascii="Consolas" w:eastAsia="Consolas" w:hAnsi="Consolas" w:cs="Consolas"/>
+          <w:color w:val="2C3E50"/>
+          <w:sz w:val="20"/>
+          <w:szCs w:val="20"/>
+        </w:rPr>
+        <w:t>curl</w:t>
+      </w:r>
+      <w:proofErr w:type="spellEnd"/>
+      <w:r>
+        <w:rPr>
+          <w:rFonts w:ascii="Consolas" w:eastAsia="Consolas" w:hAnsi="Consolas" w:cs="Consolas"/>
+          <w:color w:val="2C3E50"/>
+          <w:sz w:val="20"/>
+          <w:szCs w:val="20"/>
+        </w:rPr>
+        <w:t xml:space="preserve"> </w:t>
+      </w:r>
+      <w:proofErr w:type="spellStart"/>
+      <w:r>
+        <w:rPr>
+          <w:rFonts w:ascii="Consolas" w:eastAsia="Consolas" w:hAnsi="Consolas" w:cs="Consolas"/>
+          <w:color w:val="2C3E50"/>
+          <w:sz w:val="20"/>
+          <w:szCs w:val="20"/>
+        </w:rPr>
+        <w:t>wget</w:t>
+      </w:r>
+      <w:proofErr w:type="spellEnd"/>
+      <w:r>
+        <w:rPr>
+          <w:rFonts w:ascii="Consolas" w:eastAsia="Consolas" w:hAnsi="Consolas" w:cs="Consolas"/>
+          <w:color w:val="2C3E50"/>
+          <w:sz w:val="20"/>
+          <w:szCs w:val="20"/>
+        </w:rPr>
+        <w:t xml:space="preserve"> </w:t>
+      </w:r>
+      <w:proofErr w:type="spellStart"/>
+      <w:r>
+        <w:rPr>
+          <w:rFonts w:ascii="Consolas" w:eastAsia="Consolas" w:hAnsi="Consolas" w:cs="Consolas"/>
+          <w:color w:val="2C3E50"/>
+          <w:sz w:val="20"/>
+          <w:szCs w:val="20"/>
+        </w:rPr>
+        <w:t>htop</w:t>
+      </w:r>
+      <w:proofErr w:type="spellEnd"/>
+      <w:r>
+        <w:rPr>
+          <w:rFonts w:ascii="Consolas" w:eastAsia="Consolas" w:hAnsi="Consolas" w:cs="Consolas"/>
+          <w:color w:val="2C3E50"/>
+          <w:sz w:val="20"/>
+          <w:szCs w:val="20"/>
+        </w:rPr>
+        <w:t xml:space="preserve"> </w:t>
+      </w:r>
+      <w:proofErr w:type="spellStart"/>
+      <w:r>
+        <w:rPr>
+          <w:rFonts w:ascii="Consolas" w:eastAsia="Consolas" w:hAnsi="Consolas" w:cs="Consolas"/>
+          <w:color w:val="2C3E50"/>
+          <w:sz w:val="20"/>
+          <w:szCs w:val="20"/>
+        </w:rPr>
+        <w:t>tree</w:t>
+      </w:r>
+      <w:proofErr w:type="spellEnd"/>
+      <w:r>
+        <w:rPr>
+          <w:rFonts w:ascii="Consolas" w:eastAsia="Consolas" w:hAnsi="Consolas" w:cs="Consolas"/>
+          <w:color w:val="2C3E50"/>
+          <w:sz w:val="20"/>
+          <w:szCs w:val="20"/>
+        </w:rPr>
+        <w:t xml:space="preserve"> python3 python3-pip </w:t>
+      </w:r>
+      <w:proofErr w:type="spellStart"/>
+      <w:r>
+        <w:rPr>
+          <w:rFonts w:ascii="Consolas" w:eastAsia="Consolas" w:hAnsi="Consolas" w:cs="Consolas"/>
+          <w:color w:val="2C3E50"/>
+          <w:sz w:val="20"/>
+          <w:szCs w:val="20"/>
+        </w:rPr>
+        <w:t>unzip</w:t>
+      </w:r>
+      <w:proofErr w:type="spellEnd"/>
+      <w:r>
+        <w:rPr>
+          <w:rFonts w:ascii="Consolas" w:eastAsia="Consolas" w:hAnsi="Consolas" w:cs="Consolas"/>
+          <w:color w:val="2C3E50"/>
+          <w:sz w:val="20"/>
+          <w:szCs w:val="20"/>
+        </w:rPr>
+        <w:t xml:space="preserve"> -y</w:t>
       </w:r>
     </w:p>
     <w:p>
@@ -3893,7 +5362,7 @@
           <w:sz w:val="20"/>
           <w:szCs w:val="20"/>
         </w:rPr>
-        <w:t>ps</w:t>
+        <w:t>git</w:t>
       </w:r>
       <w:proofErr w:type="gramEnd"/>
       <w:r>
@@ -3903,7 +5372,7 @@
           <w:sz w:val="20"/>
           <w:szCs w:val="20"/>
         </w:rPr>
-        <w:t xml:space="preserve"> aux | grep print-pause            # observer le PID</w:t>
+        <w:t xml:space="preserve"> --version &amp;&amp; python3 --version    # vérifier les installations</w:t>
       </w:r>
     </w:p>
     <w:p>
@@ -3914,6 +5383,7 @@
         <w:shd w:val="clear" w:color="auto" w:fill="ECF0F1"/>
         <w:ind w:left="200" w:right="200"/>
       </w:pPr>
+      <w:proofErr w:type="spellStart"/>
       <w:proofErr w:type="gramStart"/>
       <w:r>
         <w:rPr>
@@ -3922,8 +5392,9 @@
           <w:sz w:val="20"/>
           <w:szCs w:val="20"/>
         </w:rPr>
-        <w:t>top</w:t>
-      </w:r>
+        <w:t>wget</w:t>
+      </w:r>
+      <w:proofErr w:type="spellEnd"/>
       <w:proofErr w:type="gramEnd"/>
       <w:r>
         <w:rPr>
@@ -3932,7 +5403,7 @@
           <w:sz w:val="20"/>
           <w:szCs w:val="20"/>
         </w:rPr>
-        <w:t xml:space="preserve">     (ou htop)                    # utilisation CPU</w:t>
+        <w:t xml:space="preserve"> https://raw.githubusercontent.com/mwaskom/seaborn-data/master/iris.csv</w:t>
       </w:r>
     </w:p>
     <w:p>
@@ -3951,7 +5422,7 @@
           <w:sz w:val="20"/>
           <w:szCs w:val="20"/>
         </w:rPr>
-        <w:t>kill</w:t>
+        <w:t>ls</w:t>
       </w:r>
       <w:proofErr w:type="gramEnd"/>
       <w:r>
@@ -3961,36 +5432,7 @@
           <w:sz w:val="20"/>
           <w:szCs w:val="20"/>
         </w:rPr>
-        <w:t xml:space="preserve"> &lt;PID&gt;                           # arrêter le processus</w:t>
-      </w:r>
-    </w:p>
-    <w:p>
-      <w:pPr>
-        <w:pBdr>
-          <w:left w:val="single" w:sz="18" w:space="4" w:color="2980B9"/>
-        </w:pBdr>
-        <w:shd w:val="clear" w:color="auto" w:fill="ECF0F1"/>
-        <w:ind w:left="200" w:right="200"/>
-      </w:pPr>
-      <w:proofErr w:type="gramStart"/>
-      <w:r>
-        <w:rPr>
-          <w:rFonts w:ascii="Consolas" w:eastAsia="Consolas" w:hAnsi="Consolas" w:cs="Consolas"/>
-          <w:color w:val="2C3E50"/>
-          <w:sz w:val="20"/>
-          <w:szCs w:val="20"/>
-        </w:rPr>
-        <w:t>python</w:t>
-      </w:r>
-      <w:proofErr w:type="gramEnd"/>
-      <w:r>
-        <w:rPr>
-          <w:rFonts w:ascii="Consolas" w:eastAsia="Consolas" w:hAnsi="Consolas" w:cs="Consolas"/>
-          <w:color w:val="2C3E50"/>
-          <w:sz w:val="20"/>
-          <w:szCs w:val="20"/>
-        </w:rPr>
-        <w:t>3 scripts/print-pause.py &amp;     # relancer en arrière-plan</w:t>
+        <w:t xml:space="preserve"> -l iris.csv       # vérifier la présence</w:t>
       </w:r>
     </w:p>
     <w:p>
@@ -4002,6 +5444,7 @@
         <w:spacing w:after="120"/>
         <w:ind w:left="200" w:right="200"/>
       </w:pPr>
+      <w:proofErr w:type="spellStart"/>
       <w:proofErr w:type="gramStart"/>
       <w:r>
         <w:rPr>
@@ -4010,8 +5453,9 @@
           <w:sz w:val="20"/>
           <w:szCs w:val="20"/>
         </w:rPr>
-        <w:t>fg</w:t>
-      </w:r>
+        <w:t>head</w:t>
+      </w:r>
+      <w:proofErr w:type="spellEnd"/>
       <w:proofErr w:type="gramEnd"/>
       <w:r>
         <w:rPr>
@@ -4020,7 +5464,7 @@
           <w:sz w:val="20"/>
           <w:szCs w:val="20"/>
         </w:rPr>
-        <w:t xml:space="preserve">                                   # remettre au premier plan</w:t>
+        <w:t xml:space="preserve"> iris.csv        # consulter le contenu</w:t>
       </w:r>
     </w:p>
     <w:p>
@@ -4064,7 +5508,29 @@
           <w:sz w:val="20"/>
           <w:szCs w:val="20"/>
         </w:rPr>
-        <w:t>Lancement du processus, PID, utilisation CPU et gestion arrière-plan / premier plan.</w:t>
+        <w:t xml:space="preserve">Installation des logiciels et téléchargement du </w:t>
+      </w:r>
+      <w:proofErr w:type="spellStart"/>
+      <w:r>
+        <w:rPr>
+          <w:i/>
+          <w:iCs/>
+          <w:color w:val="7F8C8D"/>
+          <w:sz w:val="20"/>
+          <w:szCs w:val="20"/>
+        </w:rPr>
+        <w:t>dataset</w:t>
+      </w:r>
+      <w:proofErr w:type="spellEnd"/>
+      <w:r>
+        <w:rPr>
+          <w:i/>
+          <w:iCs/>
+          <w:color w:val="7F8C8D"/>
+          <w:sz w:val="20"/>
+          <w:szCs w:val="20"/>
+        </w:rPr>
+        <w:t xml:space="preserve"> iris.csv.</w:t>
       </w:r>
       <w:r>
         <w:br/>
@@ -4088,7 +5554,7 @@
         </w:pBdr>
         <w:spacing w:before="320" w:after="160"/>
       </w:pPr>
-      <w:bookmarkStart w:id="11" w:name="_Toc236173587"/>
+      <w:bookmarkStart w:id="10" w:name="_Toc236173586"/>
       <w:r>
         <w:rPr>
           <w:b/>
@@ -4097,9 +5563,9 @@
           <w:sz w:val="30"/>
           <w:szCs w:val="30"/>
         </w:rPr>
-        <w:t>Partie 6 : Script Bash setup_project.sh</w:t>
-      </w:r>
-      <w:bookmarkEnd w:id="11"/>
+        <w:t>Partie 5 : Gestion des processus</w:t>
+      </w:r>
+      <w:bookmarkEnd w:id="10"/>
     </w:p>
     <w:p>
       <w:pPr>
@@ -4110,19 +5576,248 @@
         <w:rPr>
           <w:color w:val="000000"/>
         </w:rPr>
-        <w:t>Objectif : automatiser toute la préparation de l'environnement dans un seul script commenté : demander le nom du projet, créer l'arborescence, générer un fichier de configuration, installer les outils, télécharger le dataset, compresser le projet et afficher un résumé.</w:t>
-      </w:r>
-    </w:p>
-    <w:p>
-      <w:pPr>
-        <w:spacing w:after="120" w:line="300" w:lineRule="auto"/>
-        <w:jc w:val="both"/>
-      </w:pPr>
-      <w:r>
-        <w:rPr>
-          <w:color w:val="000000"/>
-        </w:rPr>
-        <w:t>Le script complet et commenté est livré séparément dans le dépôt GitHub (setup_project.sh).</w:t>
+        <w:lastRenderedPageBreak/>
+        <w:t>Objectif : lancer un script, observer son PID, consulter son utilisation CPU, l'arrêter puis le gérer en arrière-plan et au premier plan.</w:t>
+      </w:r>
+    </w:p>
+    <w:p>
+      <w:pPr>
+        <w:pBdr>
+          <w:left w:val="single" w:sz="18" w:space="4" w:color="2980B9"/>
+        </w:pBdr>
+        <w:shd w:val="clear" w:color="auto" w:fill="ECF0F1"/>
+        <w:spacing w:before="40"/>
+        <w:ind w:left="200" w:right="200"/>
+      </w:pPr>
+      <w:proofErr w:type="gramStart"/>
+      <w:r>
+        <w:rPr>
+          <w:rFonts w:ascii="Consolas" w:eastAsia="Consolas" w:hAnsi="Consolas" w:cs="Consolas"/>
+          <w:color w:val="2C3E50"/>
+          <w:sz w:val="20"/>
+          <w:szCs w:val="20"/>
+        </w:rPr>
+        <w:t>python</w:t>
+      </w:r>
+      <w:proofErr w:type="gramEnd"/>
+      <w:r>
+        <w:rPr>
+          <w:rFonts w:ascii="Consolas" w:eastAsia="Consolas" w:hAnsi="Consolas" w:cs="Consolas"/>
+          <w:color w:val="2C3E50"/>
+          <w:sz w:val="20"/>
+          <w:szCs w:val="20"/>
+        </w:rPr>
+        <w:t>3 scripts/print-pause.py       # lancer le script</w:t>
+      </w:r>
+    </w:p>
+    <w:p>
+      <w:pPr>
+        <w:pBdr>
+          <w:left w:val="single" w:sz="18" w:space="4" w:color="2980B9"/>
+        </w:pBdr>
+        <w:shd w:val="clear" w:color="auto" w:fill="ECF0F1"/>
+        <w:ind w:left="200" w:right="200"/>
+      </w:pPr>
+      <w:proofErr w:type="spellStart"/>
+      <w:proofErr w:type="gramStart"/>
+      <w:r>
+        <w:rPr>
+          <w:rFonts w:ascii="Consolas" w:eastAsia="Consolas" w:hAnsi="Consolas" w:cs="Consolas"/>
+          <w:color w:val="2C3E50"/>
+          <w:sz w:val="20"/>
+          <w:szCs w:val="20"/>
+        </w:rPr>
+        <w:t>ps</w:t>
+      </w:r>
+      <w:proofErr w:type="spellEnd"/>
+      <w:proofErr w:type="gramEnd"/>
+      <w:r>
+        <w:rPr>
+          <w:rFonts w:ascii="Consolas" w:eastAsia="Consolas" w:hAnsi="Consolas" w:cs="Consolas"/>
+          <w:color w:val="2C3E50"/>
+          <w:sz w:val="20"/>
+          <w:szCs w:val="20"/>
+        </w:rPr>
+        <w:t xml:space="preserve"> aux | </w:t>
+      </w:r>
+      <w:proofErr w:type="spellStart"/>
+      <w:r>
+        <w:rPr>
+          <w:rFonts w:ascii="Consolas" w:eastAsia="Consolas" w:hAnsi="Consolas" w:cs="Consolas"/>
+          <w:color w:val="2C3E50"/>
+          <w:sz w:val="20"/>
+          <w:szCs w:val="20"/>
+        </w:rPr>
+        <w:t>grep</w:t>
+      </w:r>
+      <w:proofErr w:type="spellEnd"/>
+      <w:r>
+        <w:rPr>
+          <w:rFonts w:ascii="Consolas" w:eastAsia="Consolas" w:hAnsi="Consolas" w:cs="Consolas"/>
+          <w:color w:val="2C3E50"/>
+          <w:sz w:val="20"/>
+          <w:szCs w:val="20"/>
+        </w:rPr>
+        <w:t xml:space="preserve"> </w:t>
+      </w:r>
+      <w:proofErr w:type="spellStart"/>
+      <w:r>
+        <w:rPr>
+          <w:rFonts w:ascii="Consolas" w:eastAsia="Consolas" w:hAnsi="Consolas" w:cs="Consolas"/>
+          <w:color w:val="2C3E50"/>
+          <w:sz w:val="20"/>
+          <w:szCs w:val="20"/>
+        </w:rPr>
+        <w:t>print</w:t>
+      </w:r>
+      <w:proofErr w:type="spellEnd"/>
+      <w:r>
+        <w:rPr>
+          <w:rFonts w:ascii="Consolas" w:eastAsia="Consolas" w:hAnsi="Consolas" w:cs="Consolas"/>
+          <w:color w:val="2C3E50"/>
+          <w:sz w:val="20"/>
+          <w:szCs w:val="20"/>
+        </w:rPr>
+        <w:t>-pause            # observer le PID</w:t>
+      </w:r>
+    </w:p>
+    <w:p>
+      <w:pPr>
+        <w:pBdr>
+          <w:left w:val="single" w:sz="18" w:space="4" w:color="2980B9"/>
+        </w:pBdr>
+        <w:shd w:val="clear" w:color="auto" w:fill="ECF0F1"/>
+        <w:ind w:left="200" w:right="200"/>
+      </w:pPr>
+      <w:proofErr w:type="gramStart"/>
+      <w:r>
+        <w:rPr>
+          <w:rFonts w:ascii="Consolas" w:eastAsia="Consolas" w:hAnsi="Consolas" w:cs="Consolas"/>
+          <w:color w:val="2C3E50"/>
+          <w:sz w:val="20"/>
+          <w:szCs w:val="20"/>
+        </w:rPr>
+        <w:t>top</w:t>
+      </w:r>
+      <w:proofErr w:type="gramEnd"/>
+      <w:r>
+        <w:rPr>
+          <w:rFonts w:ascii="Consolas" w:eastAsia="Consolas" w:hAnsi="Consolas" w:cs="Consolas"/>
+          <w:color w:val="2C3E50"/>
+          <w:sz w:val="20"/>
+          <w:szCs w:val="20"/>
+        </w:rPr>
+        <w:t xml:space="preserve">     (ou </w:t>
+      </w:r>
+      <w:proofErr w:type="spellStart"/>
+      <w:r>
+        <w:rPr>
+          <w:rFonts w:ascii="Consolas" w:eastAsia="Consolas" w:hAnsi="Consolas" w:cs="Consolas"/>
+          <w:color w:val="2C3E50"/>
+          <w:sz w:val="20"/>
+          <w:szCs w:val="20"/>
+        </w:rPr>
+        <w:t>htop</w:t>
+      </w:r>
+      <w:proofErr w:type="spellEnd"/>
+      <w:r>
+        <w:rPr>
+          <w:rFonts w:ascii="Consolas" w:eastAsia="Consolas" w:hAnsi="Consolas" w:cs="Consolas"/>
+          <w:color w:val="2C3E50"/>
+          <w:sz w:val="20"/>
+          <w:szCs w:val="20"/>
+        </w:rPr>
+        <w:t>)                    # utilisation CPU</w:t>
+      </w:r>
+    </w:p>
+    <w:p>
+      <w:pPr>
+        <w:pBdr>
+          <w:left w:val="single" w:sz="18" w:space="4" w:color="2980B9"/>
+        </w:pBdr>
+        <w:shd w:val="clear" w:color="auto" w:fill="ECF0F1"/>
+        <w:ind w:left="200" w:right="200"/>
+      </w:pPr>
+      <w:proofErr w:type="spellStart"/>
+      <w:proofErr w:type="gramStart"/>
+      <w:r>
+        <w:rPr>
+          <w:rFonts w:ascii="Consolas" w:eastAsia="Consolas" w:hAnsi="Consolas" w:cs="Consolas"/>
+          <w:color w:val="2C3E50"/>
+          <w:sz w:val="20"/>
+          <w:szCs w:val="20"/>
+        </w:rPr>
+        <w:t>kill</w:t>
+      </w:r>
+      <w:proofErr w:type="spellEnd"/>
+      <w:proofErr w:type="gramEnd"/>
+      <w:r>
+        <w:rPr>
+          <w:rFonts w:ascii="Consolas" w:eastAsia="Consolas" w:hAnsi="Consolas" w:cs="Consolas"/>
+          <w:color w:val="2C3E50"/>
+          <w:sz w:val="20"/>
+          <w:szCs w:val="20"/>
+        </w:rPr>
+        <w:t xml:space="preserve"> &lt;PID&gt;                           # arrêter le processus</w:t>
+      </w:r>
+    </w:p>
+    <w:p>
+      <w:pPr>
+        <w:pBdr>
+          <w:left w:val="single" w:sz="18" w:space="4" w:color="2980B9"/>
+        </w:pBdr>
+        <w:shd w:val="clear" w:color="auto" w:fill="ECF0F1"/>
+        <w:ind w:left="200" w:right="200"/>
+      </w:pPr>
+      <w:proofErr w:type="gramStart"/>
+      <w:r>
+        <w:rPr>
+          <w:rFonts w:ascii="Consolas" w:eastAsia="Consolas" w:hAnsi="Consolas" w:cs="Consolas"/>
+          <w:color w:val="2C3E50"/>
+          <w:sz w:val="20"/>
+          <w:szCs w:val="20"/>
+        </w:rPr>
+        <w:t>python</w:t>
+      </w:r>
+      <w:proofErr w:type="gramEnd"/>
+      <w:r>
+        <w:rPr>
+          <w:rFonts w:ascii="Consolas" w:eastAsia="Consolas" w:hAnsi="Consolas" w:cs="Consolas"/>
+          <w:color w:val="2C3E50"/>
+          <w:sz w:val="20"/>
+          <w:szCs w:val="20"/>
+        </w:rPr>
+        <w:t>3 scripts/print-pause.py &amp;     # relancer en arrière-plan</w:t>
+      </w:r>
+    </w:p>
+    <w:p>
+      <w:pPr>
+        <w:pBdr>
+          <w:left w:val="single" w:sz="18" w:space="4" w:color="2980B9"/>
+        </w:pBdr>
+        <w:shd w:val="clear" w:color="auto" w:fill="ECF0F1"/>
+        <w:spacing w:after="120"/>
+        <w:ind w:left="200" w:right="200"/>
+      </w:pPr>
+      <w:proofErr w:type="gramStart"/>
+      <w:r>
+        <w:rPr>
+          <w:rFonts w:ascii="Consolas" w:eastAsia="Consolas" w:hAnsi="Consolas" w:cs="Consolas"/>
+          <w:color w:val="2C3E50"/>
+          <w:sz w:val="20"/>
+          <w:szCs w:val="20"/>
+        </w:rPr>
+        <w:t>fg</w:t>
+      </w:r>
+      <w:proofErr w:type="gramEnd"/>
+      <w:r>
+        <w:rPr>
+          <w:rFonts w:ascii="Consolas" w:eastAsia="Consolas" w:hAnsi="Consolas" w:cs="Consolas"/>
+          <w:color w:val="2C3E50"/>
+          <w:sz w:val="20"/>
+          <w:szCs w:val="20"/>
+        </w:rPr>
+        <w:t xml:space="preserve">                                   # remettre au premier plan</w:t>
       </w:r>
     </w:p>
     <w:p>
@@ -4166,7 +5861,7 @@
           <w:sz w:val="20"/>
           <w:szCs w:val="20"/>
         </w:rPr>
-        <w:t>Exécution du script setup_project.sh et résumé final affiché.</w:t>
+        <w:t>Lancement du processus, PID, utilisation CPU et gestion arrière-plan / premier plan.</w:t>
       </w:r>
       <w:r>
         <w:br/>
@@ -4190,7 +5885,7 @@
         </w:pBdr>
         <w:spacing w:before="320" w:after="160"/>
       </w:pPr>
-      <w:bookmarkStart w:id="12" w:name="_Toc236173588"/>
+      <w:bookmarkStart w:id="11" w:name="_Toc236173587"/>
       <w:r>
         <w:rPr>
           <w:b/>
@@ -4199,9 +5894,9 @@
           <w:sz w:val="30"/>
           <w:szCs w:val="30"/>
         </w:rPr>
-        <w:t>Partie 7 : Bonus</w:t>
-      </w:r>
-      <w:bookmarkEnd w:id="12"/>
+        <w:t>Partie 6 : Script Bash setup_project.sh</w:t>
+      </w:r>
+      <w:bookmarkEnd w:id="11"/>
     </w:p>
     <w:p>
       <w:pPr>
@@ -4212,21 +5907,33 @@
         <w:rPr>
           <w:color w:val="000000"/>
         </w:rPr>
-        <w:t xml:space="preserve">Activité complémentaire proposée et réalisée : </w:t>
-      </w:r>
-      <w:proofErr w:type="gramStart"/>
+        <w:t xml:space="preserve">Objectif : automatiser toute la préparation de l'environnement dans un seul script commenté : demander le nom du projet, créer l'arborescence, générer un fichier de configuration, installer les outils, télécharger le </w:t>
+      </w:r>
+      <w:proofErr w:type="spellStart"/>
       <w:r>
         <w:rPr>
           <w:color w:val="000000"/>
         </w:rPr>
-        <w:t>[ décrivez</w:t>
-      </w:r>
-      <w:proofErr w:type="gramEnd"/>
+        <w:t>dataset</w:t>
+      </w:r>
+      <w:proofErr w:type="spellEnd"/>
       <w:r>
         <w:rPr>
           <w:color w:val="000000"/>
         </w:rPr>
-        <w:t xml:space="preserve"> ici l'amélioration que vous avez ajoutée, par exemple un script de nettoyage automatique, une journalisation, une vérification d'intégrité de l'archive, etc. ]</w:t>
+        <w:t>, compresser le projet et afficher un résumé.</w:t>
+      </w:r>
+    </w:p>
+    <w:p>
+      <w:pPr>
+        <w:spacing w:after="120" w:line="300" w:lineRule="auto"/>
+        <w:jc w:val="both"/>
+      </w:pPr>
+      <w:r>
+        <w:rPr>
+          <w:color w:val="000000"/>
+        </w:rPr>
+        <w:t>Le script complet et commenté est livré séparément dans le dépôt GitHub (setup_project.sh).</w:t>
       </w:r>
     </w:p>
     <w:p>
@@ -4248,7 +5955,6 @@
           <w:bCs/>
           <w:color w:val="7F8C8D"/>
         </w:rPr>
-        <w:lastRenderedPageBreak/>
         <w:t>📷  Insérer</w:t>
       </w:r>
       <w:proofErr w:type="gramEnd"/>
@@ -4271,7 +5977,7 @@
           <w:sz w:val="20"/>
           <w:szCs w:val="20"/>
         </w:rPr>
-        <w:t>Capture d'écran de l'activité bonus réalisée.</w:t>
+        <w:t>Exécution du script setup_project.sh et résumé final affiché.</w:t>
       </w:r>
       <w:r>
         <w:br/>
@@ -4295,6 +6001,110 @@
         </w:pBdr>
         <w:spacing w:before="320" w:after="160"/>
       </w:pPr>
+      <w:bookmarkStart w:id="12" w:name="_Toc236173588"/>
+      <w:r>
+        <w:rPr>
+          <w:b/>
+          <w:bCs/>
+          <w:color w:val="2C3E50"/>
+          <w:sz w:val="30"/>
+          <w:szCs w:val="30"/>
+        </w:rPr>
+        <w:t>Partie 7 : Bonus</w:t>
+      </w:r>
+      <w:bookmarkEnd w:id="12"/>
+    </w:p>
+    <w:p>
+      <w:pPr>
+        <w:spacing w:after="120" w:line="300" w:lineRule="auto"/>
+        <w:jc w:val="both"/>
+      </w:pPr>
+      <w:r>
+        <w:rPr>
+          <w:color w:val="000000"/>
+        </w:rPr>
+        <w:t xml:space="preserve">Activité complémentaire proposée et réalisée : </w:t>
+      </w:r>
+      <w:proofErr w:type="gramStart"/>
+      <w:r>
+        <w:rPr>
+          <w:color w:val="000000"/>
+        </w:rPr>
+        <w:t>[ décrivez</w:t>
+      </w:r>
+      <w:proofErr w:type="gramEnd"/>
+      <w:r>
+        <w:rPr>
+          <w:color w:val="000000"/>
+        </w:rPr>
+        <w:t xml:space="preserve"> ici l'amélioration que vous avez ajoutée, par exemple un script de nettoyage automatique, une journalisation, une vérification d'intégrité de l'archive, etc. ]</w:t>
+      </w:r>
+    </w:p>
+    <w:p>
+      <w:pPr>
+        <w:pBdr>
+          <w:top w:val="dashed" w:sz="8" w:space="14" w:color="7F8C8D"/>
+          <w:left w:val="dashed" w:sz="8" w:space="14" w:color="7F8C8D"/>
+          <w:bottom w:val="dashed" w:sz="8" w:space="14" w:color="7F8C8D"/>
+          <w:right w:val="dashed" w:sz="8" w:space="14" w:color="7F8C8D"/>
+        </w:pBdr>
+        <w:shd w:val="clear" w:color="auto" w:fill="F8F9FA"/>
+        <w:spacing w:before="160" w:after="200" w:line="360" w:lineRule="auto"/>
+        <w:jc w:val="center"/>
+      </w:pPr>
+      <w:proofErr w:type="gramStart"/>
+      <w:r>
+        <w:rPr>
+          <w:b/>
+          <w:bCs/>
+          <w:color w:val="7F8C8D"/>
+        </w:rPr>
+        <w:t>📷  Insérer</w:t>
+      </w:r>
+      <w:proofErr w:type="gramEnd"/>
+      <w:r>
+        <w:rPr>
+          <w:b/>
+          <w:bCs/>
+          <w:color w:val="7F8C8D"/>
+        </w:rPr>
+        <w:t xml:space="preserve"> ici la capture d'écran</w:t>
+      </w:r>
+      <w:r>
+        <w:br/>
+      </w:r>
+      <w:r>
+        <w:rPr>
+          <w:i/>
+          <w:iCs/>
+          <w:color w:val="7F8C8D"/>
+          <w:sz w:val="20"/>
+          <w:szCs w:val="20"/>
+        </w:rPr>
+        <w:t>Capture d'écran de l'activité bonus réalisée.</w:t>
+      </w:r>
+      <w:r>
+        <w:br/>
+      </w:r>
+      <w:r>
+        <w:rPr>
+          <w:i/>
+          <w:iCs/>
+          <w:color w:val="7F8C8D"/>
+          <w:sz w:val="16"/>
+          <w:szCs w:val="16"/>
+        </w:rPr>
+        <w:t>(Clic droit → Insérer une image, puis supprimer ce texte)</w:t>
+      </w:r>
+    </w:p>
+    <w:p>
+      <w:pPr>
+        <w:pStyle w:val="Titre1"/>
+        <w:pBdr>
+          <w:bottom w:val="single" w:sz="12" w:space="6" w:color="2980B9"/>
+        </w:pBdr>
+        <w:spacing w:before="320" w:after="160"/>
+      </w:pPr>
       <w:bookmarkStart w:id="13" w:name="_Toc236173589"/>
       <w:r>
         <w:rPr>
@@ -4334,6 +6144,7 @@
           <w:sz w:val="24"/>
           <w:szCs w:val="24"/>
         </w:rPr>
+        <w:lastRenderedPageBreak/>
         <w:t>Principales commandes utilisées et leur rôle</w:t>
       </w:r>
       <w:bookmarkEnd w:id="14"/>
@@ -4353,7 +6164,15 @@
       </w:r>
       <w:proofErr w:type="gramEnd"/>
       <w:r>
-        <w:t>, cd, pwd : naviguer et lister le contenu des dossiers.</w:t>
+        <w:t xml:space="preserve">, cd, </w:t>
+      </w:r>
+      <w:proofErr w:type="spellStart"/>
+      <w:r>
+        <w:t>pwd</w:t>
+      </w:r>
+      <w:proofErr w:type="spellEnd"/>
+      <w:r>
+        <w:t xml:space="preserve"> : naviguer et lister le contenu des dossiers.</w:t>
       </w:r>
     </w:p>
     <w:p>
@@ -4365,13 +6184,39 @@
         </w:numPr>
         <w:spacing w:after="60" w:line="288" w:lineRule="auto"/>
       </w:pPr>
+      <w:proofErr w:type="spellStart"/>
       <w:proofErr w:type="gramStart"/>
       <w:r>
         <w:t>mkdir</w:t>
       </w:r>
+      <w:proofErr w:type="spellEnd"/>
       <w:proofErr w:type="gramEnd"/>
       <w:r>
-        <w:t>, touch, cp, mv, rm : créer, copier, renommer et supprimer fichiers et dossiers.</w:t>
+        <w:t xml:space="preserve">, </w:t>
+      </w:r>
+      <w:proofErr w:type="spellStart"/>
+      <w:r>
+        <w:t>touch</w:t>
+      </w:r>
+      <w:proofErr w:type="spellEnd"/>
+      <w:r>
+        <w:t xml:space="preserve">, </w:t>
+      </w:r>
+      <w:proofErr w:type="spellStart"/>
+      <w:r>
+        <w:t>cp</w:t>
+      </w:r>
+      <w:proofErr w:type="spellEnd"/>
+      <w:r>
+        <w:t xml:space="preserve">, mv, </w:t>
+      </w:r>
+      <w:proofErr w:type="spellStart"/>
+      <w:r>
+        <w:t>rm</w:t>
+      </w:r>
+      <w:proofErr w:type="spellEnd"/>
+      <w:r>
+        <w:t xml:space="preserve"> : créer, copier, renommer et supprimer fichiers et dossiers.</w:t>
       </w:r>
     </w:p>
     <w:p>
@@ -4389,7 +6234,47 @@
       </w:r>
       <w:proofErr w:type="gramEnd"/>
       <w:r>
-        <w:t>, head, tail, wc, grep, find : lire, filtrer et rechercher dans les fichiers.</w:t>
+        <w:t xml:space="preserve">, </w:t>
+      </w:r>
+      <w:proofErr w:type="spellStart"/>
+      <w:r>
+        <w:t>head</w:t>
+      </w:r>
+      <w:proofErr w:type="spellEnd"/>
+      <w:r>
+        <w:t xml:space="preserve">, </w:t>
+      </w:r>
+      <w:proofErr w:type="spellStart"/>
+      <w:r>
+        <w:t>tail</w:t>
+      </w:r>
+      <w:proofErr w:type="spellEnd"/>
+      <w:r>
+        <w:t xml:space="preserve">, </w:t>
+      </w:r>
+      <w:proofErr w:type="spellStart"/>
+      <w:r>
+        <w:t>wc</w:t>
+      </w:r>
+      <w:proofErr w:type="spellEnd"/>
+      <w:r>
+        <w:t xml:space="preserve">, </w:t>
+      </w:r>
+      <w:proofErr w:type="spellStart"/>
+      <w:r>
+        <w:t>grep</w:t>
+      </w:r>
+      <w:proofErr w:type="spellEnd"/>
+      <w:r>
+        <w:t xml:space="preserve">, </w:t>
+      </w:r>
+      <w:proofErr w:type="spellStart"/>
+      <w:r>
+        <w:t>find</w:t>
+      </w:r>
+      <w:proofErr w:type="spellEnd"/>
+      <w:r>
+        <w:t xml:space="preserve"> : lire, filtrer et rechercher dans les fichiers.</w:t>
       </w:r>
     </w:p>
     <w:p>
@@ -4401,13 +6286,39 @@
         </w:numPr>
         <w:spacing w:after="60" w:line="288" w:lineRule="auto"/>
       </w:pPr>
+      <w:proofErr w:type="spellStart"/>
       <w:proofErr w:type="gramStart"/>
       <w:r>
         <w:t>useradd</w:t>
       </w:r>
+      <w:proofErr w:type="spellEnd"/>
       <w:proofErr w:type="gramEnd"/>
       <w:r>
-        <w:t>, passwd, groupadd, usermod, id : gérer utilisateurs et groupes.</w:t>
+        <w:t xml:space="preserve">, </w:t>
+      </w:r>
+      <w:proofErr w:type="spellStart"/>
+      <w:r>
+        <w:t>passwd</w:t>
+      </w:r>
+      <w:proofErr w:type="spellEnd"/>
+      <w:r>
+        <w:t xml:space="preserve">, </w:t>
+      </w:r>
+      <w:proofErr w:type="spellStart"/>
+      <w:r>
+        <w:t>groupadd</w:t>
+      </w:r>
+      <w:proofErr w:type="spellEnd"/>
+      <w:r>
+        <w:t xml:space="preserve">, </w:t>
+      </w:r>
+      <w:proofErr w:type="spellStart"/>
+      <w:r>
+        <w:t>usermod</w:t>
+      </w:r>
+      <w:proofErr w:type="spellEnd"/>
+      <w:r>
+        <w:t>, id : gérer utilisateurs et groupes.</w:t>
       </w:r>
     </w:p>
     <w:p>
@@ -4419,13 +6330,23 @@
         </w:numPr>
         <w:spacing w:after="60" w:line="288" w:lineRule="auto"/>
       </w:pPr>
+      <w:proofErr w:type="spellStart"/>
       <w:proofErr w:type="gramStart"/>
       <w:r>
         <w:t>chown</w:t>
       </w:r>
+      <w:proofErr w:type="spellEnd"/>
       <w:proofErr w:type="gramEnd"/>
       <w:r>
-        <w:t>, chgrp, chmod : gérer propriétaires, groupes et droits d'accès.</w:t>
+        <w:t xml:space="preserve">, </w:t>
+      </w:r>
+      <w:proofErr w:type="spellStart"/>
+      <w:r>
+        <w:t>chgrp</w:t>
+      </w:r>
+      <w:proofErr w:type="spellEnd"/>
+      <w:r>
+        <w:t>, chmod : gérer propriétaires, groupes et droits d'accès.</w:t>
       </w:r>
     </w:p>
     <w:p>
@@ -4437,13 +6358,31 @@
         </w:numPr>
         <w:spacing w:after="60" w:line="288" w:lineRule="auto"/>
       </w:pPr>
+      <w:proofErr w:type="spellStart"/>
       <w:proofErr w:type="gramStart"/>
       <w:r>
         <w:t>apt</w:t>
       </w:r>
+      <w:proofErr w:type="spellEnd"/>
       <w:proofErr w:type="gramEnd"/>
       <w:r>
-        <w:t>, wget, curl : installer des logiciels et télécharger des ressources.</w:t>
+        <w:t xml:space="preserve">, </w:t>
+      </w:r>
+      <w:proofErr w:type="spellStart"/>
+      <w:r>
+        <w:t>wget</w:t>
+      </w:r>
+      <w:proofErr w:type="spellEnd"/>
+      <w:r>
+        <w:t xml:space="preserve">, </w:t>
+      </w:r>
+      <w:proofErr w:type="spellStart"/>
+      <w:r>
+        <w:t>curl</w:t>
+      </w:r>
+      <w:proofErr w:type="spellEnd"/>
+      <w:r>
+        <w:t xml:space="preserve"> : installer des logiciels et télécharger des ressources.</w:t>
       </w:r>
     </w:p>
     <w:p>
@@ -4455,13 +6394,39 @@
         </w:numPr>
         <w:spacing w:after="60" w:line="288" w:lineRule="auto"/>
       </w:pPr>
+      <w:proofErr w:type="spellStart"/>
       <w:proofErr w:type="gramStart"/>
       <w:r>
         <w:t>ps</w:t>
       </w:r>
+      <w:proofErr w:type="spellEnd"/>
       <w:proofErr w:type="gramEnd"/>
       <w:r>
-        <w:t>, top/htop, kill, jobs, fg, bg : superviser et contrôler les processus.</w:t>
+        <w:t>, top/</w:t>
+      </w:r>
+      <w:proofErr w:type="spellStart"/>
+      <w:r>
+        <w:t>htop</w:t>
+      </w:r>
+      <w:proofErr w:type="spellEnd"/>
+      <w:r>
+        <w:t xml:space="preserve">, </w:t>
+      </w:r>
+      <w:proofErr w:type="spellStart"/>
+      <w:r>
+        <w:t>kill</w:t>
+      </w:r>
+      <w:proofErr w:type="spellEnd"/>
+      <w:r>
+        <w:t xml:space="preserve">, jobs, fg, </w:t>
+      </w:r>
+      <w:proofErr w:type="spellStart"/>
+      <w:r>
+        <w:t>bg</w:t>
+      </w:r>
+      <w:proofErr w:type="spellEnd"/>
+      <w:r>
+        <w:t xml:space="preserve"> : superviser et contrôler les processus.</w:t>
       </w:r>
     </w:p>
     <w:p>
@@ -4497,7 +6462,15 @@
       </w:r>
       <w:proofErr w:type="gramEnd"/>
       <w:r>
-        <w:t>, gh : versionner le travail et le publier sur GitHub.</w:t>
+        <w:t xml:space="preserve">, </w:t>
+      </w:r>
+      <w:proofErr w:type="spellStart"/>
+      <w:r>
+        <w:t>gh</w:t>
+      </w:r>
+      <w:proofErr w:type="spellEnd"/>
+      <w:r>
+        <w:t xml:space="preserve"> : versionner le travail et le publier sur GitHub.</w:t>
       </w:r>
     </w:p>
     <w:sectPr>
@@ -5292,6 +7265,19 @@
       <w:ind w:left="220"/>
     </w:pPr>
   </w:style>
+  <w:style w:type="character" w:styleId="CodeHTML">
+    <w:name w:val="HTML Code"/>
+    <w:basedOn w:val="Policepardfaut"/>
+    <w:uiPriority w:val="99"/>
+    <w:semiHidden/>
+    <w:unhideWhenUsed/>
+    <w:rsid w:val="00F52056"/>
+    <w:rPr>
+      <w:rFonts w:ascii="Courier New" w:eastAsia="Times New Roman" w:hAnsi="Courier New" w:cs="Courier New"/>
+      <w:sz w:val="20"/>
+      <w:szCs w:val="20"/>
+    </w:rPr>
+  </w:style>
 </w:styles>
 </file>
 

</xml_diff>

<commit_message>
Parties 4 et 5 - installation logiciels, dataset et processus
</commit_message>
<xml_diff>
--- a/Atelier_Linux_Compte_Rendu.docx
+++ b/Atelier_Linux_Compte_Rendu.docx
@@ -5479,23 +5479,154 @@
         <w:spacing w:before="160" w:after="200" w:line="360" w:lineRule="auto"/>
         <w:jc w:val="center"/>
       </w:pPr>
-      <w:proofErr w:type="gramStart"/>
       <w:r>
         <w:rPr>
           <w:b/>
           <w:bCs/>
+          <w:noProof/>
           <w:color w:val="7F8C8D"/>
         </w:rPr>
-        <w:t>📷  Insérer</w:t>
-      </w:r>
-      <w:proofErr w:type="gramEnd"/>
+        <w:lastRenderedPageBreak/>
+        <w:drawing>
+          <wp:inline distT="0" distB="0" distL="0" distR="0" wp14:anchorId="6389AE04" wp14:editId="364CF870">
+            <wp:extent cx="6036310" cy="4630420"/>
+            <wp:effectExtent l="0" t="0" r="2540" b="0"/>
+            <wp:docPr id="24" name="Image 24"/>
+            <wp:cNvGraphicFramePr>
+              <a:graphicFrameLocks xmlns:a="http://schemas.openxmlformats.org/drawingml/2006/main" noChangeAspect="1"/>
+            </wp:cNvGraphicFramePr>
+            <a:graphic xmlns:a="http://schemas.openxmlformats.org/drawingml/2006/main">
+              <a:graphicData uri="http://schemas.openxmlformats.org/drawingml/2006/picture">
+                <pic:pic xmlns:pic="http://schemas.openxmlformats.org/drawingml/2006/picture">
+                  <pic:nvPicPr>
+                    <pic:cNvPr id="24" name="Image 24"/>
+                    <pic:cNvPicPr/>
+                  </pic:nvPicPr>
+                  <pic:blipFill>
+                    <a:blip r:embed="rId27" cstate="print">
+                      <a:extLst>
+                        <a:ext uri="{28A0092B-C50C-407E-A947-70E740481C1C}">
+                          <a14:useLocalDpi xmlns:a14="http://schemas.microsoft.com/office/drawing/2010/main" val="0"/>
+                        </a:ext>
+                      </a:extLst>
+                    </a:blip>
+                    <a:stretch>
+                      <a:fillRect/>
+                    </a:stretch>
+                  </pic:blipFill>
+                  <pic:spPr>
+                    <a:xfrm>
+                      <a:off x="0" y="0"/>
+                      <a:ext cx="6036310" cy="4630420"/>
+                    </a:xfrm>
+                    <a:prstGeom prst="rect">
+                      <a:avLst/>
+                    </a:prstGeom>
+                  </pic:spPr>
+                </pic:pic>
+              </a:graphicData>
+            </a:graphic>
+          </wp:inline>
+        </w:drawing>
+      </w:r>
       <w:r>
         <w:rPr>
           <w:b/>
           <w:bCs/>
+          <w:noProof/>
           <w:color w:val="7F8C8D"/>
         </w:rPr>
-        <w:t xml:space="preserve"> ici la capture d'écran</w:t>
+        <w:drawing>
+          <wp:inline distT="0" distB="0" distL="0" distR="0" wp14:anchorId="64ECB84F" wp14:editId="55A05F6F">
+            <wp:extent cx="6036310" cy="3197225"/>
+            <wp:effectExtent l="0" t="0" r="2540" b="3175"/>
+            <wp:docPr id="25" name="Image 25"/>
+            <wp:cNvGraphicFramePr>
+              <a:graphicFrameLocks xmlns:a="http://schemas.openxmlformats.org/drawingml/2006/main" noChangeAspect="1"/>
+            </wp:cNvGraphicFramePr>
+            <a:graphic xmlns:a="http://schemas.openxmlformats.org/drawingml/2006/main">
+              <a:graphicData uri="http://schemas.openxmlformats.org/drawingml/2006/picture">
+                <pic:pic xmlns:pic="http://schemas.openxmlformats.org/drawingml/2006/picture">
+                  <pic:nvPicPr>
+                    <pic:cNvPr id="25" name="Image 25"/>
+                    <pic:cNvPicPr/>
+                  </pic:nvPicPr>
+                  <pic:blipFill>
+                    <a:blip r:embed="rId28" cstate="print">
+                      <a:extLst>
+                        <a:ext uri="{28A0092B-C50C-407E-A947-70E740481C1C}">
+                          <a14:useLocalDpi xmlns:a14="http://schemas.microsoft.com/office/drawing/2010/main" val="0"/>
+                        </a:ext>
+                      </a:extLst>
+                    </a:blip>
+                    <a:stretch>
+                      <a:fillRect/>
+                    </a:stretch>
+                  </pic:blipFill>
+                  <pic:spPr>
+                    <a:xfrm>
+                      <a:off x="0" y="0"/>
+                      <a:ext cx="6036310" cy="3197225"/>
+                    </a:xfrm>
+                    <a:prstGeom prst="rect">
+                      <a:avLst/>
+                    </a:prstGeom>
+                  </pic:spPr>
+                </pic:pic>
+              </a:graphicData>
+            </a:graphic>
+          </wp:inline>
+        </w:drawing>
+      </w:r>
+      <w:r>
+        <w:rPr>
+          <w:b/>
+          <w:bCs/>
+          <w:noProof/>
+          <w:color w:val="7F8C8D"/>
+        </w:rPr>
+        <w:lastRenderedPageBreak/>
+        <w:drawing>
+          <wp:inline distT="0" distB="0" distL="0" distR="0" wp14:anchorId="7668E8ED" wp14:editId="583314F0">
+            <wp:extent cx="6036310" cy="3218180"/>
+            <wp:effectExtent l="0" t="0" r="2540" b="1270"/>
+            <wp:docPr id="26" name="Image 26"/>
+            <wp:cNvGraphicFramePr>
+              <a:graphicFrameLocks xmlns:a="http://schemas.openxmlformats.org/drawingml/2006/main" noChangeAspect="1"/>
+            </wp:cNvGraphicFramePr>
+            <a:graphic xmlns:a="http://schemas.openxmlformats.org/drawingml/2006/main">
+              <a:graphicData uri="http://schemas.openxmlformats.org/drawingml/2006/picture">
+                <pic:pic xmlns:pic="http://schemas.openxmlformats.org/drawingml/2006/picture">
+                  <pic:nvPicPr>
+                    <pic:cNvPr id="26" name="Image 26"/>
+                    <pic:cNvPicPr/>
+                  </pic:nvPicPr>
+                  <pic:blipFill>
+                    <a:blip r:embed="rId29" cstate="print">
+                      <a:extLst>
+                        <a:ext uri="{28A0092B-C50C-407E-A947-70E740481C1C}">
+                          <a14:useLocalDpi xmlns:a14="http://schemas.microsoft.com/office/drawing/2010/main" val="0"/>
+                        </a:ext>
+                      </a:extLst>
+                    </a:blip>
+                    <a:stretch>
+                      <a:fillRect/>
+                    </a:stretch>
+                  </pic:blipFill>
+                  <pic:spPr>
+                    <a:xfrm>
+                      <a:off x="0" y="0"/>
+                      <a:ext cx="6036310" cy="3218180"/>
+                    </a:xfrm>
+                    <a:prstGeom prst="rect">
+                      <a:avLst/>
+                    </a:prstGeom>
+                  </pic:spPr>
+                </pic:pic>
+              </a:graphicData>
+            </a:graphic>
+          </wp:inline>
+        </w:drawing>
       </w:r>
       <w:r>
         <w:br/>
@@ -5530,20 +5661,7 @@
           <w:sz w:val="20"/>
           <w:szCs w:val="20"/>
         </w:rPr>
-        <w:t xml:space="preserve"> iris.csv.</w:t>
-      </w:r>
-      <w:r>
-        <w:br/>
-      </w:r>
-      <w:r>
-        <w:rPr>
-          <w:i/>
-          <w:iCs/>
-          <w:color w:val="7F8C8D"/>
-          <w:sz w:val="16"/>
-          <w:szCs w:val="16"/>
-        </w:rPr>
-        <w:t>(Clic droit → Insérer une image, puis supprimer ce texte)</w:t>
+        <w:t xml:space="preserve"> iris.csv</w:t>
       </w:r>
     </w:p>
     <w:p>
@@ -5576,7 +5694,6 @@
         <w:rPr>
           <w:color w:val="000000"/>
         </w:rPr>
-        <w:lastRenderedPageBreak/>
         <w:t>Objectif : lancer un script, observer son PID, consulter son utilisation CPU, l'arrêter puis le gérer en arrière-plan et au premier plan.</w:t>
       </w:r>
     </w:p>
@@ -5818,6 +5935,381 @@
           <w:szCs w:val="20"/>
         </w:rPr>
         <w:t xml:space="preserve">                                   # remettre au premier plan</w:t>
+      </w:r>
+    </w:p>
+    <w:p>
+      <w:pPr>
+        <w:pBdr>
+          <w:top w:val="dashed" w:sz="8" w:space="14" w:color="7F8C8D"/>
+          <w:left w:val="dashed" w:sz="8" w:space="14" w:color="7F8C8D"/>
+          <w:bottom w:val="dashed" w:sz="8" w:space="14" w:color="7F8C8D"/>
+          <w:right w:val="dashed" w:sz="8" w:space="14" w:color="7F8C8D"/>
+        </w:pBdr>
+        <w:shd w:val="clear" w:color="auto" w:fill="F8F9FA"/>
+        <w:spacing w:before="160" w:after="200" w:line="360" w:lineRule="auto"/>
+      </w:pPr>
+      <w:r>
+        <w:rPr>
+          <w:i/>
+          <w:iCs/>
+          <w:noProof/>
+          <w:color w:val="7F8C8D"/>
+          <w:sz w:val="20"/>
+          <w:szCs w:val="20"/>
+        </w:rPr>
+        <w:lastRenderedPageBreak/>
+        <w:drawing>
+          <wp:inline distT="0" distB="0" distL="0" distR="0" wp14:anchorId="3E393761" wp14:editId="3E064149">
+            <wp:extent cx="6036310" cy="3235325"/>
+            <wp:effectExtent l="0" t="0" r="2540" b="3175"/>
+            <wp:docPr id="27" name="Image 27"/>
+            <wp:cNvGraphicFramePr>
+              <a:graphicFrameLocks xmlns:a="http://schemas.openxmlformats.org/drawingml/2006/main" noChangeAspect="1"/>
+            </wp:cNvGraphicFramePr>
+            <a:graphic xmlns:a="http://schemas.openxmlformats.org/drawingml/2006/main">
+              <a:graphicData uri="http://schemas.openxmlformats.org/drawingml/2006/picture">
+                <pic:pic xmlns:pic="http://schemas.openxmlformats.org/drawingml/2006/picture">
+                  <pic:nvPicPr>
+                    <pic:cNvPr id="27" name="Image 27"/>
+                    <pic:cNvPicPr/>
+                  </pic:nvPicPr>
+                  <pic:blipFill>
+                    <a:blip r:embed="rId30" cstate="print">
+                      <a:extLst>
+                        <a:ext uri="{28A0092B-C50C-407E-A947-70E740481C1C}">
+                          <a14:useLocalDpi xmlns:a14="http://schemas.microsoft.com/office/drawing/2010/main" val="0"/>
+                        </a:ext>
+                      </a:extLst>
+                    </a:blip>
+                    <a:stretch>
+                      <a:fillRect/>
+                    </a:stretch>
+                  </pic:blipFill>
+                  <pic:spPr>
+                    <a:xfrm>
+                      <a:off x="0" y="0"/>
+                      <a:ext cx="6036310" cy="3235325"/>
+                    </a:xfrm>
+                    <a:prstGeom prst="rect">
+                      <a:avLst/>
+                    </a:prstGeom>
+                  </pic:spPr>
+                </pic:pic>
+              </a:graphicData>
+            </a:graphic>
+          </wp:inline>
+        </w:drawing>
+      </w:r>
+      <w:r>
+        <w:rPr>
+          <w:i/>
+          <w:iCs/>
+          <w:noProof/>
+          <w:color w:val="7F8C8D"/>
+          <w:sz w:val="20"/>
+          <w:szCs w:val="20"/>
+        </w:rPr>
+        <w:drawing>
+          <wp:inline distT="0" distB="0" distL="0" distR="0" wp14:anchorId="31F9161A" wp14:editId="4828A28C">
+            <wp:extent cx="6036310" cy="3216275"/>
+            <wp:effectExtent l="0" t="0" r="2540" b="3175"/>
+            <wp:docPr id="28" name="Image 28"/>
+            <wp:cNvGraphicFramePr>
+              <a:graphicFrameLocks xmlns:a="http://schemas.openxmlformats.org/drawingml/2006/main" noChangeAspect="1"/>
+            </wp:cNvGraphicFramePr>
+            <a:graphic xmlns:a="http://schemas.openxmlformats.org/drawingml/2006/main">
+              <a:graphicData uri="http://schemas.openxmlformats.org/drawingml/2006/picture">
+                <pic:pic xmlns:pic="http://schemas.openxmlformats.org/drawingml/2006/picture">
+                  <pic:nvPicPr>
+                    <pic:cNvPr id="28" name="Image 28"/>
+                    <pic:cNvPicPr/>
+                  </pic:nvPicPr>
+                  <pic:blipFill>
+                    <a:blip r:embed="rId31" cstate="print">
+                      <a:extLst>
+                        <a:ext uri="{28A0092B-C50C-407E-A947-70E740481C1C}">
+                          <a14:useLocalDpi xmlns:a14="http://schemas.microsoft.com/office/drawing/2010/main" val="0"/>
+                        </a:ext>
+                      </a:extLst>
+                    </a:blip>
+                    <a:stretch>
+                      <a:fillRect/>
+                    </a:stretch>
+                  </pic:blipFill>
+                  <pic:spPr>
+                    <a:xfrm>
+                      <a:off x="0" y="0"/>
+                      <a:ext cx="6036310" cy="3216275"/>
+                    </a:xfrm>
+                    <a:prstGeom prst="rect">
+                      <a:avLst/>
+                    </a:prstGeom>
+                  </pic:spPr>
+                </pic:pic>
+              </a:graphicData>
+            </a:graphic>
+          </wp:inline>
+        </w:drawing>
+      </w:r>
+      <w:r>
+        <w:rPr>
+          <w:i/>
+          <w:iCs/>
+          <w:noProof/>
+          <w:color w:val="7F8C8D"/>
+          <w:sz w:val="20"/>
+          <w:szCs w:val="20"/>
+        </w:rPr>
+        <w:drawing>
+          <wp:inline distT="0" distB="0" distL="0" distR="0" wp14:anchorId="6CD9E8B5" wp14:editId="7F3D33C9">
+            <wp:extent cx="6036310" cy="2244725"/>
+            <wp:effectExtent l="0" t="0" r="2540" b="3175"/>
+            <wp:docPr id="29" name="Image 29"/>
+            <wp:cNvGraphicFramePr>
+              <a:graphicFrameLocks xmlns:a="http://schemas.openxmlformats.org/drawingml/2006/main" noChangeAspect="1"/>
+            </wp:cNvGraphicFramePr>
+            <a:graphic xmlns:a="http://schemas.openxmlformats.org/drawingml/2006/main">
+              <a:graphicData uri="http://schemas.openxmlformats.org/drawingml/2006/picture">
+                <pic:pic xmlns:pic="http://schemas.openxmlformats.org/drawingml/2006/picture">
+                  <pic:nvPicPr>
+                    <pic:cNvPr id="29" name="Image 29"/>
+                    <pic:cNvPicPr/>
+                  </pic:nvPicPr>
+                  <pic:blipFill>
+                    <a:blip r:embed="rId32" cstate="print">
+                      <a:extLst>
+                        <a:ext uri="{28A0092B-C50C-407E-A947-70E740481C1C}">
+                          <a14:useLocalDpi xmlns:a14="http://schemas.microsoft.com/office/drawing/2010/main" val="0"/>
+                        </a:ext>
+                      </a:extLst>
+                    </a:blip>
+                    <a:stretch>
+                      <a:fillRect/>
+                    </a:stretch>
+                  </pic:blipFill>
+                  <pic:spPr>
+                    <a:xfrm>
+                      <a:off x="0" y="0"/>
+                      <a:ext cx="6036310" cy="2244725"/>
+                    </a:xfrm>
+                    <a:prstGeom prst="rect">
+                      <a:avLst/>
+                    </a:prstGeom>
+                  </pic:spPr>
+                </pic:pic>
+              </a:graphicData>
+            </a:graphic>
+          </wp:inline>
+        </w:drawing>
+      </w:r>
+      <w:r>
+        <w:rPr>
+          <w:i/>
+          <w:iCs/>
+          <w:noProof/>
+          <w:color w:val="7F8C8D"/>
+          <w:sz w:val="20"/>
+          <w:szCs w:val="20"/>
+        </w:rPr>
+        <w:lastRenderedPageBreak/>
+        <w:drawing>
+          <wp:inline distT="0" distB="0" distL="0" distR="0" wp14:anchorId="6F05CCAB" wp14:editId="0210B5D7">
+            <wp:extent cx="6036310" cy="1836420"/>
+            <wp:effectExtent l="0" t="0" r="2540" b="0"/>
+            <wp:docPr id="30" name="Image 30"/>
+            <wp:cNvGraphicFramePr>
+              <a:graphicFrameLocks xmlns:a="http://schemas.openxmlformats.org/drawingml/2006/main" noChangeAspect="1"/>
+            </wp:cNvGraphicFramePr>
+            <a:graphic xmlns:a="http://schemas.openxmlformats.org/drawingml/2006/main">
+              <a:graphicData uri="http://schemas.openxmlformats.org/drawingml/2006/picture">
+                <pic:pic xmlns:pic="http://schemas.openxmlformats.org/drawingml/2006/picture">
+                  <pic:nvPicPr>
+                    <pic:cNvPr id="30" name="Image 30"/>
+                    <pic:cNvPicPr/>
+                  </pic:nvPicPr>
+                  <pic:blipFill>
+                    <a:blip r:embed="rId33" cstate="print">
+                      <a:extLst>
+                        <a:ext uri="{28A0092B-C50C-407E-A947-70E740481C1C}">
+                          <a14:useLocalDpi xmlns:a14="http://schemas.microsoft.com/office/drawing/2010/main" val="0"/>
+                        </a:ext>
+                      </a:extLst>
+                    </a:blip>
+                    <a:stretch>
+                      <a:fillRect/>
+                    </a:stretch>
+                  </pic:blipFill>
+                  <pic:spPr>
+                    <a:xfrm>
+                      <a:off x="0" y="0"/>
+                      <a:ext cx="6036310" cy="1836420"/>
+                    </a:xfrm>
+                    <a:prstGeom prst="rect">
+                      <a:avLst/>
+                    </a:prstGeom>
+                  </pic:spPr>
+                </pic:pic>
+              </a:graphicData>
+            </a:graphic>
+          </wp:inline>
+        </w:drawing>
+      </w:r>
+      <w:r>
+        <w:rPr>
+          <w:i/>
+          <w:iCs/>
+          <w:noProof/>
+          <w:color w:val="7F8C8D"/>
+          <w:sz w:val="20"/>
+          <w:szCs w:val="20"/>
+        </w:rPr>
+        <w:drawing>
+          <wp:inline distT="0" distB="0" distL="0" distR="0" wp14:anchorId="332EC115" wp14:editId="22EADAC4">
+            <wp:extent cx="6036310" cy="3493770"/>
+            <wp:effectExtent l="0" t="0" r="2540" b="0"/>
+            <wp:docPr id="31" name="Image 31"/>
+            <wp:cNvGraphicFramePr>
+              <a:graphicFrameLocks xmlns:a="http://schemas.openxmlformats.org/drawingml/2006/main" noChangeAspect="1"/>
+            </wp:cNvGraphicFramePr>
+            <a:graphic xmlns:a="http://schemas.openxmlformats.org/drawingml/2006/main">
+              <a:graphicData uri="http://schemas.openxmlformats.org/drawingml/2006/picture">
+                <pic:pic xmlns:pic="http://schemas.openxmlformats.org/drawingml/2006/picture">
+                  <pic:nvPicPr>
+                    <pic:cNvPr id="31" name="Image 31"/>
+                    <pic:cNvPicPr/>
+                  </pic:nvPicPr>
+                  <pic:blipFill>
+                    <a:blip r:embed="rId34" cstate="print">
+                      <a:extLst>
+                        <a:ext uri="{28A0092B-C50C-407E-A947-70E740481C1C}">
+                          <a14:useLocalDpi xmlns:a14="http://schemas.microsoft.com/office/drawing/2010/main" val="0"/>
+                        </a:ext>
+                      </a:extLst>
+                    </a:blip>
+                    <a:stretch>
+                      <a:fillRect/>
+                    </a:stretch>
+                  </pic:blipFill>
+                  <pic:spPr>
+                    <a:xfrm>
+                      <a:off x="0" y="0"/>
+                      <a:ext cx="6036310" cy="3493770"/>
+                    </a:xfrm>
+                    <a:prstGeom prst="rect">
+                      <a:avLst/>
+                    </a:prstGeom>
+                  </pic:spPr>
+                </pic:pic>
+              </a:graphicData>
+            </a:graphic>
+          </wp:inline>
+        </w:drawing>
+      </w:r>
+      <w:r>
+        <w:rPr>
+          <w:noProof/>
+        </w:rPr>
+        <w:lastRenderedPageBreak/>
+        <w:drawing>
+          <wp:inline distT="0" distB="0" distL="0" distR="0" wp14:anchorId="15E7F913" wp14:editId="63B1CE25">
+            <wp:extent cx="6036310" cy="3542665"/>
+            <wp:effectExtent l="0" t="0" r="2540" b="635"/>
+            <wp:docPr id="32" name="Image 32"/>
+            <wp:cNvGraphicFramePr>
+              <a:graphicFrameLocks xmlns:a="http://schemas.openxmlformats.org/drawingml/2006/main" noChangeAspect="1"/>
+            </wp:cNvGraphicFramePr>
+            <a:graphic xmlns:a="http://schemas.openxmlformats.org/drawingml/2006/main">
+              <a:graphicData uri="http://schemas.openxmlformats.org/drawingml/2006/picture">
+                <pic:pic xmlns:pic="http://schemas.openxmlformats.org/drawingml/2006/picture">
+                  <pic:nvPicPr>
+                    <pic:cNvPr id="32" name="Image 32"/>
+                    <pic:cNvPicPr/>
+                  </pic:nvPicPr>
+                  <pic:blipFill>
+                    <a:blip r:embed="rId35" cstate="print">
+                      <a:extLst>
+                        <a:ext uri="{28A0092B-C50C-407E-A947-70E740481C1C}">
+                          <a14:useLocalDpi xmlns:a14="http://schemas.microsoft.com/office/drawing/2010/main" val="0"/>
+                        </a:ext>
+                      </a:extLst>
+                    </a:blip>
+                    <a:stretch>
+                      <a:fillRect/>
+                    </a:stretch>
+                  </pic:blipFill>
+                  <pic:spPr>
+                    <a:xfrm>
+                      <a:off x="0" y="0"/>
+                      <a:ext cx="6036310" cy="3542665"/>
+                    </a:xfrm>
+                    <a:prstGeom prst="rect">
+                      <a:avLst/>
+                    </a:prstGeom>
+                  </pic:spPr>
+                </pic:pic>
+              </a:graphicData>
+            </a:graphic>
+          </wp:inline>
+        </w:drawing>
+      </w:r>
+    </w:p>
+    <w:p>
+      <w:pPr>
+        <w:pStyle w:val="Titre1"/>
+        <w:pBdr>
+          <w:bottom w:val="single" w:sz="12" w:space="6" w:color="2980B9"/>
+        </w:pBdr>
+        <w:spacing w:before="320" w:after="160"/>
+      </w:pPr>
+      <w:bookmarkStart w:id="11" w:name="_Toc236173587"/>
+      <w:r>
+        <w:rPr>
+          <w:b/>
+          <w:bCs/>
+          <w:color w:val="2C3E50"/>
+          <w:sz w:val="30"/>
+          <w:szCs w:val="30"/>
+        </w:rPr>
+        <w:t>Partie 6 : Script Bash setup_project.sh</w:t>
+      </w:r>
+      <w:bookmarkEnd w:id="11"/>
+    </w:p>
+    <w:p>
+      <w:pPr>
+        <w:spacing w:after="120" w:line="300" w:lineRule="auto"/>
+        <w:jc w:val="both"/>
+      </w:pPr>
+      <w:r>
+        <w:rPr>
+          <w:color w:val="000000"/>
+        </w:rPr>
+        <w:t xml:space="preserve">Objectif : automatiser toute la préparation de l'environnement dans un seul script commenté : demander le nom du projet, créer l'arborescence, générer un fichier de configuration, installer les outils, télécharger le </w:t>
+      </w:r>
+      <w:proofErr w:type="spellStart"/>
+      <w:r>
+        <w:rPr>
+          <w:color w:val="000000"/>
+        </w:rPr>
+        <w:t>dataset</w:t>
+      </w:r>
+      <w:proofErr w:type="spellEnd"/>
+      <w:r>
+        <w:rPr>
+          <w:color w:val="000000"/>
+        </w:rPr>
+        <w:t>, compresser le projet et afficher un résumé.</w:t>
+      </w:r>
+    </w:p>
+    <w:p>
+      <w:pPr>
+        <w:spacing w:after="120" w:line="300" w:lineRule="auto"/>
+        <w:jc w:val="both"/>
+      </w:pPr>
+      <w:r>
+        <w:rPr>
+          <w:color w:val="000000"/>
+        </w:rPr>
+        <w:t>Le script complet et commenté est livré séparément dans le dépôt GitHub (setup_project.sh).</w:t>
       </w:r>
     </w:p>
     <w:p>
@@ -5861,7 +6353,7 @@
           <w:sz w:val="20"/>
           <w:szCs w:val="20"/>
         </w:rPr>
-        <w:t>Lancement du processus, PID, utilisation CPU et gestion arrière-plan / premier plan.</w:t>
+        <w:t>Exécution du script setup_project.sh et résumé final affiché.</w:t>
       </w:r>
       <w:r>
         <w:br/>
@@ -5885,7 +6377,7 @@
         </w:pBdr>
         <w:spacing w:before="320" w:after="160"/>
       </w:pPr>
-      <w:bookmarkStart w:id="11" w:name="_Toc236173587"/>
+      <w:bookmarkStart w:id="12" w:name="_Toc236173588"/>
       <w:r>
         <w:rPr>
           <w:b/>
@@ -5894,9 +6386,9 @@
           <w:sz w:val="30"/>
           <w:szCs w:val="30"/>
         </w:rPr>
-        <w:t>Partie 6 : Script Bash setup_project.sh</w:t>
-      </w:r>
-      <w:bookmarkEnd w:id="11"/>
+        <w:t>Partie 7 : Bonus</w:t>
+      </w:r>
+      <w:bookmarkEnd w:id="12"/>
     </w:p>
     <w:p>
       <w:pPr>
@@ -5907,33 +6399,21 @@
         <w:rPr>
           <w:color w:val="000000"/>
         </w:rPr>
-        <w:t xml:space="preserve">Objectif : automatiser toute la préparation de l'environnement dans un seul script commenté : demander le nom du projet, créer l'arborescence, générer un fichier de configuration, installer les outils, télécharger le </w:t>
-      </w:r>
-      <w:proofErr w:type="spellStart"/>
+        <w:t xml:space="preserve">Activité complémentaire proposée et réalisée : </w:t>
+      </w:r>
+      <w:proofErr w:type="gramStart"/>
       <w:r>
         <w:rPr>
           <w:color w:val="000000"/>
         </w:rPr>
-        <w:t>dataset</w:t>
-      </w:r>
-      <w:proofErr w:type="spellEnd"/>
+        <w:t>[ décrivez</w:t>
+      </w:r>
+      <w:proofErr w:type="gramEnd"/>
       <w:r>
         <w:rPr>
           <w:color w:val="000000"/>
         </w:rPr>
-        <w:t>, compresser le projet et afficher un résumé.</w:t>
-      </w:r>
-    </w:p>
-    <w:p>
-      <w:pPr>
-        <w:spacing w:after="120" w:line="300" w:lineRule="auto"/>
-        <w:jc w:val="both"/>
-      </w:pPr>
-      <w:r>
-        <w:rPr>
-          <w:color w:val="000000"/>
-        </w:rPr>
-        <w:t>Le script complet et commenté est livré séparément dans le dépôt GitHub (setup_project.sh).</w:t>
+        <w:t xml:space="preserve"> ici l'amélioration que vous avez ajoutée, par exemple un script de nettoyage automatique, une journalisation, une vérification d'intégrité de l'archive, etc. ]</w:t>
       </w:r>
     </w:p>
     <w:p>
@@ -5977,7 +6457,7 @@
           <w:sz w:val="20"/>
           <w:szCs w:val="20"/>
         </w:rPr>
-        <w:t>Exécution du script setup_project.sh et résumé final affiché.</w:t>
+        <w:t>Capture d'écran de l'activité bonus réalisée.</w:t>
       </w:r>
       <w:r>
         <w:br/>
@@ -6001,7 +6481,7 @@
         </w:pBdr>
         <w:spacing w:before="320" w:after="160"/>
       </w:pPr>
-      <w:bookmarkStart w:id="12" w:name="_Toc236173588"/>
+      <w:bookmarkStart w:id="13" w:name="_Toc236173589"/>
       <w:r>
         <w:rPr>
           <w:b/>
@@ -6010,110 +6490,7 @@
           <w:sz w:val="30"/>
           <w:szCs w:val="30"/>
         </w:rPr>
-        <w:t>Partie 7 : Bonus</w:t>
-      </w:r>
-      <w:bookmarkEnd w:id="12"/>
-    </w:p>
-    <w:p>
-      <w:pPr>
-        <w:spacing w:after="120" w:line="300" w:lineRule="auto"/>
-        <w:jc w:val="both"/>
-      </w:pPr>
-      <w:r>
-        <w:rPr>
-          <w:color w:val="000000"/>
-        </w:rPr>
-        <w:t xml:space="preserve">Activité complémentaire proposée et réalisée : </w:t>
-      </w:r>
-      <w:proofErr w:type="gramStart"/>
-      <w:r>
-        <w:rPr>
-          <w:color w:val="000000"/>
-        </w:rPr>
-        <w:t>[ décrivez</w:t>
-      </w:r>
-      <w:proofErr w:type="gramEnd"/>
-      <w:r>
-        <w:rPr>
-          <w:color w:val="000000"/>
-        </w:rPr>
-        <w:t xml:space="preserve"> ici l'amélioration que vous avez ajoutée, par exemple un script de nettoyage automatique, une journalisation, une vérification d'intégrité de l'archive, etc. ]</w:t>
-      </w:r>
-    </w:p>
-    <w:p>
-      <w:pPr>
-        <w:pBdr>
-          <w:top w:val="dashed" w:sz="8" w:space="14" w:color="7F8C8D"/>
-          <w:left w:val="dashed" w:sz="8" w:space="14" w:color="7F8C8D"/>
-          <w:bottom w:val="dashed" w:sz="8" w:space="14" w:color="7F8C8D"/>
-          <w:right w:val="dashed" w:sz="8" w:space="14" w:color="7F8C8D"/>
-        </w:pBdr>
-        <w:shd w:val="clear" w:color="auto" w:fill="F8F9FA"/>
-        <w:spacing w:before="160" w:after="200" w:line="360" w:lineRule="auto"/>
-        <w:jc w:val="center"/>
-      </w:pPr>
-      <w:proofErr w:type="gramStart"/>
-      <w:r>
-        <w:rPr>
-          <w:b/>
-          <w:bCs/>
-          <w:color w:val="7F8C8D"/>
-        </w:rPr>
-        <w:t>📷  Insérer</w:t>
-      </w:r>
-      <w:proofErr w:type="gramEnd"/>
-      <w:r>
-        <w:rPr>
-          <w:b/>
-          <w:bCs/>
-          <w:color w:val="7F8C8D"/>
-        </w:rPr>
-        <w:t xml:space="preserve"> ici la capture d'écran</w:t>
-      </w:r>
-      <w:r>
-        <w:br/>
-      </w:r>
-      <w:r>
-        <w:rPr>
-          <w:i/>
-          <w:iCs/>
-          <w:color w:val="7F8C8D"/>
-          <w:sz w:val="20"/>
-          <w:szCs w:val="20"/>
-        </w:rPr>
-        <w:t>Capture d'écran de l'activité bonus réalisée.</w:t>
-      </w:r>
-      <w:r>
-        <w:br/>
-      </w:r>
-      <w:r>
-        <w:rPr>
-          <w:i/>
-          <w:iCs/>
-          <w:color w:val="7F8C8D"/>
-          <w:sz w:val="16"/>
-          <w:szCs w:val="16"/>
-        </w:rPr>
-        <w:t>(Clic droit → Insérer une image, puis supprimer ce texte)</w:t>
-      </w:r>
-    </w:p>
-    <w:p>
-      <w:pPr>
-        <w:pStyle w:val="Titre1"/>
-        <w:pBdr>
-          <w:bottom w:val="single" w:sz="12" w:space="6" w:color="2980B9"/>
-        </w:pBdr>
-        <w:spacing w:before="320" w:after="160"/>
-      </w:pPr>
-      <w:bookmarkStart w:id="13" w:name="_Toc236173589"/>
-      <w:r>
-        <w:rPr>
-          <w:b/>
-          <w:bCs/>
-          <w:color w:val="2C3E50"/>
-          <w:sz w:val="30"/>
-          <w:szCs w:val="30"/>
-        </w:rPr>
+        <w:lastRenderedPageBreak/>
         <w:t>Conclusion</w:t>
       </w:r>
       <w:bookmarkEnd w:id="13"/>
@@ -6144,7 +6521,6 @@
           <w:sz w:val="24"/>
           <w:szCs w:val="24"/>
         </w:rPr>
-        <w:lastRenderedPageBreak/>
         <w:t>Principales commandes utilisées et leur rôle</w:t>
       </w:r>
       <w:bookmarkEnd w:id="14"/>

</xml_diff>